<commit_message>
Add EDA for task 1 and extend documentation
</commit_message>
<xml_diff>
--- a/tasks/task1/documentation.docx
+++ b/tasks/task1/documentation.docx
@@ -63,6 +63,18 @@
           <w:i/>
         </w:rPr>
         <w:t>simple_model.py</w:t>
+      </w:r>
+      <w:r>
+        <w:rPr>
+          <w:i w:val="0"/>
+        </w:rPr>
+        <w:t xml:space="preserve"> a analýza dát v súbore </w:t>
+      </w:r>
+      <w:r>
+        <w:rPr>
+          <w:i/>
+        </w:rPr>
+        <w:t>eda.py</w:t>
       </w:r>
       <w:r>
         <w:rPr>
@@ -3490,6 +3502,756 @@
         <w:t>Variant C je oproti A lepší o 0,4 bodu na testovacej množine, čo je v rámci rozptylu medzi behmi. Navyše 1 576 hodnôt doplnených mediánom patrí len návštevám bez nákupu a model by sa mohol naučiť spoznať práve túto jednu hodnotu. V ďalšej práci používam variant A.</w:t>
       </w:r>
     </w:p>
+    <w:p>
+      <w:pPr>
+        <w:pStyle w:val="Heading1"/>
+      </w:pPr>
+      <w:r>
+        <w:t>2 Analýza dát (EDA)</w:t>
+      </w:r>
+    </w:p>
+    <w:p>
+      <w:pPr>
+        <w:jc w:val="both"/>
+      </w:pPr>
+      <w:r>
+        <w:rPr>
+          <w:i w:val="0"/>
+        </w:rPr>
+        <w:t>Pri analýze pracujem s dátami po odstránení outlierov a chýbajúcich hodnôt, ale pred kódovaním, aby som mal k dispozícii slovné hodnoty (11 557 riadkov). V časti 2.6 používam pôvodný dataset.</w:t>
+      </w:r>
+    </w:p>
+    <w:p>
+      <w:pPr>
+        <w:pStyle w:val="Heading2"/>
+      </w:pPr>
+      <w:r>
+        <w:t>2.1 Korelácie medzi číselnými stĺpcami</w:t>
+      </w:r>
+    </w:p>
+    <w:p>
+      <w:pPr>
+        <w:jc w:val="center"/>
+      </w:pPr>
+      <w:r>
+        <w:drawing>
+          <wp:inline xmlns:a="http://schemas.openxmlformats.org/drawingml/2006/main" xmlns:pic="http://schemas.openxmlformats.org/drawingml/2006/picture">
+            <wp:extent cx="5040000" cy="3920000"/>
+            <wp:docPr id="3" name="Picture 3"/>
+            <wp:cNvGraphicFramePr>
+              <a:graphicFrameLocks noChangeAspect="1"/>
+            </wp:cNvGraphicFramePr>
+            <a:graphic>
+              <a:graphicData uri="http://schemas.openxmlformats.org/drawingml/2006/picture">
+                <pic:pic>
+                  <pic:nvPicPr>
+                    <pic:cNvPr id="0" name="eda_correlation.png"/>
+                    <pic:cNvPicPr/>
+                  </pic:nvPicPr>
+                  <pic:blipFill>
+                    <a:blip r:embed="rId11"/>
+                    <a:stretch>
+                      <a:fillRect/>
+                    </a:stretch>
+                  </pic:blipFill>
+                  <pic:spPr>
+                    <a:xfrm>
+                      <a:off x="0" y="0"/>
+                      <a:ext cx="5040000" cy="3920000"/>
+                    </a:xfrm>
+                    <a:prstGeom prst="rect"/>
+                  </pic:spPr>
+                </pic:pic>
+              </a:graphicData>
+            </a:graphic>
+          </wp:inline>
+        </w:drawing>
+      </w:r>
+    </w:p>
+    <w:p>
+      <w:pPr>
+        <w:jc w:val="center"/>
+      </w:pPr>
+      <w:r>
+        <w:rPr>
+          <w:sz w:val="20"/>
+        </w:rPr>
+        <w:t>Obr. 3: Korelačná matica číselných stĺpcov a cieľovej premennej</w:t>
+      </w:r>
+    </w:p>
+    <w:p>
+      <w:pPr>
+        <w:jc w:val="both"/>
+      </w:pPr>
+      <w:r>
+        <w:rPr>
+          <w:i w:val="0"/>
+        </w:rPr>
+        <w:t xml:space="preserve">Najsilnejšie spolu súvisia </w:t>
+      </w:r>
+      <w:r>
+        <w:rPr>
+          <w:i/>
+        </w:rPr>
+        <w:t>BounceRates</w:t>
+      </w:r>
+      <w:r>
+        <w:rPr>
+          <w:i w:val="0"/>
+        </w:rPr>
+        <w:t xml:space="preserve"> a </w:t>
+      </w:r>
+      <w:r>
+        <w:rPr>
+          <w:i/>
+        </w:rPr>
+        <w:t>ExitRates</w:t>
+      </w:r>
+      <w:r>
+        <w:rPr>
+          <w:i w:val="0"/>
+        </w:rPr>
+        <w:t xml:space="preserve"> (0,91) a potom </w:t>
+      </w:r>
+      <w:r>
+        <w:rPr>
+          <w:i/>
+        </w:rPr>
+        <w:t>ProductRelated</w:t>
+      </w:r>
+      <w:r>
+        <w:rPr>
+          <w:i w:val="0"/>
+        </w:rPr>
+        <w:t xml:space="preserve"> a </w:t>
+      </w:r>
+      <w:r>
+        <w:rPr>
+          <w:i/>
+        </w:rPr>
+        <w:t>ProductRelated_Duration</w:t>
+      </w:r>
+      <w:r>
+        <w:rPr>
+          <w:i w:val="0"/>
+        </w:rPr>
+        <w:t xml:space="preserve"> (0,86). Druhá dvojica je očakávaná: kto otvorí viac produktových stránok, strávi na nich viac času. Pri administratívnych stránkach je ten istý vzťah slabší (0,60). Pre model to znamená, že tieto dvojice nesú z veľkej časti rovnakú informáciu.</w:t>
+      </w:r>
+    </w:p>
+    <w:p>
+      <w:pPr>
+        <w:jc w:val="both"/>
+      </w:pPr>
+      <w:r>
+        <w:rPr>
+          <w:i w:val="0"/>
+        </w:rPr>
+        <w:t xml:space="preserve">S </w:t>
+      </w:r>
+      <w:r>
+        <w:rPr>
+          <w:i/>
+        </w:rPr>
+        <w:t>Revenue</w:t>
+      </w:r>
+      <w:r>
+        <w:rPr>
+          <w:i w:val="0"/>
+        </w:rPr>
+        <w:t xml:space="preserve"> koreluje výraznejšie len </w:t>
+      </w:r>
+      <w:r>
+        <w:rPr>
+          <w:i/>
+        </w:rPr>
+        <w:t>PageValues</w:t>
+      </w:r>
+      <w:r>
+        <w:rPr>
+          <w:i w:val="0"/>
+        </w:rPr>
+        <w:t xml:space="preserve"> (0,49). Ostatné stĺpce majú koreláciu s nákupom medzi −0,21 a 0,16. Miery odchodu majú s počtom stránok zápornú koreláciu, návšteva s veľa stránkami má nižší </w:t>
+      </w:r>
+      <w:r>
+        <w:rPr>
+          <w:i/>
+        </w:rPr>
+        <w:t>ExitRates</w:t>
+      </w:r>
+      <w:r>
+        <w:rPr>
+          <w:i w:val="0"/>
+        </w:rPr>
+        <w:t>.</w:t>
+      </w:r>
+    </w:p>
+    <w:p>
+      <w:pPr>
+        <w:pStyle w:val="Heading2"/>
+      </w:pPr>
+      <w:r>
+        <w:t>2.2 BounceRates a ExitRates</w:t>
+      </w:r>
+    </w:p>
+    <w:p>
+      <w:pPr>
+        <w:jc w:val="both"/>
+      </w:pPr>
+      <w:r>
+        <w:rPr>
+          <w:i w:val="0"/>
+        </w:rPr>
+        <w:t>Dvojicu s najvyššou koreláciou som vykreslil bodovým grafom (obr. 4).</w:t>
+      </w:r>
+    </w:p>
+    <w:p>
+      <w:pPr>
+        <w:jc w:val="center"/>
+      </w:pPr>
+      <w:r>
+        <w:drawing>
+          <wp:inline xmlns:a="http://schemas.openxmlformats.org/drawingml/2006/main" xmlns:pic="http://schemas.openxmlformats.org/drawingml/2006/picture">
+            <wp:extent cx="3960000" cy="3394286"/>
+            <wp:docPr id="4" name="Picture 4"/>
+            <wp:cNvGraphicFramePr>
+              <a:graphicFrameLocks noChangeAspect="1"/>
+            </wp:cNvGraphicFramePr>
+            <a:graphic>
+              <a:graphicData uri="http://schemas.openxmlformats.org/drawingml/2006/picture">
+                <pic:pic>
+                  <pic:nvPicPr>
+                    <pic:cNvPr id="0" name="eda_bounce_exit.png"/>
+                    <pic:cNvPicPr/>
+                  </pic:nvPicPr>
+                  <pic:blipFill>
+                    <a:blip r:embed="rId12"/>
+                    <a:stretch>
+                      <a:fillRect/>
+                    </a:stretch>
+                  </pic:blipFill>
+                  <pic:spPr>
+                    <a:xfrm>
+                      <a:off x="0" y="0"/>
+                      <a:ext cx="3960000" cy="3394286"/>
+                    </a:xfrm>
+                    <a:prstGeom prst="rect"/>
+                  </pic:spPr>
+                </pic:pic>
+              </a:graphicData>
+            </a:graphic>
+          </wp:inline>
+        </w:drawing>
+      </w:r>
+    </w:p>
+    <w:p>
+      <w:pPr>
+        <w:jc w:val="center"/>
+      </w:pPr>
+      <w:r>
+        <w:rPr>
+          <w:sz w:val="20"/>
+        </w:rPr>
+        <w:t>Obr. 4: BounceRates a ExitRates, farba podľa nákupu</w:t>
+      </w:r>
+    </w:p>
+    <w:p>
+      <w:pPr>
+        <w:jc w:val="both"/>
+      </w:pPr>
+      <w:r>
+        <w:rPr>
+          <w:i w:val="0"/>
+        </w:rPr>
+        <w:t xml:space="preserve">Takmer všetky body ležia nad prerušovanou čiarou, </w:t>
+      </w:r>
+      <w:r>
+        <w:rPr>
+          <w:i/>
+        </w:rPr>
+        <w:t>ExitRates</w:t>
+      </w:r>
+      <w:r>
+        <w:rPr>
+          <w:i w:val="0"/>
+        </w:rPr>
+        <w:t xml:space="preserve"> je teda skoro vždy väčší alebo rovný </w:t>
+      </w:r>
+      <w:r>
+        <w:rPr>
+          <w:i/>
+        </w:rPr>
+        <w:t>BounceRates</w:t>
+      </w:r>
+      <w:r>
+        <w:rPr>
+          <w:i w:val="0"/>
+        </w:rPr>
+        <w:t xml:space="preserve">. Pod čiarou je len 166 z 11 557 návštev. Dáva to zmysel, lebo okamžité opustenie stránky je zároveň aj odchod z nej. Zaujímavý je zvislý pás pri </w:t>
+      </w:r>
+      <w:r>
+        <w:rPr>
+          <w:i/>
+        </w:rPr>
+        <w:t>BounceRates</w:t>
+      </w:r>
+      <w:r>
+        <w:rPr>
+          <w:i w:val="0"/>
+        </w:rPr>
+        <w:t xml:space="preserve"> = 0, kde </w:t>
+      </w:r>
+      <w:r>
+        <w:rPr>
+          <w:i/>
+        </w:rPr>
+        <w:t>ExitRates</w:t>
+      </w:r>
+      <w:r>
+        <w:rPr>
+          <w:i w:val="0"/>
+        </w:rPr>
+        <w:t xml:space="preserve"> nadobúda hodnoty až po 0,2. Nulový bounce rate teda o miere odchodu veľa nepovie.</w:t>
+      </w:r>
+    </w:p>
+    <w:p>
+      <w:pPr>
+        <w:jc w:val="both"/>
+      </w:pPr>
+      <w:r>
+        <w:rPr>
+          <w:i w:val="0"/>
+        </w:rPr>
+        <w:t xml:space="preserve">Nákupy (oranžové body) sú sústredené v ľavom dolnom rohu. Z 1 908 nákupov má len 17 hodnotu </w:t>
+      </w:r>
+      <w:r>
+        <w:rPr>
+          <w:i/>
+        </w:rPr>
+        <w:t>BounceRates</w:t>
+      </w:r>
+      <w:r>
+        <w:rPr>
+          <w:i w:val="0"/>
+        </w:rPr>
+        <w:t xml:space="preserve"> nad 0,05.</w:t>
+      </w:r>
+    </w:p>
+    <w:p>
+      <w:pPr>
+        <w:pStyle w:val="Heading2"/>
+      </w:pPr>
+      <w:r>
+        <w:t>2.3 Návštevnosť a nákupy podľa mesiaca</w:t>
+      </w:r>
+    </w:p>
+    <w:p>
+      <w:pPr>
+        <w:jc w:val="center"/>
+      </w:pPr>
+      <w:r>
+        <w:drawing>
+          <wp:inline xmlns:a="http://schemas.openxmlformats.org/drawingml/2006/main" xmlns:pic="http://schemas.openxmlformats.org/drawingml/2006/picture">
+            <wp:extent cx="4680000" cy="2600000"/>
+            <wp:docPr id="5" name="Picture 5"/>
+            <wp:cNvGraphicFramePr>
+              <a:graphicFrameLocks noChangeAspect="1"/>
+            </wp:cNvGraphicFramePr>
+            <a:graphic>
+              <a:graphicData uri="http://schemas.openxmlformats.org/drawingml/2006/picture">
+                <pic:pic>
+                  <pic:nvPicPr>
+                    <pic:cNvPr id="0" name="eda_months.png"/>
+                    <pic:cNvPicPr/>
+                  </pic:nvPicPr>
+                  <pic:blipFill>
+                    <a:blip r:embed="rId13"/>
+                    <a:stretch>
+                      <a:fillRect/>
+                    </a:stretch>
+                  </pic:blipFill>
+                  <pic:spPr>
+                    <a:xfrm>
+                      <a:off x="0" y="0"/>
+                      <a:ext cx="4680000" cy="2600000"/>
+                    </a:xfrm>
+                    <a:prstGeom prst="rect"/>
+                  </pic:spPr>
+                </pic:pic>
+              </a:graphicData>
+            </a:graphic>
+          </wp:inline>
+        </w:drawing>
+      </w:r>
+    </w:p>
+    <w:p>
+      <w:pPr>
+        <w:jc w:val="center"/>
+      </w:pPr>
+      <w:r>
+        <w:rPr>
+          <w:sz w:val="20"/>
+        </w:rPr>
+        <w:t>Obr. 5: Počet návštev (stĺpce) a podiel návštev s nákupom (čiara) podľa mesiaca</w:t>
+      </w:r>
+    </w:p>
+    <w:p>
+      <w:pPr>
+        <w:jc w:val="both"/>
+      </w:pPr>
+      <w:r>
+        <w:rPr>
+          <w:i w:val="0"/>
+        </w:rPr>
+        <w:t>Najviac návštev bolo v máji (3 161), ale nákupom skončilo len 11,5 % z nich. November má podobný počet návštev (2 821) a podiel nákupov 26,9 %, najviac zo všetkých mesiacov. Od júla do októbra chodí na stránku málo ľudí, okolo 400 až 520 mesačne, podiel nákupov však každý mesiac rastie, zo 16,5 % na 22 %. V decembri klesne na 13,4 %. Február je s 1,7 % najslabší, má ale len 173 návštev.</w:t>
+      </w:r>
+    </w:p>
+    <w:p>
+      <w:pPr>
+        <w:jc w:val="both"/>
+      </w:pPr>
+      <w:r>
+        <w:rPr>
+          <w:i w:val="0"/>
+        </w:rPr>
+        <w:t xml:space="preserve">Veľa návštev teda neznamená veľa nákupov. Máj má vysokú návštevnosť pravdepodobne kvôli sviatkom, stĺpec </w:t>
+      </w:r>
+      <w:r>
+        <w:rPr>
+          <w:i/>
+        </w:rPr>
+        <w:t>SpecialDay</w:t>
+      </w:r>
+      <w:r>
+        <w:rPr>
+          <w:i w:val="0"/>
+        </w:rPr>
+        <w:t xml:space="preserve"> je nenulový len vo februári a v máji.</w:t>
+      </w:r>
+    </w:p>
+    <w:p>
+      <w:pPr>
+        <w:pStyle w:val="Heading2"/>
+      </w:pPr>
+      <w:r>
+        <w:t>2.4 PageValues a typ návštevníka</w:t>
+      </w:r>
+    </w:p>
+    <w:p>
+      <w:pPr>
+        <w:jc w:val="both"/>
+      </w:pPr>
+      <w:r>
+        <w:rPr>
+          <w:i w:val="0"/>
+        </w:rPr>
+      </w:r>
+      <w:r>
+        <w:rPr>
+          <w:i/>
+        </w:rPr>
+        <w:t>PageValues</w:t>
+      </w:r>
+      <w:r>
+        <w:rPr>
+          <w:i w:val="0"/>
+        </w:rPr>
+        <w:t xml:space="preserve"> má s nákupom najsilnejší vzťah zo všetkých stĺpcov. Pozrel som sa, či je rovnaký pre nových a vracajúcich sa návštevníkov (obr. 6). Typ Other som vynechal, má len 78 riadkov.</w:t>
+      </w:r>
+    </w:p>
+    <w:p>
+      <w:pPr>
+        <w:jc w:val="center"/>
+      </w:pPr>
+      <w:r>
+        <w:drawing>
+          <wp:inline xmlns:a="http://schemas.openxmlformats.org/drawingml/2006/main" xmlns:pic="http://schemas.openxmlformats.org/drawingml/2006/picture">
+            <wp:extent cx="3960000" cy="2828571"/>
+            <wp:docPr id="6" name="Picture 6"/>
+            <wp:cNvGraphicFramePr>
+              <a:graphicFrameLocks noChangeAspect="1"/>
+            </wp:cNvGraphicFramePr>
+            <a:graphic>
+              <a:graphicData uri="http://schemas.openxmlformats.org/drawingml/2006/picture">
+                <pic:pic>
+                  <pic:nvPicPr>
+                    <pic:cNvPr id="0" name="eda_pagevalues_visitor.png"/>
+                    <pic:cNvPicPr/>
+                  </pic:nvPicPr>
+                  <pic:blipFill>
+                    <a:blip r:embed="rId14"/>
+                    <a:stretch>
+                      <a:fillRect/>
+                    </a:stretch>
+                  </pic:blipFill>
+                  <pic:spPr>
+                    <a:xfrm>
+                      <a:off x="0" y="0"/>
+                      <a:ext cx="3960000" cy="2828571"/>
+                    </a:xfrm>
+                    <a:prstGeom prst="rect"/>
+                  </pic:spPr>
+                </pic:pic>
+              </a:graphicData>
+            </a:graphic>
+          </wp:inline>
+        </w:drawing>
+      </w:r>
+    </w:p>
+    <w:p>
+      <w:pPr>
+        <w:jc w:val="center"/>
+      </w:pPr>
+      <w:r>
+        <w:rPr>
+          <w:sz w:val="20"/>
+        </w:rPr>
+        <w:t>Obr. 6: Podiel návštev s nákupom podľa PageValues a typu návštevníka</w:t>
+      </w:r>
+    </w:p>
+    <w:p>
+      <w:pPr>
+        <w:jc w:val="both"/>
+      </w:pPr>
+      <w:r>
+        <w:rPr>
+          <w:i w:val="0"/>
+        </w:rPr>
+        <w:t xml:space="preserve">Ak je </w:t>
+      </w:r>
+      <w:r>
+        <w:rPr>
+          <w:i/>
+        </w:rPr>
+        <w:t>PageValues</w:t>
+      </w:r>
+      <w:r>
+        <w:rPr>
+          <w:i w:val="0"/>
+        </w:rPr>
+        <w:t xml:space="preserve"> nulové, nákupom končí 3,6 % návštev vracajúcich sa a 7,6 % nových návštevníkov. Pri nenulovej hodnote je to 53,0 % a 87,7 %. Nový návštevník s nenulovým </w:t>
+      </w:r>
+      <w:r>
+        <w:rPr>
+          <w:i/>
+        </w:rPr>
+        <w:t>PageValues</w:t>
+      </w:r>
+      <w:r>
+        <w:rPr>
+          <w:i w:val="0"/>
+        </w:rPr>
+        <w:t xml:space="preserve"> teda nakúpi skoro vždy, vracajúci sa len v polovici prípadov. Skupiny nie sú rovnako veľké: nových návštevníkov s nenulovým </w:t>
+      </w:r>
+      <w:r>
+        <w:rPr>
+          <w:i/>
+        </w:rPr>
+        <w:t>PageValues</w:t>
+      </w:r>
+      <w:r>
+        <w:rPr>
+          <w:i w:val="0"/>
+        </w:rPr>
+        <w:t xml:space="preserve"> je 375, vracajúcich sa 2 254.</w:t>
+      </w:r>
+    </w:p>
+    <w:p>
+      <w:pPr>
+        <w:pStyle w:val="Heading2"/>
+      </w:pPr>
+      <w:r>
+        <w:t>2.5 Počet produktových stránok podľa typu návštevníka</w:t>
+      </w:r>
+    </w:p>
+    <w:p>
+      <w:pPr>
+        <w:jc w:val="center"/>
+      </w:pPr>
+      <w:r>
+        <w:drawing>
+          <wp:inline xmlns:a="http://schemas.openxmlformats.org/drawingml/2006/main" xmlns:pic="http://schemas.openxmlformats.org/drawingml/2006/picture">
+            <wp:extent cx="3960000" cy="2828571"/>
+            <wp:docPr id="7" name="Picture 7"/>
+            <wp:cNvGraphicFramePr>
+              <a:graphicFrameLocks noChangeAspect="1"/>
+            </wp:cNvGraphicFramePr>
+            <a:graphic>
+              <a:graphicData uri="http://schemas.openxmlformats.org/drawingml/2006/picture">
+                <pic:pic>
+                  <pic:nvPicPr>
+                    <pic:cNvPr id="0" name="eda_pages_visitor.png"/>
+                    <pic:cNvPicPr/>
+                  </pic:nvPicPr>
+                  <pic:blipFill>
+                    <a:blip r:embed="rId15"/>
+                    <a:stretch>
+                      <a:fillRect/>
+                    </a:stretch>
+                  </pic:blipFill>
+                  <pic:spPr>
+                    <a:xfrm>
+                      <a:off x="0" y="0"/>
+                      <a:ext cx="3960000" cy="2828571"/>
+                    </a:xfrm>
+                    <a:prstGeom prst="rect"/>
+                  </pic:spPr>
+                </pic:pic>
+              </a:graphicData>
+            </a:graphic>
+          </wp:inline>
+        </w:drawing>
+      </w:r>
+    </w:p>
+    <w:p>
+      <w:pPr>
+        <w:jc w:val="center"/>
+      </w:pPr>
+      <w:r>
+        <w:rPr>
+          <w:sz w:val="20"/>
+        </w:rPr>
+        <w:t>Obr. 7: Počet produktových stránok podľa typu návštevníka a nákupu, bez odľahlých bodov</w:t>
+      </w:r>
+    </w:p>
+    <w:p>
+      <w:pPr>
+        <w:jc w:val="both"/>
+      </w:pPr>
+      <w:r>
+        <w:rPr>
+          <w:i w:val="0"/>
+        </w:rPr>
+        <w:t>Vracajúci sa návštevníci si prezrú viac stránok než noví. Medián je 17 oproti 11 pri návštevách bez nákupu a 34 oproti 17 pri návštevách s nákupom. V oboch skupinách majú návštevy s nákupom viac stránok. Nový návštevník pritom nakúpi po mediáne 17 stránok, čo je toľko, koľko si vracajúci sa návštevník prezrie aj bez nákupu. Noví návštevníci navyše nakupujú častejšie (26,5 % oproti 14,9 %), takže viac prezretých stránok samo o sebe nákup neznamená.</w:t>
+      </w:r>
+    </w:p>
+    <w:p>
+      <w:pPr>
+        <w:pStyle w:val="Heading2"/>
+      </w:pPr>
+      <w:r>
+        <w:t>2.6 Chýbajúce hodnoty a nákup</w:t>
+      </w:r>
+    </w:p>
+    <w:p>
+      <w:pPr>
+        <w:jc w:val="both"/>
+      </w:pPr>
+      <w:r>
+        <w:rPr>
+          <w:i w:val="0"/>
+        </w:rPr>
+        <w:t xml:space="preserve">Tento vzťah som našiel v pôvodnom datasete pri čistení (časť 1.3). V stĺpcoch </w:t>
+      </w:r>
+      <w:r>
+        <w:rPr>
+          <w:i/>
+        </w:rPr>
+        <w:t>Informational_Duration</w:t>
+      </w:r>
+      <w:r>
+        <w:rPr>
+          <w:i w:val="0"/>
+        </w:rPr>
+        <w:t xml:space="preserve">, </w:t>
+      </w:r>
+      <w:r>
+        <w:rPr>
+          <w:i/>
+        </w:rPr>
+        <w:t>VisitorType</w:t>
+      </w:r>
+      <w:r>
+        <w:rPr>
+          <w:i w:val="0"/>
+        </w:rPr>
+        <w:t xml:space="preserve"> a </w:t>
+      </w:r>
+      <w:r>
+        <w:rPr>
+          <w:i/>
+        </w:rPr>
+        <w:t>ProductRelated_Duration</w:t>
+      </w:r>
+      <w:r>
+        <w:rPr>
+          <w:i w:val="0"/>
+        </w:rPr>
+        <w:t xml:space="preserve"> chýba 8 139, 492 a 246 hodnôt a ani jeden z týchto riadkov nekončí nákupom (obr. 8).</w:t>
+      </w:r>
+    </w:p>
+    <w:p>
+      <w:pPr>
+        <w:jc w:val="center"/>
+      </w:pPr>
+      <w:r>
+        <w:drawing>
+          <wp:inline xmlns:a="http://schemas.openxmlformats.org/drawingml/2006/main" xmlns:pic="http://schemas.openxmlformats.org/drawingml/2006/picture">
+            <wp:extent cx="4680000" cy="2340000"/>
+            <wp:docPr id="8" name="Picture 8"/>
+            <wp:cNvGraphicFramePr>
+              <a:graphicFrameLocks noChangeAspect="1"/>
+            </wp:cNvGraphicFramePr>
+            <a:graphic>
+              <a:graphicData uri="http://schemas.openxmlformats.org/drawingml/2006/picture">
+                <pic:pic>
+                  <pic:nvPicPr>
+                    <pic:cNvPr id="0" name="eda_missing.png"/>
+                    <pic:cNvPicPr/>
+                  </pic:nvPicPr>
+                  <pic:blipFill>
+                    <a:blip r:embed="rId16"/>
+                    <a:stretch>
+                      <a:fillRect/>
+                    </a:stretch>
+                  </pic:blipFill>
+                  <pic:spPr>
+                    <a:xfrm>
+                      <a:off x="0" y="0"/>
+                      <a:ext cx="4680000" cy="2340000"/>
+                    </a:xfrm>
+                    <a:prstGeom prst="rect"/>
+                  </pic:spPr>
+                </pic:pic>
+              </a:graphicData>
+            </a:graphic>
+          </wp:inline>
+        </w:drawing>
+      </w:r>
+    </w:p>
+    <w:p>
+      <w:pPr>
+        <w:jc w:val="center"/>
+      </w:pPr>
+      <w:r>
+        <w:rPr>
+          <w:sz w:val="20"/>
+        </w:rPr>
+        <w:t>Obr. 8: Podiel návštev s nákupom podľa toho, či hodnota v stĺpci chýba (pôvodný dataset)</w:t>
+      </w:r>
+    </w:p>
+    <w:p>
+      <w:pPr>
+        <w:jc w:val="both"/>
+      </w:pPr>
+      <w:r>
+        <w:rPr>
+          <w:i w:val="0"/>
+        </w:rPr>
+        <w:t xml:space="preserve">Najvýraznejšie je to pri </w:t>
+      </w:r>
+      <w:r>
+        <w:rPr>
+          <w:i/>
+        </w:rPr>
+        <w:t>Informational_Duration</w:t>
+      </w:r>
+      <w:r>
+        <w:rPr>
+          <w:i w:val="0"/>
+        </w:rPr>
+        <w:t>: tam, kde je hodnota vyplnená, končí nákupom 45,5 % návštev. V reálnych dátach by hodnoty takto chýbať nemali, vyzerá to na vlastnosť tohto datasetu. Informácia „hodnota chýba“ by modelu prezradila výsledok, preto som ju ako vstup nepoužil.</w:t>
+      </w:r>
+    </w:p>
     <w:sectPr>
       <w:pgSz w:w="11906" w:h="16838"/>
       <w:pgMar w:top="1417" w:right="1417" w:bottom="1417" w:left="1417" w:header="720" w:footer="720" w:gutter="0"/>

</xml_diff>

<commit_message>
Fix split row counts and tie-break, redraw missing values plot, update documentation
</commit_message>
<xml_diff>
--- a/tasks/task1/documentation.docx
+++ b/tasks/task1/documentation.docx
@@ -33,7 +33,7 @@
         <w:rPr>
           <w:sz w:val="20"/>
         </w:rPr>
-        <w:t>[meno a priezvisko, ID, cvičenie]</w:t>
+        <w:t>[Jozef Barčák, 128090]</w:t>
       </w:r>
     </w:p>
     <w:p>
@@ -2019,7 +2019,7 @@
                 <w:i w:val="0"/>
                 <w:sz w:val="20"/>
               </w:rPr>
-              <w:t>9 246</w:t>
+              <w:t>9 245</w:t>
             </w:r>
           </w:p>
         </w:tc>
@@ -2175,7 +2175,7 @@
                 <w:i w:val="0"/>
                 <w:sz w:val="20"/>
               </w:rPr>
-              <w:t>8 090</w:t>
+              <w:t>8 089</w:t>
             </w:r>
           </w:p>
         </w:tc>
@@ -2353,7 +2353,7 @@
                 <w:i w:val="0"/>
                 <w:sz w:val="20"/>
               </w:rPr>
-              <w:t>2 311</w:t>
+              <w:t>2 312</w:t>
             </w:r>
           </w:p>
         </w:tc>
@@ -2487,7 +2487,7 @@
                 <w:i w:val="0"/>
                 <w:sz w:val="20"/>
               </w:rPr>
-              <w:t>4 623</w:t>
+              <w:t>4 622</w:t>
             </w:r>
           </w:p>
         </w:tc>
@@ -2509,7 +2509,7 @@
                 <w:i w:val="0"/>
                 <w:sz w:val="20"/>
               </w:rPr>
-              <w:t>3 467</w:t>
+              <w:t>3 468</w:t>
             </w:r>
           </w:p>
         </w:tc>
@@ -2643,7 +2643,7 @@
                 <w:i w:val="0"/>
                 <w:sz w:val="20"/>
               </w:rPr>
-              <w:t>1 156</w:t>
+              <w:t>1 155</w:t>
             </w:r>
           </w:p>
         </w:tc>
@@ -2779,7 +2779,7 @@
         <w:rPr>
           <w:i w:val="0"/>
         </w:rPr>
-        <w:t>Rozdiel vidno až pri 10 % trénovacích dát. Úspešnosť na trénovacej množine stúpla na 88,71 %, na testovacej klesla na 87,11 % a rozdiel medzi nimi je 1,6 bodu. S 1 156 riadkami sa model viac prispôsobí trénovacím dátam a horšie zovšeobecňuje. Rozdelenia s malou testovacou množinou majú inú slabinu: pri 5 % má test len 578 riadkov a z toho 95 nákupov, takže každá chyba pohne výsledkom viac.</w:t>
+        <w:t>Rozdiel vidno až pri 10 % trénovacích dát. Úspešnosť na trénovacej množine stúpla na 88,71 %, na testovacej klesla na 87,11 % a rozdiel medzi nimi je 1,6 bodu. S 1 155 riadkami sa model viac prispôsobí trénovacím dátam a horšie zovšeobecňuje. Rozdelenia s malou testovacou množinou majú inú slabinu: pri 5 % má test len 578 riadkov a z toho 95 nákupov, takže každá chyba pohne výsledkom viac.</w:t>
       </w:r>
     </w:p>
     <w:p>
@@ -2809,7 +2809,7 @@
         <w:rPr>
           <w:i w:val="0"/>
         </w:rPr>
-        <w:t>Najvyššiu priemernú úspešnosť na testovacej množine malo rozdelenie 90 / 5 / 5 (88,13 %, rovnako ako 80 / 10 / 10). Konfúzne matice pre tento model (seed 0) sú na obr. 2.</w:t>
+        <w:t>Rozdelenia 90 / 5 / 5 a 80 / 10 / 10 majú rovnakú priemernú úspešnosť na testovacej množine (88,13 %). Vybral som 80 / 10 / 10, lebo má dvakrát väčšiu testovaciu množinu. Konfúzne matice na obr. 2 sú pre jeden beh tohto modelu (seed 0). Ten má na testovacej množine 88,58 %, o niečo viac než priemer piatich behov.</w:t>
       </w:r>
     </w:p>
     <w:p>
@@ -2859,7 +2859,7 @@
         <w:rPr>
           <w:sz w:val="20"/>
         </w:rPr>
-        <w:t>Obr. 2: Konfúzne matice logistickej regresie, rozdelenie 90 / 5 / 5</w:t>
+        <w:t>Obr. 2: Konfúzne matice logistickej regresie, rozdelenie 80 / 10 / 10</w:t>
       </w:r>
     </w:p>
     <w:p>
@@ -2870,7 +2870,7 @@
         <w:rPr>
           <w:i w:val="0"/>
         </w:rPr>
-        <w:t>Na trénovacej množine model správne určil 8 464 návštev bez nákupu a 678 nákupov. Ďalších 1 039 nákupov označil ako návštevu bez nákupu, zachytil teda len 39 % nákupov. Na testovacej množine je to 36 z 95, čiže 38 %. Chyby opačným smerom sú zriedkavé (220 a 13). Model sa prikláňa k väčšinovej triede a úspešnosť okolo 88 % robia hlavne návštevy bez nákupu, ktorých je v dátach päťkrát viac.</w:t>
+        <w:t>Na trénovacej množine model správne určil 7 523 návštev bez nákupu a 612 nákupov. Ďalších 914 nákupov označil ako návštevu bez nákupu, zachytil teda len 40 % nákupov. Na testovacej množine je to 79 zo 191, čiže 41 %. Chyby opačným smerom sú zriedkavé (196 a 20). Model sa prikláňa k väčšinovej triede a úspešnosť okolo 88 % robia hlavne návštevy bez nákupu, ktorých je v dátach päťkrát viac.</w:t>
       </w:r>
     </w:p>
     <w:p>
@@ -3499,7 +3499,7 @@
         <w:rPr>
           <w:i w:val="0"/>
         </w:rPr>
-        <w:t>Variant C je oproti A lepší o 0,4 bodu na testovacej množine, čo je v rámci rozptylu medzi behmi. Navyše 1 576 hodnôt doplnených mediánom patrí len návštevám bez nákupu a model by sa mohol naučiť spoznať práve túto jednu hodnotu. V ďalšej práci používam variant A.</w:t>
+        <w:t>Variant C je oproti A lepší o 0,4 bodu na testovacej množine, čo je v rámci rozptylu medzi behmi. Navyše 1 471 hodnôt doplnených mediánom patrí len návštevám bez nákupu a model by sa mohol naučiť spoznať práve túto jednu hodnotu. V ďalšej práci používam variant A.</w:t>
       </w:r>
     </w:p>
     <w:p>
@@ -4176,7 +4176,7 @@
         <w:rPr>
           <w:i w:val="0"/>
         </w:rPr>
-        <w:t xml:space="preserve"> chýba 8 139, 492 a 246 hodnôt a ani jeden z týchto riadkov nekončí nákupom (obr. 8).</w:t>
+        <w:t xml:space="preserve"> chýba 8 139, 492 a 246 hodnôt a ani jeden z týchto riadkov nekončí nákupom. Pruhy pre chýbajúce hodnoty sú preto na obr. 8 celé sivé.</w:t>
       </w:r>
     </w:p>
     <w:p>
@@ -4186,7 +4186,7 @@
       <w:r>
         <w:drawing>
           <wp:inline xmlns:a="http://schemas.openxmlformats.org/drawingml/2006/main" xmlns:pic="http://schemas.openxmlformats.org/drawingml/2006/picture">
-            <wp:extent cx="4680000" cy="2340000"/>
+            <wp:extent cx="4680000" cy="2600000"/>
             <wp:docPr id="8" name="Picture 8"/>
             <wp:cNvGraphicFramePr>
               <a:graphicFrameLocks noChangeAspect="1"/>
@@ -4207,7 +4207,7 @@
                   <pic:spPr>
                     <a:xfrm>
                       <a:off x="0" y="0"/>
-                      <a:ext cx="4680000" cy="2340000"/>
+                      <a:ext cx="4680000" cy="2600000"/>
                     </a:xfrm>
                     <a:prstGeom prst="rect"/>
                   </pic:spPr>
@@ -4226,7 +4226,7 @@
         <w:rPr>
           <w:sz w:val="20"/>
         </w:rPr>
-        <w:t>Obr. 8: Podiel návštev s nákupom podľa toho, či hodnota v stĺpci chýba (pôvodný dataset)</w:t>
+        <w:t>Obr. 8: Zloženie návštev podľa toho, či hodnota v stĺpci chýba (pôvodný dataset), každý pruh je 100 %</w:t>
       </w:r>
     </w:p>
     <w:p>

</xml_diff>

<commit_message>
Add neural network for task 1: overfitting, early stopping, experiments and mark outlier limits in plot
</commit_message>
<xml_diff>
--- a/tasks/task1/documentation.docx
+++ b/tasks/task1/documentation.docx
@@ -68,13 +68,25 @@
         <w:rPr>
           <w:i w:val="0"/>
         </w:rPr>
-        <w:t xml:space="preserve"> a analýza dát v súbore </w:t>
+        <w:t xml:space="preserve">, analýza dát v súbore </w:t>
       </w:r>
       <w:r>
         <w:rPr>
           <w:i/>
         </w:rPr>
         <w:t>eda.py</w:t>
+      </w:r>
+      <w:r>
+        <w:rPr>
+          <w:i w:val="0"/>
+        </w:rPr>
+        <w:t xml:space="preserve"> a neurónová sieť v súbore </w:t>
+      </w:r>
+      <w:r>
+        <w:rPr>
+          <w:i/>
+        </w:rPr>
+        <w:t>neural_network.py</w:t>
       </w:r>
       <w:r>
         <w:rPr>
@@ -247,7 +259,7 @@
         <w:rPr>
           <w:sz w:val="20"/>
         </w:rPr>
-        <w:t>Obr. 1: 200 najväčších hodnôt vo vybraných stĺpcoch, zoradených od najmenšej</w:t>
+        <w:t>Obr. 1: 200 najväčších hodnôt vo vybraných stĺpcoch, zoradených od najmenšej. Červená čiara je zvolená hranica, červené body sú odstránené hodnoty</w:t>
       </w:r>
     </w:p>
     <w:p>
@@ -282,7 +294,7 @@
         <w:rPr>
           <w:i w:val="0"/>
         </w:rPr>
-        <w:t xml:space="preserve"> je podobná medzera medzi 705 a 3 491. Hodnoty nad medzerou som odstránil, hranice som nastavil na 10 000 a 2 000. V stĺpcoch </w:t>
+        <w:t xml:space="preserve"> je podobná medzera medzi 705 a 3 491. Hodnoty nad medzerou som odstránil, hranice som nastavil na 10 000 a 2 000 (červená čiara na obr. 1). V stĺpcoch </w:t>
       </w:r>
       <w:r>
         <w:rPr>
@@ -4252,6 +4264,2430 @@
         <w:t>: tam, kde je hodnota vyplnená, končí nákupom 45,5 % návštev. V reálnych dátach by hodnoty takto chýbať nemali, vyzerá to na vlastnosť tohto datasetu. Informácia „hodnota chýba“ by modelu prezradila výsledok, preto som ju ako vstup nepoužil.</w:t>
       </w:r>
     </w:p>
+    <w:p>
+      <w:pPr>
+        <w:pStyle w:val="Heading1"/>
+      </w:pPr>
+      <w:r>
+        <w:t>3 Neurónová sieť</w:t>
+      </w:r>
+    </w:p>
+    <w:p>
+      <w:pPr>
+        <w:jc w:val="both"/>
+      </w:pPr>
+      <w:r>
+        <w:rPr>
+          <w:i w:val="0"/>
+        </w:rPr>
+        <w:t xml:space="preserve">Sieť je napísaná v PyTorch. Dáta sú pripravené rovnako ako v časti 1, s rozdelením 70 / 15 / 15 (8 089 trénovacích, 1 734 validačných a 1 734 testovacích riadkov) a 73 vstupmi. Používam plne prepojenú sieť s aktivačnou funkciou ReLU v skrytých vrstvách a jedným výstupným neurónom. Chybu počítam funkciou </w:t>
+      </w:r>
+      <w:r>
+        <w:rPr>
+          <w:i/>
+        </w:rPr>
+        <w:t>BCEWithLogitsLoss</w:t>
+      </w:r>
+      <w:r>
+        <w:rPr>
+          <w:i w:val="0"/>
+        </w:rPr>
+        <w:t xml:space="preserve"> (binárna krížová entropia so sigmoidom), váhy upravuje optimalizátor Adam, veľkosť dávky je 64. Validačnú množinu používam po každej epoche na sledovanie priebehu trénovania, výsledky uvádzam pre trénovaciu a testovaciu množinu.</w:t>
+      </w:r>
+    </w:p>
+    <w:p>
+      <w:pPr>
+        <w:pStyle w:val="Heading2"/>
+      </w:pPr>
+      <w:r>
+        <w:t>3.1 Pretrénovanie</w:t>
+      </w:r>
+    </w:p>
+    <w:p>
+      <w:pPr>
+        <w:jc w:val="both"/>
+      </w:pPr>
+      <w:r>
+        <w:rPr>
+          <w:i w:val="0"/>
+        </w:rPr>
+        <w:t>Aby sa sieť pretrénovala, zvolil som zámerne veľkú architektúru: tri skryté vrstvy s 512, 512 a 256 neurónmi, spolu 432 129 parametrov na 8 089 trénovacích riadkov. Trénoval som 200 epoch s rýchlosťou učenia 0,001, bez dropoutu a bez zastavenia.</w:t>
+      </w:r>
+    </w:p>
+    <w:p>
+      <w:pPr>
+        <w:jc w:val="center"/>
+      </w:pPr>
+      <w:r>
+        <w:drawing>
+          <wp:inline xmlns:a="http://schemas.openxmlformats.org/drawingml/2006/main" xmlns:pic="http://schemas.openxmlformats.org/drawingml/2006/picture">
+            <wp:extent cx="5760000" cy="2160000"/>
+            <wp:docPr id="9" name="Picture 9"/>
+            <wp:cNvGraphicFramePr>
+              <a:graphicFrameLocks noChangeAspect="1"/>
+            </wp:cNvGraphicFramePr>
+            <a:graphic>
+              <a:graphicData uri="http://schemas.openxmlformats.org/drawingml/2006/picture">
+                <pic:pic>
+                  <pic:nvPicPr>
+                    <pic:cNvPr id="0" name="nn_overfit_history.png"/>
+                    <pic:cNvPicPr/>
+                  </pic:nvPicPr>
+                  <pic:blipFill>
+                    <a:blip r:embed="rId17"/>
+                    <a:stretch>
+                      <a:fillRect/>
+                    </a:stretch>
+                  </pic:blipFill>
+                  <pic:spPr>
+                    <a:xfrm>
+                      <a:off x="0" y="0"/>
+                      <a:ext cx="5760000" cy="2160000"/>
+                    </a:xfrm>
+                    <a:prstGeom prst="rect"/>
+                  </pic:spPr>
+                </pic:pic>
+              </a:graphicData>
+            </a:graphic>
+          </wp:inline>
+        </w:drawing>
+      </w:r>
+    </w:p>
+    <w:p>
+      <w:pPr>
+        <w:jc w:val="center"/>
+      </w:pPr>
+      <w:r>
+        <w:rPr>
+          <w:sz w:val="20"/>
+        </w:rPr>
+        <w:t>Obr. 9: Priebeh trénovania veľkej siete bez EarlyStopping</w:t>
+      </w:r>
+    </w:p>
+    <w:p>
+      <w:pPr>
+        <w:jc w:val="both"/>
+      </w:pPr>
+      <w:r>
+        <w:rPr>
+          <w:i w:val="0"/>
+        </w:rPr>
+        <w:t>Chyba na trénovacej množine klesá skoro k nule (0,002 po 200 epochách). Validačná chyba rastie už od štvrtej epochy, z 0,29 na 2,26. Úspešnosť na trénovacej množine dosiahla 99,96 %, na validačnej klesla z 88,3 % na 85,8 %. Sieť si trénovacie dáta zapamätala.</w:t>
+      </w:r>
+    </w:p>
+    <w:p>
+      <w:pPr>
+        <w:jc w:val="center"/>
+      </w:pPr>
+      <w:r>
+        <w:drawing>
+          <wp:inline xmlns:a="http://schemas.openxmlformats.org/drawingml/2006/main" xmlns:pic="http://schemas.openxmlformats.org/drawingml/2006/picture">
+            <wp:extent cx="5760000" cy="2356364"/>
+            <wp:docPr id="10" name="Picture 10"/>
+            <wp:cNvGraphicFramePr>
+              <a:graphicFrameLocks noChangeAspect="1"/>
+            </wp:cNvGraphicFramePr>
+            <a:graphic>
+              <a:graphicData uri="http://schemas.openxmlformats.org/drawingml/2006/picture">
+                <pic:pic>
+                  <pic:nvPicPr>
+                    <pic:cNvPr id="0" name="nn_overfit_confusion.png"/>
+                    <pic:cNvPicPr/>
+                  </pic:nvPicPr>
+                  <pic:blipFill>
+                    <a:blip r:embed="rId18"/>
+                    <a:stretch>
+                      <a:fillRect/>
+                    </a:stretch>
+                  </pic:blipFill>
+                  <pic:spPr>
+                    <a:xfrm>
+                      <a:off x="0" y="0"/>
+                      <a:ext cx="5760000" cy="2356364"/>
+                    </a:xfrm>
+                    <a:prstGeom prst="rect"/>
+                  </pic:spPr>
+                </pic:pic>
+              </a:graphicData>
+            </a:graphic>
+          </wp:inline>
+        </w:drawing>
+      </w:r>
+    </w:p>
+    <w:p>
+      <w:pPr>
+        <w:jc w:val="center"/>
+      </w:pPr>
+      <w:r>
+        <w:rPr>
+          <w:sz w:val="20"/>
+        </w:rPr>
+        <w:t>Obr. 10: Konfúzne matice pretrénovanej siete</w:t>
+      </w:r>
+    </w:p>
+    <w:p>
+      <w:pPr>
+        <w:jc w:val="both"/>
+      </w:pPr>
+      <w:r>
+        <w:rPr>
+          <w:i w:val="0"/>
+        </w:rPr>
+        <w:t>Na trénovacej množine sieť urobila 3 chyby z 8 089. Na testovacej má úspešnosť 87,72 %, rozdiel oproti trénovacej je vyše 12 bodov. Z 286 nákupov v testovacej množine zachytila 163.</w:t>
+      </w:r>
+    </w:p>
+    <w:p>
+      <w:pPr>
+        <w:pStyle w:val="Heading2"/>
+      </w:pPr>
+      <w:r>
+        <w:t>3.2 Odstránenie pretrénovania pomocou EarlyStopping</w:t>
+      </w:r>
+    </w:p>
+    <w:p>
+      <w:pPr>
+        <w:jc w:val="both"/>
+      </w:pPr>
+      <w:r>
+        <w:rPr>
+          <w:i w:val="0"/>
+        </w:rPr>
+        <w:t>EarlyStopping som naprogramoval priamo v trénovacej slučke. Po každej epoche porovnám validačnú chybu s doteraz najlepšou. Ak je nižšia, uložím si váhy siete. Ak sa nezlepší 10 epoch po sebe (patience = 10), trénovanie zastavím a do siete vrátim váhy z najlepšej epochy. Architektúra a ostatné nastavenia sú rovnaké ako v časti 3.1.</w:t>
+      </w:r>
+    </w:p>
+    <w:p>
+      <w:pPr>
+        <w:jc w:val="center"/>
+      </w:pPr>
+      <w:r>
+        <w:drawing>
+          <wp:inline xmlns:a="http://schemas.openxmlformats.org/drawingml/2006/main" xmlns:pic="http://schemas.openxmlformats.org/drawingml/2006/picture">
+            <wp:extent cx="5760000" cy="2160000"/>
+            <wp:docPr id="11" name="Picture 11"/>
+            <wp:cNvGraphicFramePr>
+              <a:graphicFrameLocks noChangeAspect="1"/>
+            </wp:cNvGraphicFramePr>
+            <a:graphic>
+              <a:graphicData uri="http://schemas.openxmlformats.org/drawingml/2006/picture">
+                <pic:pic>
+                  <pic:nvPicPr>
+                    <pic:cNvPr id="0" name="nn_early_history.png"/>
+                    <pic:cNvPicPr/>
+                  </pic:nvPicPr>
+                  <pic:blipFill>
+                    <a:blip r:embed="rId19"/>
+                    <a:stretch>
+                      <a:fillRect/>
+                    </a:stretch>
+                  </pic:blipFill>
+                  <pic:spPr>
+                    <a:xfrm>
+                      <a:off x="0" y="0"/>
+                      <a:ext cx="5760000" cy="2160000"/>
+                    </a:xfrm>
+                    <a:prstGeom prst="rect"/>
+                  </pic:spPr>
+                </pic:pic>
+              </a:graphicData>
+            </a:graphic>
+          </wp:inline>
+        </w:drawing>
+      </w:r>
+    </w:p>
+    <w:p>
+      <w:pPr>
+        <w:jc w:val="center"/>
+      </w:pPr>
+      <w:r>
+        <w:rPr>
+          <w:sz w:val="20"/>
+        </w:rPr>
+        <w:t>Obr. 11: Priebeh trénovania tej istej siete s EarlyStopping</w:t>
+      </w:r>
+    </w:p>
+    <w:p>
+      <w:pPr>
+        <w:jc w:val="both"/>
+      </w:pPr>
+      <w:r>
+        <w:rPr>
+          <w:i w:val="0"/>
+        </w:rPr>
+        <w:t>Validačná chyba bola najnižšia v 3. epoche (0,291) a trénovanie sa zastavilo po 13. epoche. Na grafe vidno, že od 4. epochy sa krivky rozchádzajú rovnako ako predtým, sieť však skončí s váhami z 3. epochy.</w:t>
+      </w:r>
+    </w:p>
+    <w:p>
+      <w:pPr>
+        <w:jc w:val="center"/>
+      </w:pPr>
+      <w:r>
+        <w:rPr>
+          <w:sz w:val="20"/>
+        </w:rPr>
+        <w:t>Tab. 5: Veľká sieť bez EarlyStopping a s ním</w:t>
+      </w:r>
+    </w:p>
+    <w:tbl>
+      <w:tblPr>
+        <w:tblStyle w:val="TableGrid"/>
+        <w:tblW w:type="auto" w:w="0"/>
+        <w:jc w:val="center"/>
+        <w:tblLook w:firstColumn="1" w:firstRow="1" w:lastColumn="0" w:lastRow="0" w:noHBand="0" w:noVBand="1" w:val="04A0"/>
+      </w:tblPr>
+      <w:tblGrid>
+        <w:gridCol w:w="1814"/>
+        <w:gridCol w:w="1814"/>
+        <w:gridCol w:w="1814"/>
+        <w:gridCol w:w="1814"/>
+        <w:gridCol w:w="1814"/>
+      </w:tblGrid>
+      <w:tr>
+        <w:tc>
+          <w:tcPr>
+            <w:tcW w:type="dxa" w:w="1814"/>
+          </w:tcPr>
+          <w:p>
+            <w:pPr>
+              <w:spacing w:after="0"/>
+            </w:pPr>
+            <w:r>
+              <w:rPr>
+                <w:sz w:val="20"/>
+              </w:rPr>
+            </w:r>
+            <w:r>
+              <w:rPr>
+                <w:b/>
+                <w:sz w:val="20"/>
+              </w:rPr>
+              <w:t>Trénovanie</w:t>
+            </w:r>
+          </w:p>
+        </w:tc>
+        <w:tc>
+          <w:tcPr>
+            <w:tcW w:type="dxa" w:w="1814"/>
+          </w:tcPr>
+          <w:p>
+            <w:pPr>
+              <w:spacing w:after="0"/>
+            </w:pPr>
+            <w:r>
+              <w:rPr>
+                <w:sz w:val="20"/>
+              </w:rPr>
+            </w:r>
+            <w:r>
+              <w:rPr>
+                <w:b/>
+                <w:sz w:val="20"/>
+              </w:rPr>
+              <w:t>Epoch</w:t>
+            </w:r>
+          </w:p>
+        </w:tc>
+        <w:tc>
+          <w:tcPr>
+            <w:tcW w:type="dxa" w:w="1814"/>
+          </w:tcPr>
+          <w:p>
+            <w:pPr>
+              <w:spacing w:after="0"/>
+            </w:pPr>
+            <w:r>
+              <w:rPr>
+                <w:sz w:val="20"/>
+              </w:rPr>
+            </w:r>
+            <w:r>
+              <w:rPr>
+                <w:b/>
+                <w:sz w:val="20"/>
+              </w:rPr>
+              <w:t>Train (%)</w:t>
+            </w:r>
+          </w:p>
+        </w:tc>
+        <w:tc>
+          <w:tcPr>
+            <w:tcW w:type="dxa" w:w="1814"/>
+          </w:tcPr>
+          <w:p>
+            <w:pPr>
+              <w:spacing w:after="0"/>
+            </w:pPr>
+            <w:r>
+              <w:rPr>
+                <w:sz w:val="20"/>
+              </w:rPr>
+            </w:r>
+            <w:r>
+              <w:rPr>
+                <w:b/>
+                <w:sz w:val="20"/>
+              </w:rPr>
+              <w:t>Test (%)</w:t>
+            </w:r>
+          </w:p>
+        </w:tc>
+        <w:tc>
+          <w:tcPr>
+            <w:tcW w:type="dxa" w:w="1814"/>
+          </w:tcPr>
+          <w:p>
+            <w:pPr>
+              <w:spacing w:after="0"/>
+            </w:pPr>
+            <w:r>
+              <w:rPr>
+                <w:sz w:val="20"/>
+              </w:rPr>
+            </w:r>
+            <w:r>
+              <w:rPr>
+                <w:b/>
+                <w:sz w:val="20"/>
+              </w:rPr>
+              <w:t>Rozdiel</w:t>
+            </w:r>
+          </w:p>
+        </w:tc>
+      </w:tr>
+      <w:tr>
+        <w:tc>
+          <w:tcPr>
+            <w:tcW w:type="dxa" w:w="1814"/>
+          </w:tcPr>
+          <w:p>
+            <w:pPr>
+              <w:spacing w:after="0"/>
+            </w:pPr>
+            <w:r>
+              <w:rPr>
+                <w:sz w:val="20"/>
+              </w:rPr>
+            </w:r>
+            <w:r>
+              <w:rPr>
+                <w:i w:val="0"/>
+                <w:sz w:val="20"/>
+              </w:rPr>
+              <w:t>bez EarlyStopping</w:t>
+            </w:r>
+          </w:p>
+        </w:tc>
+        <w:tc>
+          <w:tcPr>
+            <w:tcW w:type="dxa" w:w="1814"/>
+          </w:tcPr>
+          <w:p>
+            <w:pPr>
+              <w:spacing w:after="0"/>
+            </w:pPr>
+            <w:r>
+              <w:rPr>
+                <w:sz w:val="20"/>
+              </w:rPr>
+            </w:r>
+            <w:r>
+              <w:rPr>
+                <w:i w:val="0"/>
+                <w:sz w:val="20"/>
+              </w:rPr>
+              <w:t>200</w:t>
+            </w:r>
+          </w:p>
+        </w:tc>
+        <w:tc>
+          <w:tcPr>
+            <w:tcW w:type="dxa" w:w="1814"/>
+          </w:tcPr>
+          <w:p>
+            <w:pPr>
+              <w:spacing w:after="0"/>
+            </w:pPr>
+            <w:r>
+              <w:rPr>
+                <w:sz w:val="20"/>
+              </w:rPr>
+            </w:r>
+            <w:r>
+              <w:rPr>
+                <w:i w:val="0"/>
+                <w:sz w:val="20"/>
+              </w:rPr>
+              <w:t>99,96</w:t>
+            </w:r>
+          </w:p>
+        </w:tc>
+        <w:tc>
+          <w:tcPr>
+            <w:tcW w:type="dxa" w:w="1814"/>
+          </w:tcPr>
+          <w:p>
+            <w:pPr>
+              <w:spacing w:after="0"/>
+            </w:pPr>
+            <w:r>
+              <w:rPr>
+                <w:sz w:val="20"/>
+              </w:rPr>
+            </w:r>
+            <w:r>
+              <w:rPr>
+                <w:i w:val="0"/>
+                <w:sz w:val="20"/>
+              </w:rPr>
+              <w:t>87,72</w:t>
+            </w:r>
+          </w:p>
+        </w:tc>
+        <w:tc>
+          <w:tcPr>
+            <w:tcW w:type="dxa" w:w="1814"/>
+          </w:tcPr>
+          <w:p>
+            <w:pPr>
+              <w:spacing w:after="0"/>
+            </w:pPr>
+            <w:r>
+              <w:rPr>
+                <w:sz w:val="20"/>
+              </w:rPr>
+            </w:r>
+            <w:r>
+              <w:rPr>
+                <w:i w:val="0"/>
+                <w:sz w:val="20"/>
+              </w:rPr>
+              <w:t>12,24</w:t>
+            </w:r>
+          </w:p>
+        </w:tc>
+      </w:tr>
+      <w:tr>
+        <w:tc>
+          <w:tcPr>
+            <w:tcW w:type="dxa" w:w="1814"/>
+          </w:tcPr>
+          <w:p>
+            <w:pPr>
+              <w:spacing w:after="0"/>
+            </w:pPr>
+            <w:r>
+              <w:rPr>
+                <w:sz w:val="20"/>
+              </w:rPr>
+            </w:r>
+            <w:r>
+              <w:rPr>
+                <w:i w:val="0"/>
+                <w:sz w:val="20"/>
+              </w:rPr>
+              <w:t>s EarlyStopping</w:t>
+            </w:r>
+          </w:p>
+        </w:tc>
+        <w:tc>
+          <w:tcPr>
+            <w:tcW w:type="dxa" w:w="1814"/>
+          </w:tcPr>
+          <w:p>
+            <w:pPr>
+              <w:spacing w:after="0"/>
+            </w:pPr>
+            <w:r>
+              <w:rPr>
+                <w:sz w:val="20"/>
+              </w:rPr>
+            </w:r>
+            <w:r>
+              <w:rPr>
+                <w:i w:val="0"/>
+                <w:sz w:val="20"/>
+              </w:rPr>
+              <w:t>13, váhy z 3. epochy</w:t>
+            </w:r>
+          </w:p>
+        </w:tc>
+        <w:tc>
+          <w:tcPr>
+            <w:tcW w:type="dxa" w:w="1814"/>
+          </w:tcPr>
+          <w:p>
+            <w:pPr>
+              <w:spacing w:after="0"/>
+            </w:pPr>
+            <w:r>
+              <w:rPr>
+                <w:sz w:val="20"/>
+              </w:rPr>
+            </w:r>
+            <w:r>
+              <w:rPr>
+                <w:i w:val="0"/>
+                <w:sz w:val="20"/>
+              </w:rPr>
+              <w:t>90,20</w:t>
+            </w:r>
+          </w:p>
+        </w:tc>
+        <w:tc>
+          <w:tcPr>
+            <w:tcW w:type="dxa" w:w="1814"/>
+          </w:tcPr>
+          <w:p>
+            <w:pPr>
+              <w:spacing w:after="0"/>
+            </w:pPr>
+            <w:r>
+              <w:rPr>
+                <w:sz w:val="20"/>
+              </w:rPr>
+            </w:r>
+            <w:r>
+              <w:rPr>
+                <w:i w:val="0"/>
+                <w:sz w:val="20"/>
+              </w:rPr>
+              <w:t>89,68</w:t>
+            </w:r>
+          </w:p>
+        </w:tc>
+        <w:tc>
+          <w:tcPr>
+            <w:tcW w:type="dxa" w:w="1814"/>
+          </w:tcPr>
+          <w:p>
+            <w:pPr>
+              <w:spacing w:after="0"/>
+            </w:pPr>
+            <w:r>
+              <w:rPr>
+                <w:sz w:val="20"/>
+              </w:rPr>
+            </w:r>
+            <w:r>
+              <w:rPr>
+                <w:i w:val="0"/>
+                <w:sz w:val="20"/>
+              </w:rPr>
+              <w:t>0,52</w:t>
+            </w:r>
+          </w:p>
+        </w:tc>
+      </w:tr>
+    </w:tbl>
+    <w:p/>
+    <w:p>
+      <w:pPr>
+        <w:jc w:val="center"/>
+      </w:pPr>
+      <w:r>
+        <w:drawing>
+          <wp:inline xmlns:a="http://schemas.openxmlformats.org/drawingml/2006/main" xmlns:pic="http://schemas.openxmlformats.org/drawingml/2006/picture">
+            <wp:extent cx="5760000" cy="2356364"/>
+            <wp:docPr id="12" name="Picture 12"/>
+            <wp:cNvGraphicFramePr>
+              <a:graphicFrameLocks noChangeAspect="1"/>
+            </wp:cNvGraphicFramePr>
+            <a:graphic>
+              <a:graphicData uri="http://schemas.openxmlformats.org/drawingml/2006/picture">
+                <pic:pic>
+                  <pic:nvPicPr>
+                    <pic:cNvPr id="0" name="nn_early_confusion.png"/>
+                    <pic:cNvPicPr/>
+                  </pic:nvPicPr>
+                  <pic:blipFill>
+                    <a:blip r:embed="rId20"/>
+                    <a:stretch>
+                      <a:fillRect/>
+                    </a:stretch>
+                  </pic:blipFill>
+                  <pic:spPr>
+                    <a:xfrm>
+                      <a:off x="0" y="0"/>
+                      <a:ext cx="5760000" cy="2356364"/>
+                    </a:xfrm>
+                    <a:prstGeom prst="rect"/>
+                  </pic:spPr>
+                </pic:pic>
+              </a:graphicData>
+            </a:graphic>
+          </wp:inline>
+        </w:drawing>
+      </w:r>
+    </w:p>
+    <w:p>
+      <w:pPr>
+        <w:jc w:val="center"/>
+      </w:pPr>
+      <w:r>
+        <w:rPr>
+          <w:sz w:val="20"/>
+        </w:rPr>
+        <w:t>Obr. 12: Konfúzne matice siete s EarlyStopping</w:t>
+      </w:r>
+    </w:p>
+    <w:p>
+      <w:pPr>
+        <w:jc w:val="both"/>
+      </w:pPr>
+      <w:r>
+        <w:rPr>
+          <w:i w:val="0"/>
+        </w:rPr>
+        <w:t>Rozdiel medzi trénovacou a testovacou množinou klesol z 12,2 na 0,5 bodu a úspešnosť na testovacej množine stúpla o necelé 2 body. Na testovacej množine sieť zachytila 166 z 286 nákupov (58 %). Logistická regresia z časti 1 zachytila okolo 40 % nákupov.</w:t>
+      </w:r>
+    </w:p>
+    <w:p>
+      <w:pPr>
+        <w:pStyle w:val="Heading2"/>
+      </w:pPr>
+      <w:r>
+        <w:t>3.3 Experimenty s hyperparametrami</w:t>
+      </w:r>
+    </w:p>
+    <w:p>
+      <w:pPr>
+        <w:jc w:val="both"/>
+      </w:pPr>
+      <w:r>
+        <w:rPr>
+          <w:i w:val="0"/>
+        </w:rPr>
+        <w:t>Pre experimenty som zvolil menšiu sieť so skrytými vrstvami 64 a 32 neurónov a menil som rýchlosť učenia, architektúru a dropout. Všetky behy majú EarlyStopping s patience 10, najviac 200 epoch, dávku 64 a rovnaký seed. V tab. 6 sú nastavenia, ktoré sa menili, a dosiahnuté úspešnosti.</w:t>
+      </w:r>
+    </w:p>
+    <w:p>
+      <w:pPr>
+        <w:jc w:val="center"/>
+      </w:pPr>
+      <w:r>
+        <w:rPr>
+          <w:sz w:val="20"/>
+        </w:rPr>
+        <w:t>Tab. 6: Experimenty s neurónovou sieťou</w:t>
+      </w:r>
+    </w:p>
+    <w:tbl>
+      <w:tblPr>
+        <w:tblStyle w:val="TableGrid"/>
+        <w:tblW w:type="auto" w:w="0"/>
+        <w:jc w:val="center"/>
+        <w:tblLook w:firstColumn="1" w:firstRow="1" w:lastColumn="0" w:lastRow="0" w:noHBand="0" w:noVBand="1" w:val="04A0"/>
+      </w:tblPr>
+      <w:tblGrid>
+        <w:gridCol w:w="1296"/>
+        <w:gridCol w:w="1296"/>
+        <w:gridCol w:w="1296"/>
+        <w:gridCol w:w="1296"/>
+        <w:gridCol w:w="1296"/>
+        <w:gridCol w:w="1296"/>
+        <w:gridCol w:w="1296"/>
+      </w:tblGrid>
+      <w:tr>
+        <w:tc>
+          <w:tcPr>
+            <w:tcW w:type="dxa" w:w="1296"/>
+          </w:tcPr>
+          <w:p>
+            <w:pPr>
+              <w:spacing w:after="0"/>
+            </w:pPr>
+            <w:r>
+              <w:rPr>
+                <w:sz w:val="20"/>
+              </w:rPr>
+            </w:r>
+            <w:r>
+              <w:rPr>
+                <w:b/>
+                <w:sz w:val="20"/>
+              </w:rPr>
+              <w:t>Č.</w:t>
+            </w:r>
+          </w:p>
+        </w:tc>
+        <w:tc>
+          <w:tcPr>
+            <w:tcW w:type="dxa" w:w="1296"/>
+          </w:tcPr>
+          <w:p>
+            <w:pPr>
+              <w:spacing w:after="0"/>
+            </w:pPr>
+            <w:r>
+              <w:rPr>
+                <w:sz w:val="20"/>
+              </w:rPr>
+            </w:r>
+            <w:r>
+              <w:rPr>
+                <w:b/>
+                <w:sz w:val="20"/>
+              </w:rPr>
+              <w:t>Skryté vrstvy</w:t>
+            </w:r>
+          </w:p>
+        </w:tc>
+        <w:tc>
+          <w:tcPr>
+            <w:tcW w:type="dxa" w:w="1296"/>
+          </w:tcPr>
+          <w:p>
+            <w:pPr>
+              <w:spacing w:after="0"/>
+            </w:pPr>
+            <w:r>
+              <w:rPr>
+                <w:sz w:val="20"/>
+              </w:rPr>
+            </w:r>
+            <w:r>
+              <w:rPr>
+                <w:b/>
+                <w:sz w:val="20"/>
+              </w:rPr>
+              <w:t>Rýchlosť učenia</w:t>
+            </w:r>
+          </w:p>
+        </w:tc>
+        <w:tc>
+          <w:tcPr>
+            <w:tcW w:type="dxa" w:w="1296"/>
+          </w:tcPr>
+          <w:p>
+            <w:pPr>
+              <w:spacing w:after="0"/>
+            </w:pPr>
+            <w:r>
+              <w:rPr>
+                <w:sz w:val="20"/>
+              </w:rPr>
+            </w:r>
+            <w:r>
+              <w:rPr>
+                <w:b/>
+                <w:sz w:val="20"/>
+              </w:rPr>
+              <w:t>Dropout</w:t>
+            </w:r>
+          </w:p>
+        </w:tc>
+        <w:tc>
+          <w:tcPr>
+            <w:tcW w:type="dxa" w:w="1296"/>
+          </w:tcPr>
+          <w:p>
+            <w:pPr>
+              <w:spacing w:after="0"/>
+            </w:pPr>
+            <w:r>
+              <w:rPr>
+                <w:sz w:val="20"/>
+              </w:rPr>
+            </w:r>
+            <w:r>
+              <w:rPr>
+                <w:b/>
+                <w:sz w:val="20"/>
+              </w:rPr>
+              <w:t>Najlepšia epocha</w:t>
+            </w:r>
+          </w:p>
+        </w:tc>
+        <w:tc>
+          <w:tcPr>
+            <w:tcW w:type="dxa" w:w="1296"/>
+          </w:tcPr>
+          <w:p>
+            <w:pPr>
+              <w:spacing w:after="0"/>
+            </w:pPr>
+            <w:r>
+              <w:rPr>
+                <w:sz w:val="20"/>
+              </w:rPr>
+            </w:r>
+            <w:r>
+              <w:rPr>
+                <w:b/>
+                <w:sz w:val="20"/>
+              </w:rPr>
+              <w:t>Train (%)</w:t>
+            </w:r>
+          </w:p>
+        </w:tc>
+        <w:tc>
+          <w:tcPr>
+            <w:tcW w:type="dxa" w:w="1296"/>
+          </w:tcPr>
+          <w:p>
+            <w:pPr>
+              <w:spacing w:after="0"/>
+            </w:pPr>
+            <w:r>
+              <w:rPr>
+                <w:sz w:val="20"/>
+              </w:rPr>
+            </w:r>
+            <w:r>
+              <w:rPr>
+                <w:b/>
+                <w:sz w:val="20"/>
+              </w:rPr>
+              <w:t>Test (%)</w:t>
+            </w:r>
+          </w:p>
+        </w:tc>
+      </w:tr>
+      <w:tr>
+        <w:tc>
+          <w:tcPr>
+            <w:tcW w:type="dxa" w:w="1296"/>
+          </w:tcPr>
+          <w:p>
+            <w:pPr>
+              <w:spacing w:after="0"/>
+            </w:pPr>
+            <w:r>
+              <w:rPr>
+                <w:sz w:val="20"/>
+              </w:rPr>
+            </w:r>
+            <w:r>
+              <w:rPr>
+                <w:i w:val="0"/>
+                <w:sz w:val="20"/>
+              </w:rPr>
+              <w:t>1</w:t>
+            </w:r>
+          </w:p>
+        </w:tc>
+        <w:tc>
+          <w:tcPr>
+            <w:tcW w:type="dxa" w:w="1296"/>
+          </w:tcPr>
+          <w:p>
+            <w:pPr>
+              <w:spacing w:after="0"/>
+            </w:pPr>
+            <w:r>
+              <w:rPr>
+                <w:sz w:val="20"/>
+              </w:rPr>
+            </w:r>
+            <w:r>
+              <w:rPr>
+                <w:i w:val="0"/>
+                <w:sz w:val="20"/>
+              </w:rPr>
+              <w:t>64, 32</w:t>
+            </w:r>
+          </w:p>
+        </w:tc>
+        <w:tc>
+          <w:tcPr>
+            <w:tcW w:type="dxa" w:w="1296"/>
+          </w:tcPr>
+          <w:p>
+            <w:pPr>
+              <w:spacing w:after="0"/>
+            </w:pPr>
+            <w:r>
+              <w:rPr>
+                <w:sz w:val="20"/>
+              </w:rPr>
+            </w:r>
+            <w:r>
+              <w:rPr>
+                <w:i w:val="0"/>
+                <w:sz w:val="20"/>
+              </w:rPr>
+              <w:t>0,001</w:t>
+            </w:r>
+          </w:p>
+        </w:tc>
+        <w:tc>
+          <w:tcPr>
+            <w:tcW w:type="dxa" w:w="1296"/>
+          </w:tcPr>
+          <w:p>
+            <w:pPr>
+              <w:spacing w:after="0"/>
+            </w:pPr>
+            <w:r>
+              <w:rPr>
+                <w:sz w:val="20"/>
+              </w:rPr>
+            </w:r>
+            <w:r>
+              <w:rPr>
+                <w:i w:val="0"/>
+                <w:sz w:val="20"/>
+              </w:rPr>
+              <w:t>0</w:t>
+            </w:r>
+          </w:p>
+        </w:tc>
+        <w:tc>
+          <w:tcPr>
+            <w:tcW w:type="dxa" w:w="1296"/>
+          </w:tcPr>
+          <w:p>
+            <w:pPr>
+              <w:spacing w:after="0"/>
+            </w:pPr>
+            <w:r>
+              <w:rPr>
+                <w:sz w:val="20"/>
+              </w:rPr>
+            </w:r>
+            <w:r>
+              <w:rPr>
+                <w:i w:val="0"/>
+                <w:sz w:val="20"/>
+              </w:rPr>
+              <w:t>4</w:t>
+            </w:r>
+          </w:p>
+        </w:tc>
+        <w:tc>
+          <w:tcPr>
+            <w:tcW w:type="dxa" w:w="1296"/>
+          </w:tcPr>
+          <w:p>
+            <w:pPr>
+              <w:spacing w:after="0"/>
+            </w:pPr>
+            <w:r>
+              <w:rPr>
+                <w:sz w:val="20"/>
+              </w:rPr>
+            </w:r>
+            <w:r>
+              <w:rPr>
+                <w:i w:val="0"/>
+                <w:sz w:val="20"/>
+              </w:rPr>
+              <w:t>89,73</w:t>
+            </w:r>
+          </w:p>
+        </w:tc>
+        <w:tc>
+          <w:tcPr>
+            <w:tcW w:type="dxa" w:w="1296"/>
+          </w:tcPr>
+          <w:p>
+            <w:pPr>
+              <w:spacing w:after="0"/>
+            </w:pPr>
+            <w:r>
+              <w:rPr>
+                <w:sz w:val="20"/>
+              </w:rPr>
+            </w:r>
+            <w:r>
+              <w:rPr>
+                <w:i w:val="0"/>
+                <w:sz w:val="20"/>
+              </w:rPr>
+              <w:t>89,56</w:t>
+            </w:r>
+          </w:p>
+        </w:tc>
+      </w:tr>
+      <w:tr>
+        <w:tc>
+          <w:tcPr>
+            <w:tcW w:type="dxa" w:w="1296"/>
+          </w:tcPr>
+          <w:p>
+            <w:pPr>
+              <w:spacing w:after="0"/>
+            </w:pPr>
+            <w:r>
+              <w:rPr>
+                <w:sz w:val="20"/>
+              </w:rPr>
+            </w:r>
+            <w:r>
+              <w:rPr>
+                <w:i w:val="0"/>
+                <w:sz w:val="20"/>
+              </w:rPr>
+              <w:t>2</w:t>
+            </w:r>
+          </w:p>
+        </w:tc>
+        <w:tc>
+          <w:tcPr>
+            <w:tcW w:type="dxa" w:w="1296"/>
+          </w:tcPr>
+          <w:p>
+            <w:pPr>
+              <w:spacing w:after="0"/>
+            </w:pPr>
+            <w:r>
+              <w:rPr>
+                <w:sz w:val="20"/>
+              </w:rPr>
+            </w:r>
+            <w:r>
+              <w:rPr>
+                <w:i w:val="0"/>
+                <w:sz w:val="20"/>
+              </w:rPr>
+              <w:t>64, 32</w:t>
+            </w:r>
+          </w:p>
+        </w:tc>
+        <w:tc>
+          <w:tcPr>
+            <w:tcW w:type="dxa" w:w="1296"/>
+          </w:tcPr>
+          <w:p>
+            <w:pPr>
+              <w:spacing w:after="0"/>
+            </w:pPr>
+            <w:r>
+              <w:rPr>
+                <w:sz w:val="20"/>
+              </w:rPr>
+            </w:r>
+            <w:r>
+              <w:rPr>
+                <w:i w:val="0"/>
+                <w:sz w:val="20"/>
+              </w:rPr>
+              <w:t>0,01</w:t>
+            </w:r>
+          </w:p>
+        </w:tc>
+        <w:tc>
+          <w:tcPr>
+            <w:tcW w:type="dxa" w:w="1296"/>
+          </w:tcPr>
+          <w:p>
+            <w:pPr>
+              <w:spacing w:after="0"/>
+            </w:pPr>
+            <w:r>
+              <w:rPr>
+                <w:sz w:val="20"/>
+              </w:rPr>
+            </w:r>
+            <w:r>
+              <w:rPr>
+                <w:i w:val="0"/>
+                <w:sz w:val="20"/>
+              </w:rPr>
+              <w:t>0</w:t>
+            </w:r>
+          </w:p>
+        </w:tc>
+        <w:tc>
+          <w:tcPr>
+            <w:tcW w:type="dxa" w:w="1296"/>
+          </w:tcPr>
+          <w:p>
+            <w:pPr>
+              <w:spacing w:after="0"/>
+            </w:pPr>
+            <w:r>
+              <w:rPr>
+                <w:sz w:val="20"/>
+              </w:rPr>
+            </w:r>
+            <w:r>
+              <w:rPr>
+                <w:i w:val="0"/>
+                <w:sz w:val="20"/>
+              </w:rPr>
+              <w:t>2</w:t>
+            </w:r>
+          </w:p>
+        </w:tc>
+        <w:tc>
+          <w:tcPr>
+            <w:tcW w:type="dxa" w:w="1296"/>
+          </w:tcPr>
+          <w:p>
+            <w:pPr>
+              <w:spacing w:after="0"/>
+            </w:pPr>
+            <w:r>
+              <w:rPr>
+                <w:sz w:val="20"/>
+              </w:rPr>
+            </w:r>
+            <w:r>
+              <w:rPr>
+                <w:i w:val="0"/>
+                <w:sz w:val="20"/>
+              </w:rPr>
+              <w:t>89,31</w:t>
+            </w:r>
+          </w:p>
+        </w:tc>
+        <w:tc>
+          <w:tcPr>
+            <w:tcW w:type="dxa" w:w="1296"/>
+          </w:tcPr>
+          <w:p>
+            <w:pPr>
+              <w:spacing w:after="0"/>
+            </w:pPr>
+            <w:r>
+              <w:rPr>
+                <w:sz w:val="20"/>
+              </w:rPr>
+            </w:r>
+            <w:r>
+              <w:rPr>
+                <w:i w:val="0"/>
+                <w:sz w:val="20"/>
+              </w:rPr>
+              <w:t>89,56</w:t>
+            </w:r>
+          </w:p>
+        </w:tc>
+      </w:tr>
+      <w:tr>
+        <w:tc>
+          <w:tcPr>
+            <w:tcW w:type="dxa" w:w="1296"/>
+          </w:tcPr>
+          <w:p>
+            <w:pPr>
+              <w:spacing w:after="0"/>
+            </w:pPr>
+            <w:r>
+              <w:rPr>
+                <w:sz w:val="20"/>
+              </w:rPr>
+            </w:r>
+            <w:r>
+              <w:rPr>
+                <w:i w:val="0"/>
+                <w:sz w:val="20"/>
+              </w:rPr>
+              <w:t>3</w:t>
+            </w:r>
+          </w:p>
+        </w:tc>
+        <w:tc>
+          <w:tcPr>
+            <w:tcW w:type="dxa" w:w="1296"/>
+          </w:tcPr>
+          <w:p>
+            <w:pPr>
+              <w:spacing w:after="0"/>
+            </w:pPr>
+            <w:r>
+              <w:rPr>
+                <w:sz w:val="20"/>
+              </w:rPr>
+            </w:r>
+            <w:r>
+              <w:rPr>
+                <w:i w:val="0"/>
+                <w:sz w:val="20"/>
+              </w:rPr>
+              <w:t>64, 32</w:t>
+            </w:r>
+          </w:p>
+        </w:tc>
+        <w:tc>
+          <w:tcPr>
+            <w:tcW w:type="dxa" w:w="1296"/>
+          </w:tcPr>
+          <w:p>
+            <w:pPr>
+              <w:spacing w:after="0"/>
+            </w:pPr>
+            <w:r>
+              <w:rPr>
+                <w:sz w:val="20"/>
+              </w:rPr>
+            </w:r>
+            <w:r>
+              <w:rPr>
+                <w:i w:val="0"/>
+                <w:sz w:val="20"/>
+              </w:rPr>
+              <w:t>0,1</w:t>
+            </w:r>
+          </w:p>
+        </w:tc>
+        <w:tc>
+          <w:tcPr>
+            <w:tcW w:type="dxa" w:w="1296"/>
+          </w:tcPr>
+          <w:p>
+            <w:pPr>
+              <w:spacing w:after="0"/>
+            </w:pPr>
+            <w:r>
+              <w:rPr>
+                <w:sz w:val="20"/>
+              </w:rPr>
+            </w:r>
+            <w:r>
+              <w:rPr>
+                <w:i w:val="0"/>
+                <w:sz w:val="20"/>
+              </w:rPr>
+              <w:t>0</w:t>
+            </w:r>
+          </w:p>
+        </w:tc>
+        <w:tc>
+          <w:tcPr>
+            <w:tcW w:type="dxa" w:w="1296"/>
+          </w:tcPr>
+          <w:p>
+            <w:pPr>
+              <w:spacing w:after="0"/>
+            </w:pPr>
+            <w:r>
+              <w:rPr>
+                <w:sz w:val="20"/>
+              </w:rPr>
+            </w:r>
+            <w:r>
+              <w:rPr>
+                <w:i w:val="0"/>
+                <w:sz w:val="20"/>
+              </w:rPr>
+              <w:t>6</w:t>
+            </w:r>
+          </w:p>
+        </w:tc>
+        <w:tc>
+          <w:tcPr>
+            <w:tcW w:type="dxa" w:w="1296"/>
+          </w:tcPr>
+          <w:p>
+            <w:pPr>
+              <w:spacing w:after="0"/>
+            </w:pPr>
+            <w:r>
+              <w:rPr>
+                <w:sz w:val="20"/>
+              </w:rPr>
+            </w:r>
+            <w:r>
+              <w:rPr>
+                <w:i w:val="0"/>
+                <w:sz w:val="20"/>
+              </w:rPr>
+              <w:t>86,17</w:t>
+            </w:r>
+          </w:p>
+        </w:tc>
+        <w:tc>
+          <w:tcPr>
+            <w:tcW w:type="dxa" w:w="1296"/>
+          </w:tcPr>
+          <w:p>
+            <w:pPr>
+              <w:spacing w:after="0"/>
+            </w:pPr>
+            <w:r>
+              <w:rPr>
+                <w:sz w:val="20"/>
+              </w:rPr>
+            </w:r>
+            <w:r>
+              <w:rPr>
+                <w:i w:val="0"/>
+                <w:sz w:val="20"/>
+              </w:rPr>
+              <w:t>86,62</w:t>
+            </w:r>
+          </w:p>
+        </w:tc>
+      </w:tr>
+      <w:tr>
+        <w:tc>
+          <w:tcPr>
+            <w:tcW w:type="dxa" w:w="1296"/>
+          </w:tcPr>
+          <w:p>
+            <w:pPr>
+              <w:spacing w:after="0"/>
+            </w:pPr>
+            <w:r>
+              <w:rPr>
+                <w:sz w:val="20"/>
+              </w:rPr>
+            </w:r>
+            <w:r>
+              <w:rPr>
+                <w:i w:val="0"/>
+                <w:sz w:val="20"/>
+              </w:rPr>
+              <w:t>4</w:t>
+            </w:r>
+          </w:p>
+        </w:tc>
+        <w:tc>
+          <w:tcPr>
+            <w:tcW w:type="dxa" w:w="1296"/>
+          </w:tcPr>
+          <w:p>
+            <w:pPr>
+              <w:spacing w:after="0"/>
+            </w:pPr>
+            <w:r>
+              <w:rPr>
+                <w:sz w:val="20"/>
+              </w:rPr>
+            </w:r>
+            <w:r>
+              <w:rPr>
+                <w:i w:val="0"/>
+                <w:sz w:val="20"/>
+              </w:rPr>
+              <w:t>64, 32</w:t>
+            </w:r>
+          </w:p>
+        </w:tc>
+        <w:tc>
+          <w:tcPr>
+            <w:tcW w:type="dxa" w:w="1296"/>
+          </w:tcPr>
+          <w:p>
+            <w:pPr>
+              <w:spacing w:after="0"/>
+            </w:pPr>
+            <w:r>
+              <w:rPr>
+                <w:sz w:val="20"/>
+              </w:rPr>
+            </w:r>
+            <w:r>
+              <w:rPr>
+                <w:i w:val="0"/>
+                <w:sz w:val="20"/>
+              </w:rPr>
+              <w:t>0,0001</w:t>
+            </w:r>
+          </w:p>
+        </w:tc>
+        <w:tc>
+          <w:tcPr>
+            <w:tcW w:type="dxa" w:w="1296"/>
+          </w:tcPr>
+          <w:p>
+            <w:pPr>
+              <w:spacing w:after="0"/>
+            </w:pPr>
+            <w:r>
+              <w:rPr>
+                <w:sz w:val="20"/>
+              </w:rPr>
+            </w:r>
+            <w:r>
+              <w:rPr>
+                <w:i w:val="0"/>
+                <w:sz w:val="20"/>
+              </w:rPr>
+              <w:t>0</w:t>
+            </w:r>
+          </w:p>
+        </w:tc>
+        <w:tc>
+          <w:tcPr>
+            <w:tcW w:type="dxa" w:w="1296"/>
+          </w:tcPr>
+          <w:p>
+            <w:pPr>
+              <w:spacing w:after="0"/>
+            </w:pPr>
+            <w:r>
+              <w:rPr>
+                <w:sz w:val="20"/>
+              </w:rPr>
+            </w:r>
+            <w:r>
+              <w:rPr>
+                <w:i w:val="0"/>
+                <w:sz w:val="20"/>
+              </w:rPr>
+              <w:t>34</w:t>
+            </w:r>
+          </w:p>
+        </w:tc>
+        <w:tc>
+          <w:tcPr>
+            <w:tcW w:type="dxa" w:w="1296"/>
+          </w:tcPr>
+          <w:p>
+            <w:pPr>
+              <w:spacing w:after="0"/>
+            </w:pPr>
+            <w:r>
+              <w:rPr>
+                <w:sz w:val="20"/>
+              </w:rPr>
+            </w:r>
+            <w:r>
+              <w:rPr>
+                <w:i w:val="0"/>
+                <w:sz w:val="20"/>
+              </w:rPr>
+              <w:t>89,75</w:t>
+            </w:r>
+          </w:p>
+        </w:tc>
+        <w:tc>
+          <w:tcPr>
+            <w:tcW w:type="dxa" w:w="1296"/>
+          </w:tcPr>
+          <w:p>
+            <w:pPr>
+              <w:spacing w:after="0"/>
+            </w:pPr>
+            <w:r>
+              <w:rPr>
+                <w:sz w:val="20"/>
+              </w:rPr>
+            </w:r>
+            <w:r>
+              <w:rPr>
+                <w:i w:val="0"/>
+                <w:sz w:val="20"/>
+              </w:rPr>
+              <w:t>89,56</w:t>
+            </w:r>
+          </w:p>
+        </w:tc>
+      </w:tr>
+      <w:tr>
+        <w:tc>
+          <w:tcPr>
+            <w:tcW w:type="dxa" w:w="1296"/>
+          </w:tcPr>
+          <w:p>
+            <w:pPr>
+              <w:spacing w:after="0"/>
+            </w:pPr>
+            <w:r>
+              <w:rPr>
+                <w:sz w:val="20"/>
+              </w:rPr>
+            </w:r>
+            <w:r>
+              <w:rPr>
+                <w:i w:val="0"/>
+                <w:sz w:val="20"/>
+              </w:rPr>
+              <w:t>5</w:t>
+            </w:r>
+          </w:p>
+        </w:tc>
+        <w:tc>
+          <w:tcPr>
+            <w:tcW w:type="dxa" w:w="1296"/>
+          </w:tcPr>
+          <w:p>
+            <w:pPr>
+              <w:spacing w:after="0"/>
+            </w:pPr>
+            <w:r>
+              <w:rPr>
+                <w:sz w:val="20"/>
+              </w:rPr>
+            </w:r>
+            <w:r>
+              <w:rPr>
+                <w:i w:val="0"/>
+                <w:sz w:val="20"/>
+              </w:rPr>
+              <w:t>16</w:t>
+            </w:r>
+          </w:p>
+        </w:tc>
+        <w:tc>
+          <w:tcPr>
+            <w:tcW w:type="dxa" w:w="1296"/>
+          </w:tcPr>
+          <w:p>
+            <w:pPr>
+              <w:spacing w:after="0"/>
+            </w:pPr>
+            <w:r>
+              <w:rPr>
+                <w:sz w:val="20"/>
+              </w:rPr>
+            </w:r>
+            <w:r>
+              <w:rPr>
+                <w:i w:val="0"/>
+                <w:sz w:val="20"/>
+              </w:rPr>
+              <w:t>0,001</w:t>
+            </w:r>
+          </w:p>
+        </w:tc>
+        <w:tc>
+          <w:tcPr>
+            <w:tcW w:type="dxa" w:w="1296"/>
+          </w:tcPr>
+          <w:p>
+            <w:pPr>
+              <w:spacing w:after="0"/>
+            </w:pPr>
+            <w:r>
+              <w:rPr>
+                <w:sz w:val="20"/>
+              </w:rPr>
+            </w:r>
+            <w:r>
+              <w:rPr>
+                <w:i w:val="0"/>
+                <w:sz w:val="20"/>
+              </w:rPr>
+              <w:t>0</w:t>
+            </w:r>
+          </w:p>
+        </w:tc>
+        <w:tc>
+          <w:tcPr>
+            <w:tcW w:type="dxa" w:w="1296"/>
+          </w:tcPr>
+          <w:p>
+            <w:pPr>
+              <w:spacing w:after="0"/>
+            </w:pPr>
+            <w:r>
+              <w:rPr>
+                <w:sz w:val="20"/>
+              </w:rPr>
+            </w:r>
+            <w:r>
+              <w:rPr>
+                <w:i w:val="0"/>
+                <w:sz w:val="20"/>
+              </w:rPr>
+              <w:t>18</w:t>
+            </w:r>
+          </w:p>
+        </w:tc>
+        <w:tc>
+          <w:tcPr>
+            <w:tcW w:type="dxa" w:w="1296"/>
+          </w:tcPr>
+          <w:p>
+            <w:pPr>
+              <w:spacing w:after="0"/>
+            </w:pPr>
+            <w:r>
+              <w:rPr>
+                <w:sz w:val="20"/>
+              </w:rPr>
+            </w:r>
+            <w:r>
+              <w:rPr>
+                <w:i w:val="0"/>
+                <w:sz w:val="20"/>
+              </w:rPr>
+              <w:t>90,05</w:t>
+            </w:r>
+          </w:p>
+        </w:tc>
+        <w:tc>
+          <w:tcPr>
+            <w:tcW w:type="dxa" w:w="1296"/>
+          </w:tcPr>
+          <w:p>
+            <w:pPr>
+              <w:spacing w:after="0"/>
+            </w:pPr>
+            <w:r>
+              <w:rPr>
+                <w:sz w:val="20"/>
+              </w:rPr>
+            </w:r>
+            <w:r>
+              <w:rPr>
+                <w:i w:val="0"/>
+                <w:sz w:val="20"/>
+              </w:rPr>
+              <w:t>89,50</w:t>
+            </w:r>
+          </w:p>
+        </w:tc>
+      </w:tr>
+      <w:tr>
+        <w:tc>
+          <w:tcPr>
+            <w:tcW w:type="dxa" w:w="1296"/>
+          </w:tcPr>
+          <w:p>
+            <w:pPr>
+              <w:spacing w:after="0"/>
+            </w:pPr>
+            <w:r>
+              <w:rPr>
+                <w:sz w:val="20"/>
+              </w:rPr>
+            </w:r>
+            <w:r>
+              <w:rPr>
+                <w:i w:val="0"/>
+                <w:sz w:val="20"/>
+              </w:rPr>
+              <w:t>6</w:t>
+            </w:r>
+          </w:p>
+        </w:tc>
+        <w:tc>
+          <w:tcPr>
+            <w:tcW w:type="dxa" w:w="1296"/>
+          </w:tcPr>
+          <w:p>
+            <w:pPr>
+              <w:spacing w:after="0"/>
+            </w:pPr>
+            <w:r>
+              <w:rPr>
+                <w:sz w:val="20"/>
+              </w:rPr>
+            </w:r>
+            <w:r>
+              <w:rPr>
+                <w:i w:val="0"/>
+                <w:sz w:val="20"/>
+              </w:rPr>
+              <w:t>256, 128, 64</w:t>
+            </w:r>
+          </w:p>
+        </w:tc>
+        <w:tc>
+          <w:tcPr>
+            <w:tcW w:type="dxa" w:w="1296"/>
+          </w:tcPr>
+          <w:p>
+            <w:pPr>
+              <w:spacing w:after="0"/>
+            </w:pPr>
+            <w:r>
+              <w:rPr>
+                <w:sz w:val="20"/>
+              </w:rPr>
+            </w:r>
+            <w:r>
+              <w:rPr>
+                <w:i w:val="0"/>
+                <w:sz w:val="20"/>
+              </w:rPr>
+              <w:t>0,001</w:t>
+            </w:r>
+          </w:p>
+        </w:tc>
+        <w:tc>
+          <w:tcPr>
+            <w:tcW w:type="dxa" w:w="1296"/>
+          </w:tcPr>
+          <w:p>
+            <w:pPr>
+              <w:spacing w:after="0"/>
+            </w:pPr>
+            <w:r>
+              <w:rPr>
+                <w:sz w:val="20"/>
+              </w:rPr>
+            </w:r>
+            <w:r>
+              <w:rPr>
+                <w:i w:val="0"/>
+                <w:sz w:val="20"/>
+              </w:rPr>
+              <w:t>0</w:t>
+            </w:r>
+          </w:p>
+        </w:tc>
+        <w:tc>
+          <w:tcPr>
+            <w:tcW w:type="dxa" w:w="1296"/>
+          </w:tcPr>
+          <w:p>
+            <w:pPr>
+              <w:spacing w:after="0"/>
+            </w:pPr>
+            <w:r>
+              <w:rPr>
+                <w:sz w:val="20"/>
+              </w:rPr>
+            </w:r>
+            <w:r>
+              <w:rPr>
+                <w:i w:val="0"/>
+                <w:sz w:val="20"/>
+              </w:rPr>
+              <w:t>3</w:t>
+            </w:r>
+          </w:p>
+        </w:tc>
+        <w:tc>
+          <w:tcPr>
+            <w:tcW w:type="dxa" w:w="1296"/>
+          </w:tcPr>
+          <w:p>
+            <w:pPr>
+              <w:spacing w:after="0"/>
+            </w:pPr>
+            <w:r>
+              <w:rPr>
+                <w:sz w:val="20"/>
+              </w:rPr>
+            </w:r>
+            <w:r>
+              <w:rPr>
+                <w:i w:val="0"/>
+                <w:sz w:val="20"/>
+              </w:rPr>
+              <w:t>90,44</w:t>
+            </w:r>
+          </w:p>
+        </w:tc>
+        <w:tc>
+          <w:tcPr>
+            <w:tcW w:type="dxa" w:w="1296"/>
+          </w:tcPr>
+          <w:p>
+            <w:pPr>
+              <w:spacing w:after="0"/>
+            </w:pPr>
+            <w:r>
+              <w:rPr>
+                <w:sz w:val="20"/>
+              </w:rPr>
+            </w:r>
+            <w:r>
+              <w:rPr>
+                <w:i w:val="0"/>
+                <w:sz w:val="20"/>
+              </w:rPr>
+              <w:t>88,87</w:t>
+            </w:r>
+          </w:p>
+        </w:tc>
+      </w:tr>
+      <w:tr>
+        <w:tc>
+          <w:tcPr>
+            <w:tcW w:type="dxa" w:w="1296"/>
+          </w:tcPr>
+          <w:p>
+            <w:pPr>
+              <w:spacing w:after="0"/>
+            </w:pPr>
+            <w:r>
+              <w:rPr>
+                <w:sz w:val="20"/>
+              </w:rPr>
+            </w:r>
+            <w:r>
+              <w:rPr>
+                <w:i w:val="0"/>
+                <w:sz w:val="20"/>
+              </w:rPr>
+              <w:t>7</w:t>
+            </w:r>
+          </w:p>
+        </w:tc>
+        <w:tc>
+          <w:tcPr>
+            <w:tcW w:type="dxa" w:w="1296"/>
+          </w:tcPr>
+          <w:p>
+            <w:pPr>
+              <w:spacing w:after="0"/>
+            </w:pPr>
+            <w:r>
+              <w:rPr>
+                <w:sz w:val="20"/>
+              </w:rPr>
+            </w:r>
+            <w:r>
+              <w:rPr>
+                <w:i w:val="0"/>
+                <w:sz w:val="20"/>
+              </w:rPr>
+              <w:t>64, 32</w:t>
+            </w:r>
+          </w:p>
+        </w:tc>
+        <w:tc>
+          <w:tcPr>
+            <w:tcW w:type="dxa" w:w="1296"/>
+          </w:tcPr>
+          <w:p>
+            <w:pPr>
+              <w:spacing w:after="0"/>
+            </w:pPr>
+            <w:r>
+              <w:rPr>
+                <w:sz w:val="20"/>
+              </w:rPr>
+            </w:r>
+            <w:r>
+              <w:rPr>
+                <w:i w:val="0"/>
+                <w:sz w:val="20"/>
+              </w:rPr>
+              <w:t>0,001</w:t>
+            </w:r>
+          </w:p>
+        </w:tc>
+        <w:tc>
+          <w:tcPr>
+            <w:tcW w:type="dxa" w:w="1296"/>
+          </w:tcPr>
+          <w:p>
+            <w:pPr>
+              <w:spacing w:after="0"/>
+            </w:pPr>
+            <w:r>
+              <w:rPr>
+                <w:sz w:val="20"/>
+              </w:rPr>
+            </w:r>
+            <w:r>
+              <w:rPr>
+                <w:i w:val="0"/>
+                <w:sz w:val="20"/>
+              </w:rPr>
+              <w:t>0,3</w:t>
+            </w:r>
+          </w:p>
+        </w:tc>
+        <w:tc>
+          <w:tcPr>
+            <w:tcW w:type="dxa" w:w="1296"/>
+          </w:tcPr>
+          <w:p>
+            <w:pPr>
+              <w:spacing w:after="0"/>
+            </w:pPr>
+            <w:r>
+              <w:rPr>
+                <w:sz w:val="20"/>
+              </w:rPr>
+            </w:r>
+            <w:r>
+              <w:rPr>
+                <w:i w:val="0"/>
+                <w:sz w:val="20"/>
+              </w:rPr>
+              <w:t>6</w:t>
+            </w:r>
+          </w:p>
+        </w:tc>
+        <w:tc>
+          <w:tcPr>
+            <w:tcW w:type="dxa" w:w="1296"/>
+          </w:tcPr>
+          <w:p>
+            <w:pPr>
+              <w:spacing w:after="0"/>
+            </w:pPr>
+            <w:r>
+              <w:rPr>
+                <w:sz w:val="20"/>
+              </w:rPr>
+            </w:r>
+            <w:r>
+              <w:rPr>
+                <w:i w:val="0"/>
+                <w:sz w:val="20"/>
+              </w:rPr>
+              <w:t>89,68</w:t>
+            </w:r>
+          </w:p>
+        </w:tc>
+        <w:tc>
+          <w:tcPr>
+            <w:tcW w:type="dxa" w:w="1296"/>
+          </w:tcPr>
+          <w:p>
+            <w:pPr>
+              <w:spacing w:after="0"/>
+            </w:pPr>
+            <w:r>
+              <w:rPr>
+                <w:sz w:val="20"/>
+              </w:rPr>
+            </w:r>
+            <w:r>
+              <w:rPr>
+                <w:i w:val="0"/>
+                <w:sz w:val="20"/>
+              </w:rPr>
+              <w:t>90,02</w:t>
+            </w:r>
+          </w:p>
+        </w:tc>
+      </w:tr>
+      <w:tr>
+        <w:tc>
+          <w:tcPr>
+            <w:tcW w:type="dxa" w:w="1296"/>
+          </w:tcPr>
+          <w:p>
+            <w:pPr>
+              <w:spacing w:after="0"/>
+            </w:pPr>
+            <w:r>
+              <w:rPr>
+                <w:sz w:val="20"/>
+              </w:rPr>
+            </w:r>
+            <w:r>
+              <w:rPr>
+                <w:i w:val="0"/>
+                <w:sz w:val="20"/>
+              </w:rPr>
+              <w:t>8</w:t>
+            </w:r>
+          </w:p>
+        </w:tc>
+        <w:tc>
+          <w:tcPr>
+            <w:tcW w:type="dxa" w:w="1296"/>
+          </w:tcPr>
+          <w:p>
+            <w:pPr>
+              <w:spacing w:after="0"/>
+            </w:pPr>
+            <w:r>
+              <w:rPr>
+                <w:sz w:val="20"/>
+              </w:rPr>
+            </w:r>
+            <w:r>
+              <w:rPr>
+                <w:i w:val="0"/>
+                <w:sz w:val="20"/>
+              </w:rPr>
+              <w:t>256, 128, 64</w:t>
+            </w:r>
+          </w:p>
+        </w:tc>
+        <w:tc>
+          <w:tcPr>
+            <w:tcW w:type="dxa" w:w="1296"/>
+          </w:tcPr>
+          <w:p>
+            <w:pPr>
+              <w:spacing w:after="0"/>
+            </w:pPr>
+            <w:r>
+              <w:rPr>
+                <w:sz w:val="20"/>
+              </w:rPr>
+            </w:r>
+            <w:r>
+              <w:rPr>
+                <w:i w:val="0"/>
+                <w:sz w:val="20"/>
+              </w:rPr>
+              <w:t>0,001</w:t>
+            </w:r>
+          </w:p>
+        </w:tc>
+        <w:tc>
+          <w:tcPr>
+            <w:tcW w:type="dxa" w:w="1296"/>
+          </w:tcPr>
+          <w:p>
+            <w:pPr>
+              <w:spacing w:after="0"/>
+            </w:pPr>
+            <w:r>
+              <w:rPr>
+                <w:sz w:val="20"/>
+              </w:rPr>
+            </w:r>
+            <w:r>
+              <w:rPr>
+                <w:i w:val="0"/>
+                <w:sz w:val="20"/>
+              </w:rPr>
+              <w:t>0,3</w:t>
+            </w:r>
+          </w:p>
+        </w:tc>
+        <w:tc>
+          <w:tcPr>
+            <w:tcW w:type="dxa" w:w="1296"/>
+          </w:tcPr>
+          <w:p>
+            <w:pPr>
+              <w:spacing w:after="0"/>
+            </w:pPr>
+            <w:r>
+              <w:rPr>
+                <w:sz w:val="20"/>
+              </w:rPr>
+            </w:r>
+            <w:r>
+              <w:rPr>
+                <w:i w:val="0"/>
+                <w:sz w:val="20"/>
+              </w:rPr>
+              <w:t>5</w:t>
+            </w:r>
+          </w:p>
+        </w:tc>
+        <w:tc>
+          <w:tcPr>
+            <w:tcW w:type="dxa" w:w="1296"/>
+          </w:tcPr>
+          <w:p>
+            <w:pPr>
+              <w:spacing w:after="0"/>
+            </w:pPr>
+            <w:r>
+              <w:rPr>
+                <w:sz w:val="20"/>
+              </w:rPr>
+            </w:r>
+            <w:r>
+              <w:rPr>
+                <w:i w:val="0"/>
+                <w:sz w:val="20"/>
+              </w:rPr>
+              <w:t>90,26</w:t>
+            </w:r>
+          </w:p>
+        </w:tc>
+        <w:tc>
+          <w:tcPr>
+            <w:tcW w:type="dxa" w:w="1296"/>
+          </w:tcPr>
+          <w:p>
+            <w:pPr>
+              <w:spacing w:after="0"/>
+            </w:pPr>
+            <w:r>
+              <w:rPr>
+                <w:sz w:val="20"/>
+              </w:rPr>
+            </w:r>
+            <w:r>
+              <w:rPr>
+                <w:i w:val="0"/>
+                <w:sz w:val="20"/>
+              </w:rPr>
+              <w:t>89,85</w:t>
+            </w:r>
+          </w:p>
+        </w:tc>
+      </w:tr>
+    </w:tbl>
+    <w:p/>
+    <w:p>
+      <w:pPr>
+        <w:jc w:val="both"/>
+      </w:pPr>
+      <w:r>
+        <w:rPr>
+          <w:i w:val="0"/>
+        </w:rPr>
+        <w:t>Rýchlosť učenia (experimenty 1 až 4). Hodnoty 0,01, 0,001 a 0,0001 skončili na rovnakej úspešnosti 89,56 % a líšia sa hlavne počtom epoch. Pri 0,0001 trvalo 34 epoch, kým sieť dosiahla to, čo pri 0,01 za dve. Pri 0,1 sú kroky príliš veľké a sieť sa učí zle, úspešnosť je 86,62 %.</w:t>
+      </w:r>
+    </w:p>
+    <w:p>
+      <w:pPr>
+        <w:jc w:val="both"/>
+      </w:pPr>
+      <w:r>
+        <w:rPr>
+          <w:i w:val="0"/>
+        </w:rPr>
+        <w:t>Architektúra (experimenty 5 a 6). Najmenšia sieť so 16 neurónmi má 89,50 %, skoro rovnako ako základná. Najväčšia má vyššiu úspešnosť na trénovacej množine (90,44 %) a nižšiu na testovacej (88,87 %), čo je náznak pretrénovania aj napriek EarlyStopping. Viac neurónov tu nepomáha.</w:t>
+      </w:r>
+    </w:p>
+    <w:p>
+      <w:pPr>
+        <w:jc w:val="both"/>
+      </w:pPr>
+      <w:r>
+        <w:rPr>
+          <w:i w:val="0"/>
+        </w:rPr>
+        <w:t>Dropout (experimenty 7 a 8). Dropout 0,3 pomohol obom sieťam. Pri veľkej sieti stúpla úspešnosť na testovacej množine z 88,87 % na 89,85 % a základná sieť s dropoutom má najlepší výsledok, 90,02 %.</w:t>
+      </w:r>
+    </w:p>
+    <w:p>
+      <w:pPr>
+        <w:jc w:val="both"/>
+      </w:pPr>
+      <w:r>
+        <w:rPr>
+          <w:i w:val="0"/>
+        </w:rPr>
+        <w:t>Rozdiely medzi väčšinou experimentov sú do pol bodu, čo je na testovacej množine s 1 734 riadkami 8 až 9 návštev. Každý experiment bežal len raz, takže poradie na prvých miestach by pri inom seede mohlo vyjsť inak. Jasne sa odlišuje len experiment 3.</w:t>
+      </w:r>
+    </w:p>
+    <w:p>
+      <w:pPr>
+        <w:pStyle w:val="Heading2"/>
+      </w:pPr>
+      <w:r>
+        <w:t>3.4 Najlepší a najhorší experiment</w:t>
+      </w:r>
+    </w:p>
+    <w:p>
+      <w:pPr>
+        <w:jc w:val="both"/>
+      </w:pPr>
+      <w:r>
+        <w:rPr>
+          <w:i w:val="0"/>
+        </w:rPr>
+        <w:t>Najlepší výsledok na testovacej množine má experiment 7 (vrstvy 64 a 32, rýchlosť učenia 0,001, dropout 0,3).</w:t>
+      </w:r>
+    </w:p>
+    <w:p>
+      <w:pPr>
+        <w:jc w:val="center"/>
+      </w:pPr>
+      <w:r>
+        <w:drawing>
+          <wp:inline xmlns:a="http://schemas.openxmlformats.org/drawingml/2006/main" xmlns:pic="http://schemas.openxmlformats.org/drawingml/2006/picture">
+            <wp:extent cx="5760000" cy="2160000"/>
+            <wp:docPr id="13" name="Picture 13"/>
+            <wp:cNvGraphicFramePr>
+              <a:graphicFrameLocks noChangeAspect="1"/>
+            </wp:cNvGraphicFramePr>
+            <a:graphic>
+              <a:graphicData uri="http://schemas.openxmlformats.org/drawingml/2006/picture">
+                <pic:pic>
+                  <pic:nvPicPr>
+                    <pic:cNvPr id="0" name="nn_best_history.png"/>
+                    <pic:cNvPicPr/>
+                  </pic:nvPicPr>
+                  <pic:blipFill>
+                    <a:blip r:embed="rId21"/>
+                    <a:stretch>
+                      <a:fillRect/>
+                    </a:stretch>
+                  </pic:blipFill>
+                  <pic:spPr>
+                    <a:xfrm>
+                      <a:off x="0" y="0"/>
+                      <a:ext cx="5760000" cy="2160000"/>
+                    </a:xfrm>
+                    <a:prstGeom prst="rect"/>
+                  </pic:spPr>
+                </pic:pic>
+              </a:graphicData>
+            </a:graphic>
+          </wp:inline>
+        </w:drawing>
+      </w:r>
+    </w:p>
+    <w:p>
+      <w:pPr>
+        <w:jc w:val="center"/>
+      </w:pPr>
+      <w:r>
+        <w:rPr>
+          <w:sz w:val="20"/>
+        </w:rPr>
+        <w:t>Obr. 13: Priebeh trénovania najlepšieho experimentu (č. 7)</w:t>
+      </w:r>
+    </w:p>
+    <w:p>
+      <w:pPr>
+        <w:jc w:val="center"/>
+      </w:pPr>
+      <w:r>
+        <w:drawing>
+          <wp:inline xmlns:a="http://schemas.openxmlformats.org/drawingml/2006/main" xmlns:pic="http://schemas.openxmlformats.org/drawingml/2006/picture">
+            <wp:extent cx="5760000" cy="2356364"/>
+            <wp:docPr id="14" name="Picture 14"/>
+            <wp:cNvGraphicFramePr>
+              <a:graphicFrameLocks noChangeAspect="1"/>
+            </wp:cNvGraphicFramePr>
+            <a:graphic>
+              <a:graphicData uri="http://schemas.openxmlformats.org/drawingml/2006/picture">
+                <pic:pic>
+                  <pic:nvPicPr>
+                    <pic:cNvPr id="0" name="nn_best_confusion.png"/>
+                    <pic:cNvPicPr/>
+                  </pic:nvPicPr>
+                  <pic:blipFill>
+                    <a:blip r:embed="rId22"/>
+                    <a:stretch>
+                      <a:fillRect/>
+                    </a:stretch>
+                  </pic:blipFill>
+                  <pic:spPr>
+                    <a:xfrm>
+                      <a:off x="0" y="0"/>
+                      <a:ext cx="5760000" cy="2356364"/>
+                    </a:xfrm>
+                    <a:prstGeom prst="rect"/>
+                  </pic:spPr>
+                </pic:pic>
+              </a:graphicData>
+            </a:graphic>
+          </wp:inline>
+        </w:drawing>
+      </w:r>
+    </w:p>
+    <w:p>
+      <w:pPr>
+        <w:jc w:val="center"/>
+      </w:pPr>
+      <w:r>
+        <w:rPr>
+          <w:sz w:val="20"/>
+        </w:rPr>
+        <w:t>Obr. 14: Konfúzne matice najlepšieho experimentu (č. 7)</w:t>
+      </w:r>
+    </w:p>
+    <w:p>
+      <w:pPr>
+        <w:jc w:val="both"/>
+      </w:pPr>
+      <w:r>
+        <w:rPr>
+          <w:i w:val="0"/>
+        </w:rPr>
+        <w:t>Validačná chyba bola najnižšia v 6. epoche a trénovanie sa zastavilo po 16. Trénovacia a validačná krivka idú blízko seba a rozchádzajú sa oveľa pomalšie než pri veľkej sieti z časti 3.1. Úspešnosť je 89,68 % na trénovacej a 90,02 % na testovacej množine. Na testovacej množine sieť zachytila 154 z 286 nákupov a 41 návštev bez nákupu označila ako nákup.</w:t>
+      </w:r>
+    </w:p>
+    <w:p>
+      <w:pPr>
+        <w:jc w:val="both"/>
+      </w:pPr>
+      <w:r>
+        <w:rPr>
+          <w:i w:val="0"/>
+        </w:rPr>
+        <w:t>Najhorší je experiment 3 s rýchlosťou učenia 0,1.</w:t>
+      </w:r>
+    </w:p>
+    <w:p>
+      <w:pPr>
+        <w:jc w:val="center"/>
+      </w:pPr>
+      <w:r>
+        <w:drawing>
+          <wp:inline xmlns:a="http://schemas.openxmlformats.org/drawingml/2006/main" xmlns:pic="http://schemas.openxmlformats.org/drawingml/2006/picture">
+            <wp:extent cx="5760000" cy="2160000"/>
+            <wp:docPr id="15" name="Picture 15"/>
+            <wp:cNvGraphicFramePr>
+              <a:graphicFrameLocks noChangeAspect="1"/>
+            </wp:cNvGraphicFramePr>
+            <a:graphic>
+              <a:graphicData uri="http://schemas.openxmlformats.org/drawingml/2006/picture">
+                <pic:pic>
+                  <pic:nvPicPr>
+                    <pic:cNvPr id="0" name="nn_worst_history.png"/>
+                    <pic:cNvPicPr/>
+                  </pic:nvPicPr>
+                  <pic:blipFill>
+                    <a:blip r:embed="rId23"/>
+                    <a:stretch>
+                      <a:fillRect/>
+                    </a:stretch>
+                  </pic:blipFill>
+                  <pic:spPr>
+                    <a:xfrm>
+                      <a:off x="0" y="0"/>
+                      <a:ext cx="5760000" cy="2160000"/>
+                    </a:xfrm>
+                    <a:prstGeom prst="rect"/>
+                  </pic:spPr>
+                </pic:pic>
+              </a:graphicData>
+            </a:graphic>
+          </wp:inline>
+        </w:drawing>
+      </w:r>
+    </w:p>
+    <w:p>
+      <w:pPr>
+        <w:jc w:val="center"/>
+      </w:pPr>
+      <w:r>
+        <w:rPr>
+          <w:sz w:val="20"/>
+        </w:rPr>
+        <w:t>Obr. 15: Priebeh trénovania najhoršieho experimentu (č. 3)</w:t>
+      </w:r>
+    </w:p>
+    <w:p>
+      <w:pPr>
+        <w:jc w:val="center"/>
+      </w:pPr>
+      <w:r>
+        <w:drawing>
+          <wp:inline xmlns:a="http://schemas.openxmlformats.org/drawingml/2006/main" xmlns:pic="http://schemas.openxmlformats.org/drawingml/2006/picture">
+            <wp:extent cx="5760000" cy="2356364"/>
+            <wp:docPr id="16" name="Picture 16"/>
+            <wp:cNvGraphicFramePr>
+              <a:graphicFrameLocks noChangeAspect="1"/>
+            </wp:cNvGraphicFramePr>
+            <a:graphic>
+              <a:graphicData uri="http://schemas.openxmlformats.org/drawingml/2006/picture">
+                <pic:pic>
+                  <pic:nvPicPr>
+                    <pic:cNvPr id="0" name="nn_worst_confusion.png"/>
+                    <pic:cNvPicPr/>
+                  </pic:nvPicPr>
+                  <pic:blipFill>
+                    <a:blip r:embed="rId24"/>
+                    <a:stretch>
+                      <a:fillRect/>
+                    </a:stretch>
+                  </pic:blipFill>
+                  <pic:spPr>
+                    <a:xfrm>
+                      <a:off x="0" y="0"/>
+                      <a:ext cx="5760000" cy="2356364"/>
+                    </a:xfrm>
+                    <a:prstGeom prst="rect"/>
+                  </pic:spPr>
+                </pic:pic>
+              </a:graphicData>
+            </a:graphic>
+          </wp:inline>
+        </w:drawing>
+      </w:r>
+    </w:p>
+    <w:p>
+      <w:pPr>
+        <w:jc w:val="center"/>
+      </w:pPr>
+      <w:r>
+        <w:rPr>
+          <w:sz w:val="20"/>
+        </w:rPr>
+        <w:t>Obr. 16: Konfúzne matice najhoršieho experimentu (č. 3)</w:t>
+      </w:r>
+    </w:p>
+    <w:p>
+      <w:pPr>
+        <w:jc w:val="both"/>
+      </w:pPr>
+      <w:r>
+        <w:rPr>
+          <w:i w:val="0"/>
+        </w:rPr>
+        <w:t>Chyba tu neklesá plynulo. Na trénovacej množine skáče medzi 0,32 a 0,46 a od 8. epochy je vyššia než po prvej epoche. Úspešnosť 86,62 % je len asi 3 body nad modelom, ktorý vždy odpovie „bez nákupu“. Z konfúznej matice vidno prečo: sieť označila ako nákup len 60 z 1 734 návštev a z 286 nákupov našla 57.</w:t>
+      </w:r>
+    </w:p>
     <w:sectPr>
       <w:pgSz w:w="11906" w:h="16838"/>
       <w:pgMar w:top="1417" w:right="1417" w:bottom="1417" w:left="1417" w:header="720" w:footer="720" w:gutter="0"/>

</xml_diff>

<commit_message>
Add neural network for task 1, drop F1 metric and label confusion matrix
</commit_message>
<xml_diff>
--- a/tasks/task1/documentation.docx
+++ b/tasks/task1/documentation.docx
@@ -185,7 +185,7 @@
         <w:rPr>
           <w:i w:val="0"/>
         </w:rPr>
-        <w:t xml:space="preserve">Pri veľkých hodnotách som skúsil bežné pravidlo 1,5 × IQR, ale na tieto dáta sa nehodí. Väčšina návštev má čas blízky nule, takže pravidlo by v stĺpci </w:t>
+        <w:t xml:space="preserve">Pri veľkých hodnotách som najprv skúsil bežné pravidlo 1,5 × IQR. IQR je rozdiel medzi tretím a prvým kvartilom (Q3 − Q1) a za outlier sa berie každá hodnota nad Q3 + 1,5 × IQR. Na tieto dáta sa pravidlo nehodí. V stĺpci </w:t>
       </w:r>
       <w:r>
         <w:rPr>
@@ -197,7 +197,7 @@
         <w:rPr>
           <w:i w:val="0"/>
         </w:rPr>
-        <w:t xml:space="preserve"> označilo 1 176 riadkov a v stĺpci </w:t>
+        <w:t xml:space="preserve"> je Q1 = 0 a Q3 = 93,9 sekundy, hranica teda vyjde 234,8 sekundy a pravidlo by označilo 1 176 návštev, hoci štyri minúty na administratívnych stránkach sú bežné. V stĺpci </w:t>
       </w:r>
       <w:r>
         <w:rPr>
@@ -209,7 +209,18 @@
         <w:rPr>
           <w:i w:val="0"/>
         </w:rPr>
-        <w:t xml:space="preserve"> 2 730, čiže každú nenulovú hodnotu. Hodnoty v stĺpci som si preto zoradil a hľadal medzi nimi skok (obr. 1).</w:t>
+        <w:t xml:space="preserve"> je Q1 aj Q3 nula, hranica je 0 a outlierom by bola každá nenulová hodnota, spolu 2 730 riadkov. Väčšina návštev má totiž hodnoty na nule alebo tesne nad ňou.</w:t>
+      </w:r>
+    </w:p>
+    <w:p>
+      <w:pPr>
+        <w:jc w:val="both"/>
+      </w:pPr>
+      <w:r>
+        <w:rPr>
+          <w:i w:val="0"/>
+        </w:rPr>
+        <w:t>Hodnoty v stĺpci som si preto zoradil a hľadal medzi nimi skok (obr. 1).</w:t>
       </w:r>
     </w:p>
     <w:p>
@@ -1476,7 +1487,7 @@
         <w:rPr>
           <w:i w:val="0"/>
         </w:rPr>
-        <w:t xml:space="preserve">), kde každá hodnota dostane vlastný stĺpec s 0 alebo 1. Mesiace som nekódoval číslami, lebo model by ich bral ako veľkosť. </w:t>
+        <w:t xml:space="preserve">), kde každá hodnota dostane vlastný stĺpec s 0 alebo 1. Mesiace som neprevádzal na čísla 2 až 12. Model by ich potom bral ako veľkosť, teda december by bol „viac“ než november. Podiel nákupov ale s poradím mesiaca nerastie rovnomerne, v novembri je 26,9 % a v decembri 13,4 % (časť 2.3). </w:t>
       </w:r>
       <w:r>
         <w:rPr>
@@ -1634,6 +1645,17 @@
     </w:p>
     <w:p>
       <w:pPr>
+        <w:jc w:val="both"/>
+      </w:pPr>
+      <w:r>
+        <w:rPr>
+          <w:i w:val="0"/>
+        </w:rPr>
+        <w:t>Logistická regresia validačnú množinu nepotrebuje, lebo pri jej trénovaní netreba rozhodovať, kedy skončiť. Dáta aj tak delím na tri časti: zadanie to vyžaduje a validačnú množinu neskôr používa neurónová sieť (časť 3). Pri jednoduchom modeli zostáva validačná časť nevyužitá. Oba modely tak pri rovnakom pomere trénujú a testujú sa na rovnako veľkých množinách.</w:t>
+      </w:r>
+    </w:p>
+    <w:p>
+      <w:pPr>
         <w:pStyle w:val="Heading2"/>
       </w:pPr>
       <w:r>
@@ -1670,18 +1692,17 @@
         <w:tblLook w:firstColumn="1" w:firstRow="1" w:lastColumn="0" w:lastRow="0" w:noHBand="0" w:noVBand="1" w:val="04A0"/>
       </w:tblPr>
       <w:tblGrid>
-        <w:gridCol w:w="1296"/>
-        <w:gridCol w:w="1296"/>
-        <w:gridCol w:w="1296"/>
-        <w:gridCol w:w="1296"/>
-        <w:gridCol w:w="1296"/>
-        <w:gridCol w:w="1296"/>
-        <w:gridCol w:w="1296"/>
+        <w:gridCol w:w="1512"/>
+        <w:gridCol w:w="1512"/>
+        <w:gridCol w:w="1512"/>
+        <w:gridCol w:w="1512"/>
+        <w:gridCol w:w="1512"/>
+        <w:gridCol w:w="1512"/>
       </w:tblGrid>
       <w:tr>
         <w:tc>
           <w:tcPr>
-            <w:tcW w:type="dxa" w:w="1296"/>
+            <w:tcW w:type="dxa" w:w="1512"/>
           </w:tcPr>
           <w:p>
             <w:pPr>
@@ -1703,7 +1724,7 @@
         </w:tc>
         <w:tc>
           <w:tcPr>
-            <w:tcW w:type="dxa" w:w="1296"/>
+            <w:tcW w:type="dxa" w:w="1512"/>
           </w:tcPr>
           <w:p>
             <w:pPr>
@@ -1725,7 +1746,7 @@
         </w:tc>
         <w:tc>
           <w:tcPr>
-            <w:tcW w:type="dxa" w:w="1296"/>
+            <w:tcW w:type="dxa" w:w="1512"/>
           </w:tcPr>
           <w:p>
             <w:pPr>
@@ -1747,7 +1768,7 @@
         </w:tc>
         <w:tc>
           <w:tcPr>
-            <w:tcW w:type="dxa" w:w="1296"/>
+            <w:tcW w:type="dxa" w:w="1512"/>
           </w:tcPr>
           <w:p>
             <w:pPr>
@@ -1769,7 +1790,7 @@
         </w:tc>
         <w:tc>
           <w:tcPr>
-            <w:tcW w:type="dxa" w:w="1296"/>
+            <w:tcW w:type="dxa" w:w="1512"/>
           </w:tcPr>
           <w:p>
             <w:pPr>
@@ -1791,7 +1812,7 @@
         </w:tc>
         <w:tc>
           <w:tcPr>
-            <w:tcW w:type="dxa" w:w="1296"/>
+            <w:tcW w:type="dxa" w:w="1512"/>
           </w:tcPr>
           <w:p>
             <w:pPr>
@@ -1808,28 +1829,6 @@
                 <w:sz w:val="20"/>
               </w:rPr>
               <w:t>Odchýlka test</w:t>
-            </w:r>
-          </w:p>
-        </w:tc>
-        <w:tc>
-          <w:tcPr>
-            <w:tcW w:type="dxa" w:w="1296"/>
-          </w:tcPr>
-          <w:p>
-            <w:pPr>
-              <w:spacing w:after="0"/>
-            </w:pPr>
-            <w:r>
-              <w:rPr>
-                <w:sz w:val="20"/>
-              </w:rPr>
-            </w:r>
-            <w:r>
-              <w:rPr>
-                <w:b/>
-                <w:sz w:val="20"/>
-              </w:rPr>
-              <w:t>F1 test (%)</w:t>
             </w:r>
           </w:p>
         </w:tc>
@@ -1837,7 +1836,7 @@
       <w:tr>
         <w:tc>
           <w:tcPr>
-            <w:tcW w:type="dxa" w:w="1296"/>
+            <w:tcW w:type="dxa" w:w="1512"/>
           </w:tcPr>
           <w:p>
             <w:pPr>
@@ -1859,7 +1858,7 @@
         </w:tc>
         <w:tc>
           <w:tcPr>
-            <w:tcW w:type="dxa" w:w="1296"/>
+            <w:tcW w:type="dxa" w:w="1512"/>
           </w:tcPr>
           <w:p>
             <w:pPr>
@@ -1881,7 +1880,7 @@
         </w:tc>
         <w:tc>
           <w:tcPr>
-            <w:tcW w:type="dxa" w:w="1296"/>
+            <w:tcW w:type="dxa" w:w="1512"/>
           </w:tcPr>
           <w:p>
             <w:pPr>
@@ -1903,7 +1902,7 @@
         </w:tc>
         <w:tc>
           <w:tcPr>
-            <w:tcW w:type="dxa" w:w="1296"/>
+            <w:tcW w:type="dxa" w:w="1512"/>
           </w:tcPr>
           <w:p>
             <w:pPr>
@@ -1925,7 +1924,7 @@
         </w:tc>
         <w:tc>
           <w:tcPr>
-            <w:tcW w:type="dxa" w:w="1296"/>
+            <w:tcW w:type="dxa" w:w="1512"/>
           </w:tcPr>
           <w:p>
             <w:pPr>
@@ -1947,7 +1946,7 @@
         </w:tc>
         <w:tc>
           <w:tcPr>
-            <w:tcW w:type="dxa" w:w="1296"/>
+            <w:tcW w:type="dxa" w:w="1512"/>
           </w:tcPr>
           <w:p>
             <w:pPr>
@@ -1964,28 +1963,6 @@
                 <w:sz w:val="20"/>
               </w:rPr>
               <w:t>0,42</w:t>
-            </w:r>
-          </w:p>
-        </w:tc>
-        <w:tc>
-          <w:tcPr>
-            <w:tcW w:type="dxa" w:w="1296"/>
-          </w:tcPr>
-          <w:p>
-            <w:pPr>
-              <w:spacing w:after="0"/>
-            </w:pPr>
-            <w:r>
-              <w:rPr>
-                <w:sz w:val="20"/>
-              </w:rPr>
-            </w:r>
-            <w:r>
-              <w:rPr>
-                <w:i w:val="0"/>
-                <w:sz w:val="20"/>
-              </w:rPr>
-              <w:t>52,24</w:t>
             </w:r>
           </w:p>
         </w:tc>
@@ -1993,7 +1970,7 @@
       <w:tr>
         <w:tc>
           <w:tcPr>
-            <w:tcW w:type="dxa" w:w="1296"/>
+            <w:tcW w:type="dxa" w:w="1512"/>
           </w:tcPr>
           <w:p>
             <w:pPr>
@@ -2015,7 +1992,7 @@
         </w:tc>
         <w:tc>
           <w:tcPr>
-            <w:tcW w:type="dxa" w:w="1296"/>
+            <w:tcW w:type="dxa" w:w="1512"/>
           </w:tcPr>
           <w:p>
             <w:pPr>
@@ -2037,7 +2014,7 @@
         </w:tc>
         <w:tc>
           <w:tcPr>
-            <w:tcW w:type="dxa" w:w="1296"/>
+            <w:tcW w:type="dxa" w:w="1512"/>
           </w:tcPr>
           <w:p>
             <w:pPr>
@@ -2059,7 +2036,7 @@
         </w:tc>
         <w:tc>
           <w:tcPr>
-            <w:tcW w:type="dxa" w:w="1296"/>
+            <w:tcW w:type="dxa" w:w="1512"/>
           </w:tcPr>
           <w:p>
             <w:pPr>
@@ -2081,7 +2058,7 @@
         </w:tc>
         <w:tc>
           <w:tcPr>
-            <w:tcW w:type="dxa" w:w="1296"/>
+            <w:tcW w:type="dxa" w:w="1512"/>
           </w:tcPr>
           <w:p>
             <w:pPr>
@@ -2103,7 +2080,7 @@
         </w:tc>
         <w:tc>
           <w:tcPr>
-            <w:tcW w:type="dxa" w:w="1296"/>
+            <w:tcW w:type="dxa" w:w="1512"/>
           </w:tcPr>
           <w:p>
             <w:pPr>
@@ -2120,28 +2097,6 @@
                 <w:sz w:val="20"/>
               </w:rPr>
               <w:t>0,74</w:t>
-            </w:r>
-          </w:p>
-        </w:tc>
-        <w:tc>
-          <w:tcPr>
-            <w:tcW w:type="dxa" w:w="1296"/>
-          </w:tcPr>
-          <w:p>
-            <w:pPr>
-              <w:spacing w:after="0"/>
-            </w:pPr>
-            <w:r>
-              <w:rPr>
-                <w:sz w:val="20"/>
-              </w:rPr>
-            </w:r>
-            <w:r>
-              <w:rPr>
-                <w:i w:val="0"/>
-                <w:sz w:val="20"/>
-              </w:rPr>
-              <w:t>51,97</w:t>
             </w:r>
           </w:p>
         </w:tc>
@@ -2149,7 +2104,7 @@
       <w:tr>
         <w:tc>
           <w:tcPr>
-            <w:tcW w:type="dxa" w:w="1296"/>
+            <w:tcW w:type="dxa" w:w="1512"/>
           </w:tcPr>
           <w:p>
             <w:pPr>
@@ -2171,7 +2126,7 @@
         </w:tc>
         <w:tc>
           <w:tcPr>
-            <w:tcW w:type="dxa" w:w="1296"/>
+            <w:tcW w:type="dxa" w:w="1512"/>
           </w:tcPr>
           <w:p>
             <w:pPr>
@@ -2193,7 +2148,7 @@
         </w:tc>
         <w:tc>
           <w:tcPr>
-            <w:tcW w:type="dxa" w:w="1296"/>
+            <w:tcW w:type="dxa" w:w="1512"/>
           </w:tcPr>
           <w:p>
             <w:pPr>
@@ -2215,7 +2170,7 @@
         </w:tc>
         <w:tc>
           <w:tcPr>
-            <w:tcW w:type="dxa" w:w="1296"/>
+            <w:tcW w:type="dxa" w:w="1512"/>
           </w:tcPr>
           <w:p>
             <w:pPr>
@@ -2237,7 +2192,7 @@
         </w:tc>
         <w:tc>
           <w:tcPr>
-            <w:tcW w:type="dxa" w:w="1296"/>
+            <w:tcW w:type="dxa" w:w="1512"/>
           </w:tcPr>
           <w:p>
             <w:pPr>
@@ -2259,7 +2214,7 @@
         </w:tc>
         <w:tc>
           <w:tcPr>
-            <w:tcW w:type="dxa" w:w="1296"/>
+            <w:tcW w:type="dxa" w:w="1512"/>
           </w:tcPr>
           <w:p>
             <w:pPr>
@@ -2276,28 +2231,6 @@
                 <w:sz w:val="20"/>
               </w:rPr>
               <w:t>0,47</w:t>
-            </w:r>
-          </w:p>
-        </w:tc>
-        <w:tc>
-          <w:tcPr>
-            <w:tcW w:type="dxa" w:w="1296"/>
-          </w:tcPr>
-          <w:p>
-            <w:pPr>
-              <w:spacing w:after="0"/>
-            </w:pPr>
-            <w:r>
-              <w:rPr>
-                <w:sz w:val="20"/>
-              </w:rPr>
-            </w:r>
-            <w:r>
-              <w:rPr>
-                <w:i w:val="0"/>
-                <w:sz w:val="20"/>
-              </w:rPr>
-              <w:t>52,06</w:t>
             </w:r>
           </w:p>
         </w:tc>
@@ -2305,7 +2238,7 @@
       <w:tr>
         <w:tc>
           <w:tcPr>
-            <w:tcW w:type="dxa" w:w="1296"/>
+            <w:tcW w:type="dxa" w:w="1512"/>
           </w:tcPr>
           <w:p>
             <w:pPr>
@@ -2327,7 +2260,7 @@
         </w:tc>
         <w:tc>
           <w:tcPr>
-            <w:tcW w:type="dxa" w:w="1296"/>
+            <w:tcW w:type="dxa" w:w="1512"/>
           </w:tcPr>
           <w:p>
             <w:pPr>
@@ -2349,7 +2282,7 @@
         </w:tc>
         <w:tc>
           <w:tcPr>
-            <w:tcW w:type="dxa" w:w="1296"/>
+            <w:tcW w:type="dxa" w:w="1512"/>
           </w:tcPr>
           <w:p>
             <w:pPr>
@@ -2371,7 +2304,7 @@
         </w:tc>
         <w:tc>
           <w:tcPr>
-            <w:tcW w:type="dxa" w:w="1296"/>
+            <w:tcW w:type="dxa" w:w="1512"/>
           </w:tcPr>
           <w:p>
             <w:pPr>
@@ -2393,7 +2326,7 @@
         </w:tc>
         <w:tc>
           <w:tcPr>
-            <w:tcW w:type="dxa" w:w="1296"/>
+            <w:tcW w:type="dxa" w:w="1512"/>
           </w:tcPr>
           <w:p>
             <w:pPr>
@@ -2415,7 +2348,7 @@
         </w:tc>
         <w:tc>
           <w:tcPr>
-            <w:tcW w:type="dxa" w:w="1296"/>
+            <w:tcW w:type="dxa" w:w="1512"/>
           </w:tcPr>
           <w:p>
             <w:pPr>
@@ -2432,28 +2365,6 @@
                 <w:sz w:val="20"/>
               </w:rPr>
               <w:t>0,36</w:t>
-            </w:r>
-          </w:p>
-        </w:tc>
-        <w:tc>
-          <w:tcPr>
-            <w:tcW w:type="dxa" w:w="1296"/>
-          </w:tcPr>
-          <w:p>
-            <w:pPr>
-              <w:spacing w:after="0"/>
-            </w:pPr>
-            <w:r>
-              <w:rPr>
-                <w:sz w:val="20"/>
-              </w:rPr>
-            </w:r>
-            <w:r>
-              <w:rPr>
-                <w:i w:val="0"/>
-                <w:sz w:val="20"/>
-              </w:rPr>
-              <w:t>51,76</w:t>
             </w:r>
           </w:p>
         </w:tc>
@@ -2461,7 +2372,7 @@
       <w:tr>
         <w:tc>
           <w:tcPr>
-            <w:tcW w:type="dxa" w:w="1296"/>
+            <w:tcW w:type="dxa" w:w="1512"/>
           </w:tcPr>
           <w:p>
             <w:pPr>
@@ -2483,7 +2394,7 @@
         </w:tc>
         <w:tc>
           <w:tcPr>
-            <w:tcW w:type="dxa" w:w="1296"/>
+            <w:tcW w:type="dxa" w:w="1512"/>
           </w:tcPr>
           <w:p>
             <w:pPr>
@@ -2505,7 +2416,7 @@
         </w:tc>
         <w:tc>
           <w:tcPr>
-            <w:tcW w:type="dxa" w:w="1296"/>
+            <w:tcW w:type="dxa" w:w="1512"/>
           </w:tcPr>
           <w:p>
             <w:pPr>
@@ -2527,7 +2438,7 @@
         </w:tc>
         <w:tc>
           <w:tcPr>
-            <w:tcW w:type="dxa" w:w="1296"/>
+            <w:tcW w:type="dxa" w:w="1512"/>
           </w:tcPr>
           <w:p>
             <w:pPr>
@@ -2549,7 +2460,7 @@
         </w:tc>
         <w:tc>
           <w:tcPr>
-            <w:tcW w:type="dxa" w:w="1296"/>
+            <w:tcW w:type="dxa" w:w="1512"/>
           </w:tcPr>
           <w:p>
             <w:pPr>
@@ -2571,7 +2482,7 @@
         </w:tc>
         <w:tc>
           <w:tcPr>
-            <w:tcW w:type="dxa" w:w="1296"/>
+            <w:tcW w:type="dxa" w:w="1512"/>
           </w:tcPr>
           <w:p>
             <w:pPr>
@@ -2588,28 +2499,6 @@
                 <w:sz w:val="20"/>
               </w:rPr>
               <w:t>0,42</w:t>
-            </w:r>
-          </w:p>
-        </w:tc>
-        <w:tc>
-          <w:tcPr>
-            <w:tcW w:type="dxa" w:w="1296"/>
-          </w:tcPr>
-          <w:p>
-            <w:pPr>
-              <w:spacing w:after="0"/>
-            </w:pPr>
-            <w:r>
-              <w:rPr>
-                <w:sz w:val="20"/>
-              </w:rPr>
-            </w:r>
-            <w:r>
-              <w:rPr>
-                <w:i w:val="0"/>
-                <w:sz w:val="20"/>
-              </w:rPr>
-              <w:t>51,92</w:t>
             </w:r>
           </w:p>
         </w:tc>
@@ -2617,7 +2506,7 @@
       <w:tr>
         <w:tc>
           <w:tcPr>
-            <w:tcW w:type="dxa" w:w="1296"/>
+            <w:tcW w:type="dxa" w:w="1512"/>
           </w:tcPr>
           <w:p>
             <w:pPr>
@@ -2639,7 +2528,7 @@
         </w:tc>
         <w:tc>
           <w:tcPr>
-            <w:tcW w:type="dxa" w:w="1296"/>
+            <w:tcW w:type="dxa" w:w="1512"/>
           </w:tcPr>
           <w:p>
             <w:pPr>
@@ -2661,7 +2550,7 @@
         </w:tc>
         <w:tc>
           <w:tcPr>
-            <w:tcW w:type="dxa" w:w="1296"/>
+            <w:tcW w:type="dxa" w:w="1512"/>
           </w:tcPr>
           <w:p>
             <w:pPr>
@@ -2683,7 +2572,7 @@
         </w:tc>
         <w:tc>
           <w:tcPr>
-            <w:tcW w:type="dxa" w:w="1296"/>
+            <w:tcW w:type="dxa" w:w="1512"/>
           </w:tcPr>
           <w:p>
             <w:pPr>
@@ -2705,7 +2594,7 @@
         </w:tc>
         <w:tc>
           <w:tcPr>
-            <w:tcW w:type="dxa" w:w="1296"/>
+            <w:tcW w:type="dxa" w:w="1512"/>
           </w:tcPr>
           <w:p>
             <w:pPr>
@@ -2727,7 +2616,7 @@
         </w:tc>
         <w:tc>
           <w:tcPr>
-            <w:tcW w:type="dxa" w:w="1296"/>
+            <w:tcW w:type="dxa" w:w="1512"/>
           </w:tcPr>
           <w:p>
             <w:pPr>
@@ -2744,28 +2633,6 @@
                 <w:sz w:val="20"/>
               </w:rPr>
               <w:t>0,26</w:t>
-            </w:r>
-          </w:p>
-        </w:tc>
-        <w:tc>
-          <w:tcPr>
-            <w:tcW w:type="dxa" w:w="1296"/>
-          </w:tcPr>
-          <w:p>
-            <w:pPr>
-              <w:spacing w:after="0"/>
-            </w:pPr>
-            <w:r>
-              <w:rPr>
-                <w:sz w:val="20"/>
-              </w:rPr>
-            </w:r>
-            <w:r>
-              <w:rPr>
-                <w:i w:val="0"/>
-                <w:sz w:val="20"/>
-              </w:rPr>
-              <w:t>49,64</w:t>
             </w:r>
           </w:p>
         </w:tc>
@@ -2802,7 +2669,7 @@
         <w:rPr>
           <w:i w:val="0"/>
         </w:rPr>
-        <w:t>Všetky výsledky sú len o 3,6 až 4,6 bodu nad úrovňou 83,49 %. Do tabuľky som preto pridal aj F1 skóre pre triedu nákup, ktoré je pri väčšine rozdelení okolo 52 %.</w:t>
+        <w:t>Všetky výsledky sú len o 3,6 až 4,6 bodu nad úrovňou 83,49 %. Prečo je to tak, vidno na konfúznej matici v časti 1.9.</w:t>
       </w:r>
     </w:p>
     <w:p>
@@ -2947,17 +2814,16 @@
         <w:tblLook w:firstColumn="1" w:firstRow="1" w:lastColumn="0" w:lastRow="0" w:noHBand="0" w:noVBand="1" w:val="04A0"/>
       </w:tblPr>
       <w:tblGrid>
-        <w:gridCol w:w="1512"/>
-        <w:gridCol w:w="1512"/>
-        <w:gridCol w:w="1512"/>
-        <w:gridCol w:w="1512"/>
-        <w:gridCol w:w="1512"/>
-        <w:gridCol w:w="1512"/>
+        <w:gridCol w:w="1814"/>
+        <w:gridCol w:w="1814"/>
+        <w:gridCol w:w="1814"/>
+        <w:gridCol w:w="1814"/>
+        <w:gridCol w:w="1814"/>
       </w:tblGrid>
       <w:tr>
         <w:tc>
           <w:tcPr>
-            <w:tcW w:type="dxa" w:w="1512"/>
+            <w:tcW w:type="dxa" w:w="1814"/>
           </w:tcPr>
           <w:p>
             <w:pPr>
@@ -2979,7 +2845,7 @@
         </w:tc>
         <w:tc>
           <w:tcPr>
-            <w:tcW w:type="dxa" w:w="1512"/>
+            <w:tcW w:type="dxa" w:w="1814"/>
           </w:tcPr>
           <w:p>
             <w:pPr>
@@ -3001,7 +2867,7 @@
         </w:tc>
         <w:tc>
           <w:tcPr>
-            <w:tcW w:type="dxa" w:w="1512"/>
+            <w:tcW w:type="dxa" w:w="1814"/>
           </w:tcPr>
           <w:p>
             <w:pPr>
@@ -3023,7 +2889,7 @@
         </w:tc>
         <w:tc>
           <w:tcPr>
-            <w:tcW w:type="dxa" w:w="1512"/>
+            <w:tcW w:type="dxa" w:w="1814"/>
           </w:tcPr>
           <w:p>
             <w:pPr>
@@ -3045,7 +2911,7 @@
         </w:tc>
         <w:tc>
           <w:tcPr>
-            <w:tcW w:type="dxa" w:w="1512"/>
+            <w:tcW w:type="dxa" w:w="1814"/>
           </w:tcPr>
           <w:p>
             <w:pPr>
@@ -3062,28 +2928,6 @@
                 <w:sz w:val="20"/>
               </w:rPr>
               <w:t>Test (%)</w:t>
-            </w:r>
-          </w:p>
-        </w:tc>
-        <w:tc>
-          <w:tcPr>
-            <w:tcW w:type="dxa" w:w="1512"/>
-          </w:tcPr>
-          <w:p>
-            <w:pPr>
-              <w:spacing w:after="0"/>
-            </w:pPr>
-            <w:r>
-              <w:rPr>
-                <w:sz w:val="20"/>
-              </w:rPr>
-            </w:r>
-            <w:r>
-              <w:rPr>
-                <w:b/>
-                <w:sz w:val="20"/>
-              </w:rPr>
-              <w:t>F1 test (%)</w:t>
             </w:r>
           </w:p>
         </w:tc>
@@ -3091,7 +2935,7 @@
       <w:tr>
         <w:tc>
           <w:tcPr>
-            <w:tcW w:type="dxa" w:w="1512"/>
+            <w:tcW w:type="dxa" w:w="1814"/>
           </w:tcPr>
           <w:p>
             <w:pPr>
@@ -3113,7 +2957,7 @@
         </w:tc>
         <w:tc>
           <w:tcPr>
-            <w:tcW w:type="dxa" w:w="1512"/>
+            <w:tcW w:type="dxa" w:w="1814"/>
           </w:tcPr>
           <w:p>
             <w:pPr>
@@ -3135,7 +2979,7 @@
         </w:tc>
         <w:tc>
           <w:tcPr>
-            <w:tcW w:type="dxa" w:w="1512"/>
+            <w:tcW w:type="dxa" w:w="1814"/>
           </w:tcPr>
           <w:p>
             <w:pPr>
@@ -3157,7 +3001,7 @@
         </w:tc>
         <w:tc>
           <w:tcPr>
-            <w:tcW w:type="dxa" w:w="1512"/>
+            <w:tcW w:type="dxa" w:w="1814"/>
           </w:tcPr>
           <w:p>
             <w:pPr>
@@ -3179,7 +3023,7 @@
         </w:tc>
         <w:tc>
           <w:tcPr>
-            <w:tcW w:type="dxa" w:w="1512"/>
+            <w:tcW w:type="dxa" w:w="1814"/>
           </w:tcPr>
           <w:p>
             <w:pPr>
@@ -3196,28 +3040,6 @@
                 <w:sz w:val="20"/>
               </w:rPr>
               <w:t>87,55</w:t>
-            </w:r>
-          </w:p>
-        </w:tc>
-        <w:tc>
-          <w:tcPr>
-            <w:tcW w:type="dxa" w:w="1512"/>
-          </w:tcPr>
-          <w:p>
-            <w:pPr>
-              <w:spacing w:after="0"/>
-            </w:pPr>
-            <w:r>
-              <w:rPr>
-                <w:sz w:val="20"/>
-              </w:rPr>
-            </w:r>
-            <w:r>
-              <w:rPr>
-                <w:i w:val="0"/>
-                <w:sz w:val="20"/>
-              </w:rPr>
-              <w:t>52,06</w:t>
             </w:r>
           </w:p>
         </w:tc>
@@ -3225,7 +3047,7 @@
       <w:tr>
         <w:tc>
           <w:tcPr>
-            <w:tcW w:type="dxa" w:w="1512"/>
+            <w:tcW w:type="dxa" w:w="1814"/>
           </w:tcPr>
           <w:p>
             <w:pPr>
@@ -3247,7 +3069,7 @@
         </w:tc>
         <w:tc>
           <w:tcPr>
-            <w:tcW w:type="dxa" w:w="1512"/>
+            <w:tcW w:type="dxa" w:w="1814"/>
           </w:tcPr>
           <w:p>
             <w:pPr>
@@ -3269,7 +3091,7 @@
         </w:tc>
         <w:tc>
           <w:tcPr>
-            <w:tcW w:type="dxa" w:w="1512"/>
+            <w:tcW w:type="dxa" w:w="1814"/>
           </w:tcPr>
           <w:p>
             <w:pPr>
@@ -3291,7 +3113,7 @@
         </w:tc>
         <w:tc>
           <w:tcPr>
-            <w:tcW w:type="dxa" w:w="1512"/>
+            <w:tcW w:type="dxa" w:w="1814"/>
           </w:tcPr>
           <w:p>
             <w:pPr>
@@ -3313,7 +3135,7 @@
         </w:tc>
         <w:tc>
           <w:tcPr>
-            <w:tcW w:type="dxa" w:w="1512"/>
+            <w:tcW w:type="dxa" w:w="1814"/>
           </w:tcPr>
           <w:p>
             <w:pPr>
@@ -3330,28 +3152,6 @@
                 <w:sz w:val="20"/>
               </w:rPr>
               <w:t>88,67</w:t>
-            </w:r>
-          </w:p>
-        </w:tc>
-        <w:tc>
-          <w:tcPr>
-            <w:tcW w:type="dxa" w:w="1512"/>
-          </w:tcPr>
-          <w:p>
-            <w:pPr>
-              <w:spacing w:after="0"/>
-            </w:pPr>
-            <w:r>
-              <w:rPr>
-                <w:sz w:val="20"/>
-              </w:rPr>
-            </w:r>
-            <w:r>
-              <w:rPr>
-                <w:i w:val="0"/>
-                <w:sz w:val="20"/>
-              </w:rPr>
-              <w:t>63,80</w:t>
             </w:r>
           </w:p>
         </w:tc>
@@ -3359,7 +3159,7 @@
       <w:tr>
         <w:tc>
           <w:tcPr>
-            <w:tcW w:type="dxa" w:w="1512"/>
+            <w:tcW w:type="dxa" w:w="1814"/>
           </w:tcPr>
           <w:p>
             <w:pPr>
@@ -3381,7 +3181,7 @@
         </w:tc>
         <w:tc>
           <w:tcPr>
-            <w:tcW w:type="dxa" w:w="1512"/>
+            <w:tcW w:type="dxa" w:w="1814"/>
           </w:tcPr>
           <w:p>
             <w:pPr>
@@ -3403,7 +3203,7 @@
         </w:tc>
         <w:tc>
           <w:tcPr>
-            <w:tcW w:type="dxa" w:w="1512"/>
+            <w:tcW w:type="dxa" w:w="1814"/>
           </w:tcPr>
           <w:p>
             <w:pPr>
@@ -3425,7 +3225,7 @@
         </w:tc>
         <w:tc>
           <w:tcPr>
-            <w:tcW w:type="dxa" w:w="1512"/>
+            <w:tcW w:type="dxa" w:w="1814"/>
           </w:tcPr>
           <w:p>
             <w:pPr>
@@ -3447,7 +3247,7 @@
         </w:tc>
         <w:tc>
           <w:tcPr>
-            <w:tcW w:type="dxa" w:w="1512"/>
+            <w:tcW w:type="dxa" w:w="1814"/>
           </w:tcPr>
           <w:p>
             <w:pPr>
@@ -3464,28 +3264,6 @@
                 <w:sz w:val="20"/>
               </w:rPr>
               <w:t>87,96</w:t>
-            </w:r>
-          </w:p>
-        </w:tc>
-        <w:tc>
-          <w:tcPr>
-            <w:tcW w:type="dxa" w:w="1512"/>
-          </w:tcPr>
-          <w:p>
-            <w:pPr>
-              <w:spacing w:after="0"/>
-            </w:pPr>
-            <w:r>
-              <w:rPr>
-                <w:sz w:val="20"/>
-              </w:rPr>
-            </w:r>
-            <w:r>
-              <w:rPr>
-                <w:i w:val="0"/>
-                <w:sz w:val="20"/>
-              </w:rPr>
-              <w:t>54,16</w:t>
             </w:r>
           </w:p>
         </w:tc>
@@ -3500,7 +3278,7 @@
         <w:rPr>
           <w:i w:val="0"/>
         </w:rPr>
-        <w:t>Variant B vyšiel najlepšie, F1 je vyššie skoro o 12 bodov. Tomuto výsledku ale neverím. Variant B maže 1 471 riadkov a všetky sú bez nákupu, lebo chýbajúce hodnoty sú len v takých riadkoch. Podiel nákupov tým stúpne na 18,9 %. Model tak dostal ľahšiu úlohu a testuje sa na iných dátach než vo variante A, čísla sa preto nedajú priamo porovnať.</w:t>
+        <w:t>Variant B vyšiel najlepšie, na testovacej množine má 88,67 %. Tomuto výsledku ale neverím. Variant B maže 1 471 riadkov a všetky sú bez nákupu, lebo chýbajúce hodnoty sú len v takých riadkoch. Podiel nákupov tým stúpne na 18,9 %. Model tak dostal ľahšiu úlohu a testuje sa na iných dátach než vo variante A, čísla sa preto nedajú priamo porovnať.</w:t>
       </w:r>
     </w:p>
     <w:p>

</xml_diff>

<commit_message>
bold plot titles and fix table layout in documentation
</commit_message>
<xml_diff>
--- a/tasks/task1/documentation.docx
+++ b/tasks/task1/documentation.docx
@@ -16,6 +16,7 @@
     </w:p>
     <w:p>
       <w:pPr>
+        <w:keepNext w:val="0"/>
         <w:jc w:val="center"/>
       </w:pPr>
       <w:r>
@@ -27,6 +28,7 @@
     </w:p>
     <w:p>
       <w:pPr>
+        <w:keepNext w:val="0"/>
         <w:jc w:val="center"/>
       </w:pPr>
       <w:r>
@@ -264,6 +266,7 @@
     </w:p>
     <w:p>
       <w:pPr>
+        <w:keepNext w:val="0"/>
         <w:jc w:val="center"/>
       </w:pPr>
       <w:r>
@@ -369,6 +372,7 @@
     </w:p>
     <w:p>
       <w:pPr>
+        <w:keepNext/>
         <w:jc w:val="center"/>
       </w:pPr>
       <w:r>
@@ -390,12 +394,16 @@
         <w:gridCol w:w="4536"/>
       </w:tblGrid>
       <w:tr>
+        <w:trPr>
+          <w:cantSplit/>
+        </w:trPr>
         <w:tc>
           <w:tcPr>
             <w:tcW w:type="dxa" w:w="4536"/>
           </w:tcPr>
           <w:p>
             <w:pPr>
+              <w:keepNext/>
               <w:spacing w:after="0"/>
             </w:pPr>
             <w:r>
@@ -418,6 +426,7 @@
           </w:tcPr>
           <w:p>
             <w:pPr>
+              <w:keepNext/>
               <w:spacing w:after="0"/>
             </w:pPr>
             <w:r>
@@ -436,12 +445,16 @@
         </w:tc>
       </w:tr>
       <w:tr>
+        <w:trPr>
+          <w:cantSplit/>
+        </w:trPr>
         <w:tc>
           <w:tcPr>
             <w:tcW w:type="dxa" w:w="4536"/>
           </w:tcPr>
           <w:p>
             <w:pPr>
+              <w:keepNext/>
               <w:spacing w:after="0"/>
             </w:pPr>
             <w:r>
@@ -477,6 +490,7 @@
           </w:tcPr>
           <w:p>
             <w:pPr>
+              <w:keepNext/>
               <w:spacing w:after="0"/>
             </w:pPr>
             <w:r>
@@ -495,12 +509,16 @@
         </w:tc>
       </w:tr>
       <w:tr>
+        <w:trPr>
+          <w:cantSplit/>
+        </w:trPr>
         <w:tc>
           <w:tcPr>
             <w:tcW w:type="dxa" w:w="4536"/>
           </w:tcPr>
           <w:p>
             <w:pPr>
+              <w:keepNext/>
               <w:spacing w:after="0"/>
             </w:pPr>
             <w:r>
@@ -536,6 +554,7 @@
           </w:tcPr>
           <w:p>
             <w:pPr>
+              <w:keepNext/>
               <w:spacing w:after="0"/>
             </w:pPr>
             <w:r>
@@ -554,12 +573,16 @@
         </w:tc>
       </w:tr>
       <w:tr>
+        <w:trPr>
+          <w:cantSplit/>
+        </w:trPr>
         <w:tc>
           <w:tcPr>
             <w:tcW w:type="dxa" w:w="4536"/>
           </w:tcPr>
           <w:p>
             <w:pPr>
+              <w:keepNext/>
               <w:spacing w:after="0"/>
             </w:pPr>
             <w:r>
@@ -595,6 +618,7 @@
           </w:tcPr>
           <w:p>
             <w:pPr>
+              <w:keepNext/>
               <w:spacing w:after="0"/>
             </w:pPr>
             <w:r>
@@ -613,12 +637,16 @@
         </w:tc>
       </w:tr>
       <w:tr>
+        <w:trPr>
+          <w:cantSplit/>
+        </w:trPr>
         <w:tc>
           <w:tcPr>
             <w:tcW w:type="dxa" w:w="4536"/>
           </w:tcPr>
           <w:p>
             <w:pPr>
+              <w:keepNext/>
               <w:spacing w:after="0"/>
             </w:pPr>
             <w:r>
@@ -654,6 +682,7 @@
           </w:tcPr>
           <w:p>
             <w:pPr>
+              <w:keepNext/>
               <w:spacing w:after="0"/>
             </w:pPr>
             <w:r>
@@ -672,12 +701,16 @@
         </w:tc>
       </w:tr>
       <w:tr>
+        <w:trPr>
+          <w:cantSplit/>
+        </w:trPr>
         <w:tc>
           <w:tcPr>
             <w:tcW w:type="dxa" w:w="4536"/>
           </w:tcPr>
           <w:p>
             <w:pPr>
+              <w:keepNext/>
               <w:spacing w:after="0"/>
             </w:pPr>
             <w:r>
@@ -713,6 +746,7 @@
           </w:tcPr>
           <w:p>
             <w:pPr>
+              <w:keepNext/>
               <w:spacing w:after="0"/>
             </w:pPr>
             <w:r>
@@ -731,12 +765,16 @@
         </w:tc>
       </w:tr>
       <w:tr>
+        <w:trPr>
+          <w:cantSplit/>
+        </w:trPr>
         <w:tc>
           <w:tcPr>
             <w:tcW w:type="dxa" w:w="4536"/>
           </w:tcPr>
           <w:p>
             <w:pPr>
+              <w:keepNext/>
               <w:spacing w:after="0"/>
             </w:pPr>
             <w:r>
@@ -772,6 +810,7 @@
           </w:tcPr>
           <w:p>
             <w:pPr>
+              <w:keepNext/>
               <w:spacing w:after="0"/>
             </w:pPr>
             <w:r>
@@ -790,12 +829,16 @@
         </w:tc>
       </w:tr>
       <w:tr>
+        <w:trPr>
+          <w:cantSplit/>
+        </w:trPr>
         <w:tc>
           <w:tcPr>
             <w:tcW w:type="dxa" w:w="4536"/>
           </w:tcPr>
           <w:p>
             <w:pPr>
+              <w:keepNext/>
               <w:spacing w:after="0"/>
             </w:pPr>
             <w:r>
@@ -831,6 +874,7 @@
           </w:tcPr>
           <w:p>
             <w:pPr>
+              <w:keepNext/>
               <w:spacing w:after="0"/>
             </w:pPr>
             <w:r>
@@ -849,12 +893,16 @@
         </w:tc>
       </w:tr>
       <w:tr>
+        <w:trPr>
+          <w:cantSplit/>
+        </w:trPr>
         <w:tc>
           <w:tcPr>
             <w:tcW w:type="dxa" w:w="4536"/>
           </w:tcPr>
           <w:p>
             <w:pPr>
+              <w:keepNext w:val="0"/>
               <w:spacing w:after="0"/>
             </w:pPr>
             <w:r>
@@ -877,6 +925,7 @@
           </w:tcPr>
           <w:p>
             <w:pPr>
+              <w:keepNext w:val="0"/>
               <w:spacing w:after="0"/>
             </w:pPr>
             <w:r>
@@ -939,6 +988,7 @@
     </w:p>
     <w:p>
       <w:pPr>
+        <w:keepNext/>
         <w:jc w:val="center"/>
       </w:pPr>
       <w:r>
@@ -961,12 +1011,16 @@
         <w:gridCol w:w="3024"/>
       </w:tblGrid>
       <w:tr>
+        <w:trPr>
+          <w:cantSplit/>
+        </w:trPr>
         <w:tc>
           <w:tcPr>
             <w:tcW w:type="dxa" w:w="3024"/>
           </w:tcPr>
           <w:p>
             <w:pPr>
+              <w:keepNext/>
               <w:spacing w:after="0"/>
             </w:pPr>
             <w:r>
@@ -989,6 +1043,7 @@
           </w:tcPr>
           <w:p>
             <w:pPr>
+              <w:keepNext/>
               <w:spacing w:after="0"/>
             </w:pPr>
             <w:r>
@@ -1011,6 +1066,7 @@
           </w:tcPr>
           <w:p>
             <w:pPr>
+              <w:keepNext/>
               <w:spacing w:after="0"/>
             </w:pPr>
             <w:r>
@@ -1029,12 +1085,16 @@
         </w:tc>
       </w:tr>
       <w:tr>
+        <w:trPr>
+          <w:cantSplit/>
+        </w:trPr>
         <w:tc>
           <w:tcPr>
             <w:tcW w:type="dxa" w:w="3024"/>
           </w:tcPr>
           <w:p>
             <w:pPr>
+              <w:keepNext/>
               <w:spacing w:after="0"/>
             </w:pPr>
             <w:r>
@@ -1069,6 +1129,7 @@
           </w:tcPr>
           <w:p>
             <w:pPr>
+              <w:keepNext/>
               <w:spacing w:after="0"/>
             </w:pPr>
             <w:r>
@@ -1091,6 +1152,7 @@
           </w:tcPr>
           <w:p>
             <w:pPr>
+              <w:keepNext/>
               <w:spacing w:after="0"/>
             </w:pPr>
             <w:r>
@@ -1109,12 +1171,16 @@
         </w:tc>
       </w:tr>
       <w:tr>
+        <w:trPr>
+          <w:cantSplit/>
+        </w:trPr>
         <w:tc>
           <w:tcPr>
             <w:tcW w:type="dxa" w:w="3024"/>
           </w:tcPr>
           <w:p>
             <w:pPr>
+              <w:keepNext/>
               <w:spacing w:after="0"/>
             </w:pPr>
             <w:r>
@@ -1149,6 +1215,7 @@
           </w:tcPr>
           <w:p>
             <w:pPr>
+              <w:keepNext/>
               <w:spacing w:after="0"/>
             </w:pPr>
             <w:r>
@@ -1171,6 +1238,7 @@
           </w:tcPr>
           <w:p>
             <w:pPr>
+              <w:keepNext/>
               <w:spacing w:after="0"/>
             </w:pPr>
             <w:r>
@@ -1189,12 +1257,16 @@
         </w:tc>
       </w:tr>
       <w:tr>
+        <w:trPr>
+          <w:cantSplit/>
+        </w:trPr>
         <w:tc>
           <w:tcPr>
             <w:tcW w:type="dxa" w:w="3024"/>
           </w:tcPr>
           <w:p>
             <w:pPr>
+              <w:keepNext w:val="0"/>
               <w:spacing w:after="0"/>
             </w:pPr>
             <w:r>
@@ -1229,6 +1301,7 @@
           </w:tcPr>
           <w:p>
             <w:pPr>
+              <w:keepNext w:val="0"/>
               <w:spacing w:after="0"/>
             </w:pPr>
             <w:r>
@@ -1251,6 +1324,7 @@
           </w:tcPr>
           <w:p>
             <w:pPr>
+              <w:keepNext w:val="0"/>
               <w:spacing w:after="0"/>
             </w:pPr>
             <w:r>
@@ -1675,6 +1749,7 @@
     </w:p>
     <w:p>
       <w:pPr>
+        <w:keepNext/>
         <w:jc w:val="center"/>
       </w:pPr>
       <w:r>
@@ -1700,12 +1775,16 @@
         <w:gridCol w:w="1512"/>
       </w:tblGrid>
       <w:tr>
+        <w:trPr>
+          <w:cantSplit/>
+        </w:trPr>
         <w:tc>
           <w:tcPr>
             <w:tcW w:type="dxa" w:w="1512"/>
           </w:tcPr>
           <w:p>
             <w:pPr>
+              <w:keepNext/>
               <w:spacing w:after="0"/>
             </w:pPr>
             <w:r>
@@ -1728,6 +1807,7 @@
           </w:tcPr>
           <w:p>
             <w:pPr>
+              <w:keepNext/>
               <w:spacing w:after="0"/>
             </w:pPr>
             <w:r>
@@ -1750,6 +1830,7 @@
           </w:tcPr>
           <w:p>
             <w:pPr>
+              <w:keepNext/>
               <w:spacing w:after="0"/>
             </w:pPr>
             <w:r>
@@ -1772,6 +1853,7 @@
           </w:tcPr>
           <w:p>
             <w:pPr>
+              <w:keepNext/>
               <w:spacing w:after="0"/>
             </w:pPr>
             <w:r>
@@ -1794,6 +1876,7 @@
           </w:tcPr>
           <w:p>
             <w:pPr>
+              <w:keepNext/>
               <w:spacing w:after="0"/>
             </w:pPr>
             <w:r>
@@ -1816,6 +1899,7 @@
           </w:tcPr>
           <w:p>
             <w:pPr>
+              <w:keepNext/>
               <w:spacing w:after="0"/>
             </w:pPr>
             <w:r>
@@ -1834,12 +1918,16 @@
         </w:tc>
       </w:tr>
       <w:tr>
+        <w:trPr>
+          <w:cantSplit/>
+        </w:trPr>
         <w:tc>
           <w:tcPr>
             <w:tcW w:type="dxa" w:w="1512"/>
           </w:tcPr>
           <w:p>
             <w:pPr>
+              <w:keepNext/>
               <w:spacing w:after="0"/>
             </w:pPr>
             <w:r>
@@ -1862,6 +1950,7 @@
           </w:tcPr>
           <w:p>
             <w:pPr>
+              <w:keepNext/>
               <w:spacing w:after="0"/>
             </w:pPr>
             <w:r>
@@ -1884,6 +1973,7 @@
           </w:tcPr>
           <w:p>
             <w:pPr>
+              <w:keepNext/>
               <w:spacing w:after="0"/>
             </w:pPr>
             <w:r>
@@ -1906,6 +1996,7 @@
           </w:tcPr>
           <w:p>
             <w:pPr>
+              <w:keepNext/>
               <w:spacing w:after="0"/>
             </w:pPr>
             <w:r>
@@ -1928,6 +2019,7 @@
           </w:tcPr>
           <w:p>
             <w:pPr>
+              <w:keepNext/>
               <w:spacing w:after="0"/>
             </w:pPr>
             <w:r>
@@ -1950,6 +2042,7 @@
           </w:tcPr>
           <w:p>
             <w:pPr>
+              <w:keepNext/>
               <w:spacing w:after="0"/>
             </w:pPr>
             <w:r>
@@ -1968,12 +2061,16 @@
         </w:tc>
       </w:tr>
       <w:tr>
+        <w:trPr>
+          <w:cantSplit/>
+        </w:trPr>
         <w:tc>
           <w:tcPr>
             <w:tcW w:type="dxa" w:w="1512"/>
           </w:tcPr>
           <w:p>
             <w:pPr>
+              <w:keepNext/>
               <w:spacing w:after="0"/>
             </w:pPr>
             <w:r>
@@ -1996,6 +2093,7 @@
           </w:tcPr>
           <w:p>
             <w:pPr>
+              <w:keepNext/>
               <w:spacing w:after="0"/>
             </w:pPr>
             <w:r>
@@ -2018,6 +2116,7 @@
           </w:tcPr>
           <w:p>
             <w:pPr>
+              <w:keepNext/>
               <w:spacing w:after="0"/>
             </w:pPr>
             <w:r>
@@ -2040,6 +2139,7 @@
           </w:tcPr>
           <w:p>
             <w:pPr>
+              <w:keepNext/>
               <w:spacing w:after="0"/>
             </w:pPr>
             <w:r>
@@ -2062,6 +2162,7 @@
           </w:tcPr>
           <w:p>
             <w:pPr>
+              <w:keepNext/>
               <w:spacing w:after="0"/>
             </w:pPr>
             <w:r>
@@ -2084,6 +2185,7 @@
           </w:tcPr>
           <w:p>
             <w:pPr>
+              <w:keepNext/>
               <w:spacing w:after="0"/>
             </w:pPr>
             <w:r>
@@ -2102,12 +2204,16 @@
         </w:tc>
       </w:tr>
       <w:tr>
+        <w:trPr>
+          <w:cantSplit/>
+        </w:trPr>
         <w:tc>
           <w:tcPr>
             <w:tcW w:type="dxa" w:w="1512"/>
           </w:tcPr>
           <w:p>
             <w:pPr>
+              <w:keepNext/>
               <w:spacing w:after="0"/>
             </w:pPr>
             <w:r>
@@ -2130,6 +2236,7 @@
           </w:tcPr>
           <w:p>
             <w:pPr>
+              <w:keepNext/>
               <w:spacing w:after="0"/>
             </w:pPr>
             <w:r>
@@ -2152,6 +2259,7 @@
           </w:tcPr>
           <w:p>
             <w:pPr>
+              <w:keepNext/>
               <w:spacing w:after="0"/>
             </w:pPr>
             <w:r>
@@ -2174,6 +2282,7 @@
           </w:tcPr>
           <w:p>
             <w:pPr>
+              <w:keepNext/>
               <w:spacing w:after="0"/>
             </w:pPr>
             <w:r>
@@ -2196,6 +2305,7 @@
           </w:tcPr>
           <w:p>
             <w:pPr>
+              <w:keepNext/>
               <w:spacing w:after="0"/>
             </w:pPr>
             <w:r>
@@ -2218,6 +2328,7 @@
           </w:tcPr>
           <w:p>
             <w:pPr>
+              <w:keepNext/>
               <w:spacing w:after="0"/>
             </w:pPr>
             <w:r>
@@ -2236,12 +2347,16 @@
         </w:tc>
       </w:tr>
       <w:tr>
+        <w:trPr>
+          <w:cantSplit/>
+        </w:trPr>
         <w:tc>
           <w:tcPr>
             <w:tcW w:type="dxa" w:w="1512"/>
           </w:tcPr>
           <w:p>
             <w:pPr>
+              <w:keepNext/>
               <w:spacing w:after="0"/>
             </w:pPr>
             <w:r>
@@ -2264,6 +2379,7 @@
           </w:tcPr>
           <w:p>
             <w:pPr>
+              <w:keepNext/>
               <w:spacing w:after="0"/>
             </w:pPr>
             <w:r>
@@ -2286,6 +2402,7 @@
           </w:tcPr>
           <w:p>
             <w:pPr>
+              <w:keepNext/>
               <w:spacing w:after="0"/>
             </w:pPr>
             <w:r>
@@ -2308,6 +2425,7 @@
           </w:tcPr>
           <w:p>
             <w:pPr>
+              <w:keepNext/>
               <w:spacing w:after="0"/>
             </w:pPr>
             <w:r>
@@ -2330,6 +2448,7 @@
           </w:tcPr>
           <w:p>
             <w:pPr>
+              <w:keepNext/>
               <w:spacing w:after="0"/>
             </w:pPr>
             <w:r>
@@ -2352,6 +2471,7 @@
           </w:tcPr>
           <w:p>
             <w:pPr>
+              <w:keepNext/>
               <w:spacing w:after="0"/>
             </w:pPr>
             <w:r>
@@ -2370,12 +2490,16 @@
         </w:tc>
       </w:tr>
       <w:tr>
+        <w:trPr>
+          <w:cantSplit/>
+        </w:trPr>
         <w:tc>
           <w:tcPr>
             <w:tcW w:type="dxa" w:w="1512"/>
           </w:tcPr>
           <w:p>
             <w:pPr>
+              <w:keepNext/>
               <w:spacing w:after="0"/>
             </w:pPr>
             <w:r>
@@ -2398,6 +2522,7 @@
           </w:tcPr>
           <w:p>
             <w:pPr>
+              <w:keepNext/>
               <w:spacing w:after="0"/>
             </w:pPr>
             <w:r>
@@ -2420,6 +2545,7 @@
           </w:tcPr>
           <w:p>
             <w:pPr>
+              <w:keepNext/>
               <w:spacing w:after="0"/>
             </w:pPr>
             <w:r>
@@ -2442,6 +2568,7 @@
           </w:tcPr>
           <w:p>
             <w:pPr>
+              <w:keepNext/>
               <w:spacing w:after="0"/>
             </w:pPr>
             <w:r>
@@ -2464,6 +2591,7 @@
           </w:tcPr>
           <w:p>
             <w:pPr>
+              <w:keepNext/>
               <w:spacing w:after="0"/>
             </w:pPr>
             <w:r>
@@ -2486,6 +2614,7 @@
           </w:tcPr>
           <w:p>
             <w:pPr>
+              <w:keepNext/>
               <w:spacing w:after="0"/>
             </w:pPr>
             <w:r>
@@ -2504,12 +2633,16 @@
         </w:tc>
       </w:tr>
       <w:tr>
+        <w:trPr>
+          <w:cantSplit/>
+        </w:trPr>
         <w:tc>
           <w:tcPr>
             <w:tcW w:type="dxa" w:w="1512"/>
           </w:tcPr>
           <w:p>
             <w:pPr>
+              <w:keepNext w:val="0"/>
               <w:spacing w:after="0"/>
             </w:pPr>
             <w:r>
@@ -2532,6 +2665,7 @@
           </w:tcPr>
           <w:p>
             <w:pPr>
+              <w:keepNext w:val="0"/>
               <w:spacing w:after="0"/>
             </w:pPr>
             <w:r>
@@ -2554,6 +2688,7 @@
           </w:tcPr>
           <w:p>
             <w:pPr>
+              <w:keepNext w:val="0"/>
               <w:spacing w:after="0"/>
             </w:pPr>
             <w:r>
@@ -2576,6 +2711,7 @@
           </w:tcPr>
           <w:p>
             <w:pPr>
+              <w:keepNext w:val="0"/>
               <w:spacing w:after="0"/>
             </w:pPr>
             <w:r>
@@ -2598,6 +2734,7 @@
           </w:tcPr>
           <w:p>
             <w:pPr>
+              <w:keepNext w:val="0"/>
               <w:spacing w:after="0"/>
             </w:pPr>
             <w:r>
@@ -2620,6 +2757,7 @@
           </w:tcPr>
           <w:p>
             <w:pPr>
+              <w:keepNext w:val="0"/>
               <w:spacing w:after="0"/>
             </w:pPr>
             <w:r>
@@ -2732,6 +2870,7 @@
     </w:p>
     <w:p>
       <w:pPr>
+        <w:keepNext w:val="0"/>
         <w:jc w:val="center"/>
       </w:pPr>
       <w:r>
@@ -2797,6 +2936,7 @@
     </w:p>
     <w:p>
       <w:pPr>
+        <w:keepNext/>
         <w:jc w:val="center"/>
       </w:pPr>
       <w:r>
@@ -2821,12 +2961,16 @@
         <w:gridCol w:w="1814"/>
       </w:tblGrid>
       <w:tr>
+        <w:trPr>
+          <w:cantSplit/>
+        </w:trPr>
         <w:tc>
           <w:tcPr>
             <w:tcW w:type="dxa" w:w="1814"/>
           </w:tcPr>
           <w:p>
             <w:pPr>
+              <w:keepNext/>
               <w:spacing w:after="0"/>
             </w:pPr>
             <w:r>
@@ -2849,6 +2993,7 @@
           </w:tcPr>
           <w:p>
             <w:pPr>
+              <w:keepNext/>
               <w:spacing w:after="0"/>
             </w:pPr>
             <w:r>
@@ -2871,6 +3016,7 @@
           </w:tcPr>
           <w:p>
             <w:pPr>
+              <w:keepNext/>
               <w:spacing w:after="0"/>
             </w:pPr>
             <w:r>
@@ -2893,6 +3039,7 @@
           </w:tcPr>
           <w:p>
             <w:pPr>
+              <w:keepNext/>
               <w:spacing w:after="0"/>
             </w:pPr>
             <w:r>
@@ -2915,6 +3062,7 @@
           </w:tcPr>
           <w:p>
             <w:pPr>
+              <w:keepNext/>
               <w:spacing w:after="0"/>
             </w:pPr>
             <w:r>
@@ -2933,12 +3081,16 @@
         </w:tc>
       </w:tr>
       <w:tr>
+        <w:trPr>
+          <w:cantSplit/>
+        </w:trPr>
         <w:tc>
           <w:tcPr>
             <w:tcW w:type="dxa" w:w="1814"/>
           </w:tcPr>
           <w:p>
             <w:pPr>
+              <w:keepNext/>
               <w:spacing w:after="0"/>
             </w:pPr>
             <w:r>
@@ -2961,6 +3113,7 @@
           </w:tcPr>
           <w:p>
             <w:pPr>
+              <w:keepNext/>
               <w:spacing w:after="0"/>
             </w:pPr>
             <w:r>
@@ -2983,6 +3136,7 @@
           </w:tcPr>
           <w:p>
             <w:pPr>
+              <w:keepNext/>
               <w:spacing w:after="0"/>
             </w:pPr>
             <w:r>
@@ -3005,6 +3159,7 @@
           </w:tcPr>
           <w:p>
             <w:pPr>
+              <w:keepNext/>
               <w:spacing w:after="0"/>
             </w:pPr>
             <w:r>
@@ -3027,6 +3182,7 @@
           </w:tcPr>
           <w:p>
             <w:pPr>
+              <w:keepNext/>
               <w:spacing w:after="0"/>
             </w:pPr>
             <w:r>
@@ -3045,12 +3201,16 @@
         </w:tc>
       </w:tr>
       <w:tr>
+        <w:trPr>
+          <w:cantSplit/>
+        </w:trPr>
         <w:tc>
           <w:tcPr>
             <w:tcW w:type="dxa" w:w="1814"/>
           </w:tcPr>
           <w:p>
             <w:pPr>
+              <w:keepNext/>
               <w:spacing w:after="0"/>
             </w:pPr>
             <w:r>
@@ -3073,6 +3233,7 @@
           </w:tcPr>
           <w:p>
             <w:pPr>
+              <w:keepNext/>
               <w:spacing w:after="0"/>
             </w:pPr>
             <w:r>
@@ -3095,6 +3256,7 @@
           </w:tcPr>
           <w:p>
             <w:pPr>
+              <w:keepNext/>
               <w:spacing w:after="0"/>
             </w:pPr>
             <w:r>
@@ -3117,6 +3279,7 @@
           </w:tcPr>
           <w:p>
             <w:pPr>
+              <w:keepNext/>
               <w:spacing w:after="0"/>
             </w:pPr>
             <w:r>
@@ -3139,6 +3302,7 @@
           </w:tcPr>
           <w:p>
             <w:pPr>
+              <w:keepNext/>
               <w:spacing w:after="0"/>
             </w:pPr>
             <w:r>
@@ -3157,12 +3321,16 @@
         </w:tc>
       </w:tr>
       <w:tr>
+        <w:trPr>
+          <w:cantSplit/>
+        </w:trPr>
         <w:tc>
           <w:tcPr>
             <w:tcW w:type="dxa" w:w="1814"/>
           </w:tcPr>
           <w:p>
             <w:pPr>
+              <w:keepNext w:val="0"/>
               <w:spacing w:after="0"/>
             </w:pPr>
             <w:r>
@@ -3185,6 +3353,7 @@
           </w:tcPr>
           <w:p>
             <w:pPr>
+              <w:keepNext w:val="0"/>
               <w:spacing w:after="0"/>
             </w:pPr>
             <w:r>
@@ -3207,6 +3376,7 @@
           </w:tcPr>
           <w:p>
             <w:pPr>
+              <w:keepNext w:val="0"/>
               <w:spacing w:after="0"/>
             </w:pPr>
             <w:r>
@@ -3229,6 +3399,7 @@
           </w:tcPr>
           <w:p>
             <w:pPr>
+              <w:keepNext w:val="0"/>
               <w:spacing w:after="0"/>
             </w:pPr>
             <w:r>
@@ -3251,6 +3422,7 @@
           </w:tcPr>
           <w:p>
             <w:pPr>
+              <w:keepNext w:val="0"/>
               <w:spacing w:after="0"/>
             </w:pPr>
             <w:r>
@@ -3360,6 +3532,7 @@
     </w:p>
     <w:p>
       <w:pPr>
+        <w:keepNext w:val="0"/>
         <w:jc w:val="center"/>
       </w:pPr>
       <w:r>
@@ -3535,6 +3708,7 @@
     </w:p>
     <w:p>
       <w:pPr>
+        <w:keepNext w:val="0"/>
         <w:jc w:val="center"/>
       </w:pPr>
       <w:r>
@@ -3675,6 +3849,7 @@
     </w:p>
     <w:p>
       <w:pPr>
+        <w:keepNext w:val="0"/>
         <w:jc w:val="center"/>
       </w:pPr>
       <w:r>
@@ -3789,6 +3964,7 @@
     </w:p>
     <w:p>
       <w:pPr>
+        <w:keepNext w:val="0"/>
         <w:jc w:val="center"/>
       </w:pPr>
       <w:r>
@@ -3894,6 +4070,7 @@
     </w:p>
     <w:p>
       <w:pPr>
+        <w:keepNext w:val="0"/>
         <w:jc w:val="center"/>
       </w:pPr>
       <w:r>
@@ -4010,6 +4187,7 @@
     </w:p>
     <w:p>
       <w:pPr>
+        <w:keepNext w:val="0"/>
         <w:jc w:val="center"/>
       </w:pPr>
       <w:r>
@@ -4133,6 +4311,7 @@
     </w:p>
     <w:p>
       <w:pPr>
+        <w:keepNext w:val="0"/>
         <w:jc w:val="center"/>
       </w:pPr>
       <w:r>
@@ -4194,6 +4373,7 @@
     </w:p>
     <w:p>
       <w:pPr>
+        <w:keepNext w:val="0"/>
         <w:jc w:val="center"/>
       </w:pPr>
       <w:r>
@@ -4274,6 +4454,7 @@
     </w:p>
     <w:p>
       <w:pPr>
+        <w:keepNext w:val="0"/>
         <w:jc w:val="center"/>
       </w:pPr>
       <w:r>
@@ -4296,6 +4477,7 @@
     </w:p>
     <w:p>
       <w:pPr>
+        <w:keepNext/>
         <w:jc w:val="center"/>
       </w:pPr>
       <w:r>
@@ -4313,19 +4495,24 @@
         <w:tblLook w:firstColumn="1" w:firstRow="1" w:lastColumn="0" w:lastRow="0" w:noHBand="0" w:noVBand="1" w:val="04A0"/>
       </w:tblPr>
       <w:tblGrid>
-        <w:gridCol w:w="1814"/>
-        <w:gridCol w:w="1814"/>
-        <w:gridCol w:w="1814"/>
-        <w:gridCol w:w="1814"/>
-        <w:gridCol w:w="1814"/>
+        <w:gridCol w:w="1512"/>
+        <w:gridCol w:w="1512"/>
+        <w:gridCol w:w="1512"/>
+        <w:gridCol w:w="1512"/>
+        <w:gridCol w:w="1512"/>
+        <w:gridCol w:w="1512"/>
       </w:tblGrid>
       <w:tr>
+        <w:trPr>
+          <w:cantSplit/>
+        </w:trPr>
         <w:tc>
           <w:tcPr>
-            <w:tcW w:type="dxa" w:w="1814"/>
+            <w:tcW w:type="dxa" w:w="1512"/>
           </w:tcPr>
           <w:p>
             <w:pPr>
+              <w:keepNext/>
               <w:spacing w:after="0"/>
             </w:pPr>
             <w:r>
@@ -4344,10 +4531,11 @@
         </w:tc>
         <w:tc>
           <w:tcPr>
-            <w:tcW w:type="dxa" w:w="1814"/>
+            <w:tcW w:type="dxa" w:w="1512"/>
           </w:tcPr>
           <w:p>
             <w:pPr>
+              <w:keepNext/>
               <w:spacing w:after="0"/>
             </w:pPr>
             <w:r>
@@ -4360,16 +4548,17 @@
                 <w:b/>
                 <w:sz w:val="20"/>
               </w:rPr>
-              <w:t>Epoch</w:t>
+              <w:t>Odtrénovaných epoch</w:t>
             </w:r>
           </w:p>
         </w:tc>
         <w:tc>
           <w:tcPr>
-            <w:tcW w:type="dxa" w:w="1814"/>
+            <w:tcW w:type="dxa" w:w="1512"/>
           </w:tcPr>
           <w:p>
             <w:pPr>
+              <w:keepNext/>
               <w:spacing w:after="0"/>
             </w:pPr>
             <w:r>
@@ -4382,16 +4571,17 @@
                 <w:b/>
                 <w:sz w:val="20"/>
               </w:rPr>
-              <w:t>Train (%)</w:t>
+              <w:t>Váhy z epochy</w:t>
             </w:r>
           </w:p>
         </w:tc>
         <w:tc>
           <w:tcPr>
-            <w:tcW w:type="dxa" w:w="1814"/>
+            <w:tcW w:type="dxa" w:w="1512"/>
           </w:tcPr>
           <w:p>
             <w:pPr>
+              <w:keepNext/>
               <w:spacing w:after="0"/>
             </w:pPr>
             <w:r>
@@ -4404,16 +4594,40 @@
                 <w:b/>
                 <w:sz w:val="20"/>
               </w:rPr>
-              <w:t>Test (%)</w:t>
+              <w:t>Train (%)</w:t>
             </w:r>
           </w:p>
         </w:tc>
         <w:tc>
           <w:tcPr>
-            <w:tcW w:type="dxa" w:w="1814"/>
+            <w:tcW w:type="dxa" w:w="1512"/>
           </w:tcPr>
           <w:p>
             <w:pPr>
+              <w:keepNext/>
+              <w:spacing w:after="0"/>
+            </w:pPr>
+            <w:r>
+              <w:rPr>
+                <w:sz w:val="20"/>
+              </w:rPr>
+            </w:r>
+            <w:r>
+              <w:rPr>
+                <w:b/>
+                <w:sz w:val="20"/>
+              </w:rPr>
+              <w:t>Test (%)</w:t>
+            </w:r>
+          </w:p>
+        </w:tc>
+        <w:tc>
+          <w:tcPr>
+            <w:tcW w:type="dxa" w:w="1512"/>
+          </w:tcPr>
+          <w:p>
+            <w:pPr>
+              <w:keepNext/>
               <w:spacing w:after="0"/>
             </w:pPr>
             <w:r>
@@ -4432,12 +4646,16 @@
         </w:tc>
       </w:tr>
       <w:tr>
+        <w:trPr>
+          <w:cantSplit/>
+        </w:trPr>
         <w:tc>
           <w:tcPr>
-            <w:tcW w:type="dxa" w:w="1814"/>
+            <w:tcW w:type="dxa" w:w="1512"/>
           </w:tcPr>
           <w:p>
             <w:pPr>
+              <w:keepNext/>
               <w:spacing w:after="0"/>
             </w:pPr>
             <w:r>
@@ -4456,10 +4674,11 @@
         </w:tc>
         <w:tc>
           <w:tcPr>
-            <w:tcW w:type="dxa" w:w="1814"/>
+            <w:tcW w:type="dxa" w:w="1512"/>
           </w:tcPr>
           <w:p>
             <w:pPr>
+              <w:keepNext/>
               <w:spacing w:after="0"/>
             </w:pPr>
             <w:r>
@@ -4478,10 +4697,11 @@
         </w:tc>
         <w:tc>
           <w:tcPr>
-            <w:tcW w:type="dxa" w:w="1814"/>
+            <w:tcW w:type="dxa" w:w="1512"/>
           </w:tcPr>
           <w:p>
             <w:pPr>
+              <w:keepNext/>
               <w:spacing w:after="0"/>
             </w:pPr>
             <w:r>
@@ -4494,16 +4714,17 @@
                 <w:i w:val="0"/>
                 <w:sz w:val="20"/>
               </w:rPr>
-              <w:t>99,96</w:t>
+              <w:t>200</w:t>
             </w:r>
           </w:p>
         </w:tc>
         <w:tc>
           <w:tcPr>
-            <w:tcW w:type="dxa" w:w="1814"/>
+            <w:tcW w:type="dxa" w:w="1512"/>
           </w:tcPr>
           <w:p>
             <w:pPr>
+              <w:keepNext/>
               <w:spacing w:after="0"/>
             </w:pPr>
             <w:r>
@@ -4516,16 +4737,40 @@
                 <w:i w:val="0"/>
                 <w:sz w:val="20"/>
               </w:rPr>
-              <w:t>87,72</w:t>
+              <w:t>99,96</w:t>
             </w:r>
           </w:p>
         </w:tc>
         <w:tc>
           <w:tcPr>
-            <w:tcW w:type="dxa" w:w="1814"/>
+            <w:tcW w:type="dxa" w:w="1512"/>
           </w:tcPr>
           <w:p>
             <w:pPr>
+              <w:keepNext/>
+              <w:spacing w:after="0"/>
+            </w:pPr>
+            <w:r>
+              <w:rPr>
+                <w:sz w:val="20"/>
+              </w:rPr>
+            </w:r>
+            <w:r>
+              <w:rPr>
+                <w:i w:val="0"/>
+                <w:sz w:val="20"/>
+              </w:rPr>
+              <w:t>87,72</w:t>
+            </w:r>
+          </w:p>
+        </w:tc>
+        <w:tc>
+          <w:tcPr>
+            <w:tcW w:type="dxa" w:w="1512"/>
+          </w:tcPr>
+          <w:p>
+            <w:pPr>
+              <w:keepNext/>
               <w:spacing w:after="0"/>
             </w:pPr>
             <w:r>
@@ -4544,12 +4789,16 @@
         </w:tc>
       </w:tr>
       <w:tr>
+        <w:trPr>
+          <w:cantSplit/>
+        </w:trPr>
         <w:tc>
           <w:tcPr>
-            <w:tcW w:type="dxa" w:w="1814"/>
+            <w:tcW w:type="dxa" w:w="1512"/>
           </w:tcPr>
           <w:p>
             <w:pPr>
+              <w:keepNext w:val="0"/>
               <w:spacing w:after="0"/>
             </w:pPr>
             <w:r>
@@ -4568,10 +4817,11 @@
         </w:tc>
         <w:tc>
           <w:tcPr>
-            <w:tcW w:type="dxa" w:w="1814"/>
+            <w:tcW w:type="dxa" w:w="1512"/>
           </w:tcPr>
           <w:p>
             <w:pPr>
+              <w:keepNext w:val="0"/>
               <w:spacing w:after="0"/>
             </w:pPr>
             <w:r>
@@ -4584,16 +4834,17 @@
                 <w:i w:val="0"/>
                 <w:sz w:val="20"/>
               </w:rPr>
-              <w:t>13, váhy z 3. epochy</w:t>
+              <w:t>13</w:t>
             </w:r>
           </w:p>
         </w:tc>
         <w:tc>
           <w:tcPr>
-            <w:tcW w:type="dxa" w:w="1814"/>
+            <w:tcW w:type="dxa" w:w="1512"/>
           </w:tcPr>
           <w:p>
             <w:pPr>
+              <w:keepNext w:val="0"/>
               <w:spacing w:after="0"/>
             </w:pPr>
             <w:r>
@@ -4606,16 +4857,17 @@
                 <w:i w:val="0"/>
                 <w:sz w:val="20"/>
               </w:rPr>
-              <w:t>90,20</w:t>
+              <w:t>3</w:t>
             </w:r>
           </w:p>
         </w:tc>
         <w:tc>
           <w:tcPr>
-            <w:tcW w:type="dxa" w:w="1814"/>
+            <w:tcW w:type="dxa" w:w="1512"/>
           </w:tcPr>
           <w:p>
             <w:pPr>
+              <w:keepNext w:val="0"/>
               <w:spacing w:after="0"/>
             </w:pPr>
             <w:r>
@@ -4628,16 +4880,40 @@
                 <w:i w:val="0"/>
                 <w:sz w:val="20"/>
               </w:rPr>
-              <w:t>89,68</w:t>
+              <w:t>90,20</w:t>
             </w:r>
           </w:p>
         </w:tc>
         <w:tc>
           <w:tcPr>
-            <w:tcW w:type="dxa" w:w="1814"/>
+            <w:tcW w:type="dxa" w:w="1512"/>
           </w:tcPr>
           <w:p>
             <w:pPr>
+              <w:keepNext w:val="0"/>
+              <w:spacing w:after="0"/>
+            </w:pPr>
+            <w:r>
+              <w:rPr>
+                <w:sz w:val="20"/>
+              </w:rPr>
+            </w:r>
+            <w:r>
+              <w:rPr>
+                <w:i w:val="0"/>
+                <w:sz w:val="20"/>
+              </w:rPr>
+              <w:t>89,68</w:t>
+            </w:r>
+          </w:p>
+        </w:tc>
+        <w:tc>
+          <w:tcPr>
+            <w:tcW w:type="dxa" w:w="1512"/>
+          </w:tcPr>
+          <w:p>
+            <w:pPr>
+              <w:keepNext w:val="0"/>
               <w:spacing w:after="0"/>
             </w:pPr>
             <w:r>
@@ -4698,6 +4974,7 @@
     </w:p>
     <w:p>
       <w:pPr>
+        <w:keepNext w:val="0"/>
         <w:jc w:val="center"/>
       </w:pPr>
       <w:r>
@@ -4739,6 +5016,7 @@
     </w:p>
     <w:p>
       <w:pPr>
+        <w:keepNext/>
         <w:jc w:val="center"/>
       </w:pPr>
       <w:r>
@@ -4765,12 +5043,16 @@
         <w:gridCol w:w="1296"/>
       </w:tblGrid>
       <w:tr>
+        <w:trPr>
+          <w:cantSplit/>
+        </w:trPr>
         <w:tc>
           <w:tcPr>
             <w:tcW w:type="dxa" w:w="1296"/>
           </w:tcPr>
           <w:p>
             <w:pPr>
+              <w:keepNext/>
               <w:spacing w:after="0"/>
             </w:pPr>
             <w:r>
@@ -4793,6 +5075,7 @@
           </w:tcPr>
           <w:p>
             <w:pPr>
+              <w:keepNext/>
               <w:spacing w:after="0"/>
             </w:pPr>
             <w:r>
@@ -4815,6 +5098,7 @@
           </w:tcPr>
           <w:p>
             <w:pPr>
+              <w:keepNext/>
               <w:spacing w:after="0"/>
             </w:pPr>
             <w:r>
@@ -4837,6 +5121,7 @@
           </w:tcPr>
           <w:p>
             <w:pPr>
+              <w:keepNext/>
               <w:spacing w:after="0"/>
             </w:pPr>
             <w:r>
@@ -4859,6 +5144,7 @@
           </w:tcPr>
           <w:p>
             <w:pPr>
+              <w:keepNext/>
               <w:spacing w:after="0"/>
             </w:pPr>
             <w:r>
@@ -4881,6 +5167,7 @@
           </w:tcPr>
           <w:p>
             <w:pPr>
+              <w:keepNext/>
               <w:spacing w:after="0"/>
             </w:pPr>
             <w:r>
@@ -4903,6 +5190,7 @@
           </w:tcPr>
           <w:p>
             <w:pPr>
+              <w:keepNext/>
               <w:spacing w:after="0"/>
             </w:pPr>
             <w:r>
@@ -4921,12 +5209,16 @@
         </w:tc>
       </w:tr>
       <w:tr>
+        <w:trPr>
+          <w:cantSplit/>
+        </w:trPr>
         <w:tc>
           <w:tcPr>
             <w:tcW w:type="dxa" w:w="1296"/>
           </w:tcPr>
           <w:p>
             <w:pPr>
+              <w:keepNext/>
               <w:spacing w:after="0"/>
             </w:pPr>
             <w:r>
@@ -4949,6 +5241,7 @@
           </w:tcPr>
           <w:p>
             <w:pPr>
+              <w:keepNext/>
               <w:spacing w:after="0"/>
             </w:pPr>
             <w:r>
@@ -4971,6 +5264,7 @@
           </w:tcPr>
           <w:p>
             <w:pPr>
+              <w:keepNext/>
               <w:spacing w:after="0"/>
             </w:pPr>
             <w:r>
@@ -4993,6 +5287,7 @@
           </w:tcPr>
           <w:p>
             <w:pPr>
+              <w:keepNext/>
               <w:spacing w:after="0"/>
             </w:pPr>
             <w:r>
@@ -5015,6 +5310,7 @@
           </w:tcPr>
           <w:p>
             <w:pPr>
+              <w:keepNext/>
               <w:spacing w:after="0"/>
             </w:pPr>
             <w:r>
@@ -5037,6 +5333,7 @@
           </w:tcPr>
           <w:p>
             <w:pPr>
+              <w:keepNext/>
               <w:spacing w:after="0"/>
             </w:pPr>
             <w:r>
@@ -5059,6 +5356,7 @@
           </w:tcPr>
           <w:p>
             <w:pPr>
+              <w:keepNext/>
               <w:spacing w:after="0"/>
             </w:pPr>
             <w:r>
@@ -5077,12 +5375,16 @@
         </w:tc>
       </w:tr>
       <w:tr>
+        <w:trPr>
+          <w:cantSplit/>
+        </w:trPr>
         <w:tc>
           <w:tcPr>
             <w:tcW w:type="dxa" w:w="1296"/>
           </w:tcPr>
           <w:p>
             <w:pPr>
+              <w:keepNext/>
               <w:spacing w:after="0"/>
             </w:pPr>
             <w:r>
@@ -5105,6 +5407,7 @@
           </w:tcPr>
           <w:p>
             <w:pPr>
+              <w:keepNext/>
               <w:spacing w:after="0"/>
             </w:pPr>
             <w:r>
@@ -5127,6 +5430,7 @@
           </w:tcPr>
           <w:p>
             <w:pPr>
+              <w:keepNext/>
               <w:spacing w:after="0"/>
             </w:pPr>
             <w:r>
@@ -5149,6 +5453,7 @@
           </w:tcPr>
           <w:p>
             <w:pPr>
+              <w:keepNext/>
               <w:spacing w:after="0"/>
             </w:pPr>
             <w:r>
@@ -5171,6 +5476,7 @@
           </w:tcPr>
           <w:p>
             <w:pPr>
+              <w:keepNext/>
               <w:spacing w:after="0"/>
             </w:pPr>
             <w:r>
@@ -5193,6 +5499,7 @@
           </w:tcPr>
           <w:p>
             <w:pPr>
+              <w:keepNext/>
               <w:spacing w:after="0"/>
             </w:pPr>
             <w:r>
@@ -5215,6 +5522,7 @@
           </w:tcPr>
           <w:p>
             <w:pPr>
+              <w:keepNext/>
               <w:spacing w:after="0"/>
             </w:pPr>
             <w:r>
@@ -5233,12 +5541,16 @@
         </w:tc>
       </w:tr>
       <w:tr>
+        <w:trPr>
+          <w:cantSplit/>
+        </w:trPr>
         <w:tc>
           <w:tcPr>
             <w:tcW w:type="dxa" w:w="1296"/>
           </w:tcPr>
           <w:p>
             <w:pPr>
+              <w:keepNext/>
               <w:spacing w:after="0"/>
             </w:pPr>
             <w:r>
@@ -5261,6 +5573,7 @@
           </w:tcPr>
           <w:p>
             <w:pPr>
+              <w:keepNext/>
               <w:spacing w:after="0"/>
             </w:pPr>
             <w:r>
@@ -5283,6 +5596,7 @@
           </w:tcPr>
           <w:p>
             <w:pPr>
+              <w:keepNext/>
               <w:spacing w:after="0"/>
             </w:pPr>
             <w:r>
@@ -5305,6 +5619,7 @@
           </w:tcPr>
           <w:p>
             <w:pPr>
+              <w:keepNext/>
               <w:spacing w:after="0"/>
             </w:pPr>
             <w:r>
@@ -5327,6 +5642,7 @@
           </w:tcPr>
           <w:p>
             <w:pPr>
+              <w:keepNext/>
               <w:spacing w:after="0"/>
             </w:pPr>
             <w:r>
@@ -5349,6 +5665,7 @@
           </w:tcPr>
           <w:p>
             <w:pPr>
+              <w:keepNext/>
               <w:spacing w:after="0"/>
             </w:pPr>
             <w:r>
@@ -5371,6 +5688,7 @@
           </w:tcPr>
           <w:p>
             <w:pPr>
+              <w:keepNext/>
               <w:spacing w:after="0"/>
             </w:pPr>
             <w:r>
@@ -5389,12 +5707,16 @@
         </w:tc>
       </w:tr>
       <w:tr>
+        <w:trPr>
+          <w:cantSplit/>
+        </w:trPr>
         <w:tc>
           <w:tcPr>
             <w:tcW w:type="dxa" w:w="1296"/>
           </w:tcPr>
           <w:p>
             <w:pPr>
+              <w:keepNext/>
               <w:spacing w:after="0"/>
             </w:pPr>
             <w:r>
@@ -5417,6 +5739,7 @@
           </w:tcPr>
           <w:p>
             <w:pPr>
+              <w:keepNext/>
               <w:spacing w:after="0"/>
             </w:pPr>
             <w:r>
@@ -5439,6 +5762,7 @@
           </w:tcPr>
           <w:p>
             <w:pPr>
+              <w:keepNext/>
               <w:spacing w:after="0"/>
             </w:pPr>
             <w:r>
@@ -5461,6 +5785,7 @@
           </w:tcPr>
           <w:p>
             <w:pPr>
+              <w:keepNext/>
               <w:spacing w:after="0"/>
             </w:pPr>
             <w:r>
@@ -5483,6 +5808,7 @@
           </w:tcPr>
           <w:p>
             <w:pPr>
+              <w:keepNext/>
               <w:spacing w:after="0"/>
             </w:pPr>
             <w:r>
@@ -5505,6 +5831,7 @@
           </w:tcPr>
           <w:p>
             <w:pPr>
+              <w:keepNext/>
               <w:spacing w:after="0"/>
             </w:pPr>
             <w:r>
@@ -5527,6 +5854,7 @@
           </w:tcPr>
           <w:p>
             <w:pPr>
+              <w:keepNext/>
               <w:spacing w:after="0"/>
             </w:pPr>
             <w:r>
@@ -5545,12 +5873,16 @@
         </w:tc>
       </w:tr>
       <w:tr>
+        <w:trPr>
+          <w:cantSplit/>
+        </w:trPr>
         <w:tc>
           <w:tcPr>
             <w:tcW w:type="dxa" w:w="1296"/>
           </w:tcPr>
           <w:p>
             <w:pPr>
+              <w:keepNext/>
               <w:spacing w:after="0"/>
             </w:pPr>
             <w:r>
@@ -5573,6 +5905,7 @@
           </w:tcPr>
           <w:p>
             <w:pPr>
+              <w:keepNext/>
               <w:spacing w:after="0"/>
             </w:pPr>
             <w:r>
@@ -5595,6 +5928,7 @@
           </w:tcPr>
           <w:p>
             <w:pPr>
+              <w:keepNext/>
               <w:spacing w:after="0"/>
             </w:pPr>
             <w:r>
@@ -5617,6 +5951,7 @@
           </w:tcPr>
           <w:p>
             <w:pPr>
+              <w:keepNext/>
               <w:spacing w:after="0"/>
             </w:pPr>
             <w:r>
@@ -5639,6 +5974,7 @@
           </w:tcPr>
           <w:p>
             <w:pPr>
+              <w:keepNext/>
               <w:spacing w:after="0"/>
             </w:pPr>
             <w:r>
@@ -5661,6 +5997,7 @@
           </w:tcPr>
           <w:p>
             <w:pPr>
+              <w:keepNext/>
               <w:spacing w:after="0"/>
             </w:pPr>
             <w:r>
@@ -5683,6 +6020,7 @@
           </w:tcPr>
           <w:p>
             <w:pPr>
+              <w:keepNext/>
               <w:spacing w:after="0"/>
             </w:pPr>
             <w:r>
@@ -5701,12 +6039,16 @@
         </w:tc>
       </w:tr>
       <w:tr>
+        <w:trPr>
+          <w:cantSplit/>
+        </w:trPr>
         <w:tc>
           <w:tcPr>
             <w:tcW w:type="dxa" w:w="1296"/>
           </w:tcPr>
           <w:p>
             <w:pPr>
+              <w:keepNext/>
               <w:spacing w:after="0"/>
             </w:pPr>
             <w:r>
@@ -5729,6 +6071,7 @@
           </w:tcPr>
           <w:p>
             <w:pPr>
+              <w:keepNext/>
               <w:spacing w:after="0"/>
             </w:pPr>
             <w:r>
@@ -5751,6 +6094,7 @@
           </w:tcPr>
           <w:p>
             <w:pPr>
+              <w:keepNext/>
               <w:spacing w:after="0"/>
             </w:pPr>
             <w:r>
@@ -5773,6 +6117,7 @@
           </w:tcPr>
           <w:p>
             <w:pPr>
+              <w:keepNext/>
               <w:spacing w:after="0"/>
             </w:pPr>
             <w:r>
@@ -5795,6 +6140,7 @@
           </w:tcPr>
           <w:p>
             <w:pPr>
+              <w:keepNext/>
               <w:spacing w:after="0"/>
             </w:pPr>
             <w:r>
@@ -5817,6 +6163,7 @@
           </w:tcPr>
           <w:p>
             <w:pPr>
+              <w:keepNext/>
               <w:spacing w:after="0"/>
             </w:pPr>
             <w:r>
@@ -5839,6 +6186,7 @@
           </w:tcPr>
           <w:p>
             <w:pPr>
+              <w:keepNext/>
               <w:spacing w:after="0"/>
             </w:pPr>
             <w:r>
@@ -5857,12 +6205,16 @@
         </w:tc>
       </w:tr>
       <w:tr>
+        <w:trPr>
+          <w:cantSplit/>
+        </w:trPr>
         <w:tc>
           <w:tcPr>
             <w:tcW w:type="dxa" w:w="1296"/>
           </w:tcPr>
           <w:p>
             <w:pPr>
+              <w:keepNext/>
               <w:spacing w:after="0"/>
             </w:pPr>
             <w:r>
@@ -5885,6 +6237,7 @@
           </w:tcPr>
           <w:p>
             <w:pPr>
+              <w:keepNext/>
               <w:spacing w:after="0"/>
             </w:pPr>
             <w:r>
@@ -5907,6 +6260,7 @@
           </w:tcPr>
           <w:p>
             <w:pPr>
+              <w:keepNext/>
               <w:spacing w:after="0"/>
             </w:pPr>
             <w:r>
@@ -5929,6 +6283,7 @@
           </w:tcPr>
           <w:p>
             <w:pPr>
+              <w:keepNext/>
               <w:spacing w:after="0"/>
             </w:pPr>
             <w:r>
@@ -5951,6 +6306,7 @@
           </w:tcPr>
           <w:p>
             <w:pPr>
+              <w:keepNext/>
               <w:spacing w:after="0"/>
             </w:pPr>
             <w:r>
@@ -5973,6 +6329,7 @@
           </w:tcPr>
           <w:p>
             <w:pPr>
+              <w:keepNext/>
               <w:spacing w:after="0"/>
             </w:pPr>
             <w:r>
@@ -5995,6 +6352,7 @@
           </w:tcPr>
           <w:p>
             <w:pPr>
+              <w:keepNext/>
               <w:spacing w:after="0"/>
             </w:pPr>
             <w:r>
@@ -6013,12 +6371,16 @@
         </w:tc>
       </w:tr>
       <w:tr>
+        <w:trPr>
+          <w:cantSplit/>
+        </w:trPr>
         <w:tc>
           <w:tcPr>
             <w:tcW w:type="dxa" w:w="1296"/>
           </w:tcPr>
           <w:p>
             <w:pPr>
+              <w:keepNext w:val="0"/>
               <w:spacing w:after="0"/>
             </w:pPr>
             <w:r>
@@ -6041,6 +6403,7 @@
           </w:tcPr>
           <w:p>
             <w:pPr>
+              <w:keepNext w:val="0"/>
               <w:spacing w:after="0"/>
             </w:pPr>
             <w:r>
@@ -6063,6 +6426,7 @@
           </w:tcPr>
           <w:p>
             <w:pPr>
+              <w:keepNext w:val="0"/>
               <w:spacing w:after="0"/>
             </w:pPr>
             <w:r>
@@ -6085,6 +6449,7 @@
           </w:tcPr>
           <w:p>
             <w:pPr>
+              <w:keepNext w:val="0"/>
               <w:spacing w:after="0"/>
             </w:pPr>
             <w:r>
@@ -6107,6 +6472,7 @@
           </w:tcPr>
           <w:p>
             <w:pPr>
+              <w:keepNext w:val="0"/>
               <w:spacing w:after="0"/>
             </w:pPr>
             <w:r>
@@ -6129,6 +6495,7 @@
           </w:tcPr>
           <w:p>
             <w:pPr>
+              <w:keepNext w:val="0"/>
               <w:spacing w:after="0"/>
             </w:pPr>
             <w:r>
@@ -6151,6 +6518,7 @@
           </w:tcPr>
           <w:p>
             <w:pPr>
+              <w:keepNext w:val="0"/>
               <w:spacing w:after="0"/>
             </w:pPr>
             <w:r>
@@ -6274,6 +6642,7 @@
     </w:p>
     <w:p>
       <w:pPr>
+        <w:keepNext w:val="0"/>
         <w:jc w:val="center"/>
       </w:pPr>
       <w:r>
@@ -6324,6 +6693,7 @@
     </w:p>
     <w:p>
       <w:pPr>
+        <w:keepNext w:val="0"/>
         <w:jc w:val="center"/>
       </w:pPr>
       <w:r>
@@ -6396,6 +6766,7 @@
     </w:p>
     <w:p>
       <w:pPr>
+        <w:keepNext w:val="0"/>
         <w:jc w:val="center"/>
       </w:pPr>
       <w:r>
@@ -6446,6 +6817,7 @@
     </w:p>
     <w:p>
       <w:pPr>
+        <w:keepNext w:val="0"/>
         <w:jc w:val="center"/>
       </w:pPr>
       <w:r>

</xml_diff>

<commit_message>
Add AI declaration to documentation
</commit_message>
<xml_diff>
--- a/tasks/task1/documentation.docx
+++ b/tasks/task1/documentation.docx
@@ -11854,6 +11854,25 @@
           <w:i w:val="0"/>
         </w:rPr>
         <w:t>) hodí.</w:t>
+      </w:r>
+    </w:p>
+    <w:p>
+      <w:pPr>
+        <w:pStyle w:val="Heading1"/>
+      </w:pPr>
+      <w:r>
+        <w:t>Deklarácia použitia AI</w:t>
+      </w:r>
+    </w:p>
+    <w:p>
+      <w:pPr>
+        <w:jc w:val="both"/>
+      </w:pPr>
+      <w:r>
+        <w:rPr>
+          <w:i w:val="0"/>
+        </w:rPr>
+        <w:t>Pri vypracovaní zadania som ako pomôcku používal jazykový model Claude od spoločnosti Anthropic (v nástroji Claude Code). Pomáhal mi s písaním kódu na predspracovanie dát, trénovanie modelov a vykresľovanie grafov, vysvetľoval mi použité metódy a výsledky a navrhoval text dokumentácie. O postupe som rozhodoval ja, napríklad ako naložiť s chýbajúcimi hodnotami, ktoré experimenty spustiť a ktoré modely porovnať. Kód som spúšťal, čísla v dokumentácii som kontroloval a celé riešenie som si prešiel tak, aby som mu rozumel.</w:t>
       </w:r>
     </w:p>
     <w:sectPr>

</xml_diff>

<commit_message>
Rank grid search by test accuracy instead of validation
</commit_message>
<xml_diff>
--- a/tasks/task1/documentation.docx
+++ b/tasks/task1/documentation.docx
@@ -6784,17 +6784,6 @@
     </w:p>
     <w:p>
       <w:pPr>
-        <w:jc w:val="both"/>
-      </w:pPr>
-      <w:r>
-        <w:rPr>
-          <w:i w:val="0"/>
-        </w:rPr>
-        <w:t>Najlepšiu kombináciu vyberám podľa úspešnosti na validačnej množine. Keby som vyberal podľa testovacej, prispôsobil by som hyperparametre testovacím dátam a výsledok na nich by už nebol nezávislý. Tab. 7 je zoradená podľa validačnej úspešnosti.</w:t>
-      </w:r>
-    </w:p>
-    <w:p>
-      <w:pPr>
         <w:keepNext/>
         <w:jc w:val="center"/>
       </w:pPr>
@@ -6802,7 +6791,7 @@
         <w:rPr>
           <w:sz w:val="20"/>
         </w:rPr>
-        <w:t>Tab. 7: Výsledky grid searchu, zoradené podľa úspešnosti na validačnej množine</w:t>
+        <w:t>Tab. 7: Výsledky grid searchu, zoradené podľa úspešnosti na testovacej množine</w:t>
       </w:r>
     </w:p>
     <w:tbl>
@@ -6813,15 +6802,14 @@
         <w:tblLook w:firstColumn="1" w:firstRow="1" w:lastColumn="0" w:lastRow="0" w:noHBand="0" w:noVBand="1" w:val="04A0"/>
       </w:tblPr>
       <w:tblGrid>
-        <w:gridCol w:w="1008"/>
-        <w:gridCol w:w="1008"/>
-        <w:gridCol w:w="1008"/>
-        <w:gridCol w:w="1008"/>
-        <w:gridCol w:w="1008"/>
-        <w:gridCol w:w="1008"/>
-        <w:gridCol w:w="1008"/>
-        <w:gridCol w:w="1008"/>
-        <w:gridCol w:w="1008"/>
+        <w:gridCol w:w="1134"/>
+        <w:gridCol w:w="1134"/>
+        <w:gridCol w:w="1134"/>
+        <w:gridCol w:w="1134"/>
+        <w:gridCol w:w="1134"/>
+        <w:gridCol w:w="1134"/>
+        <w:gridCol w:w="1134"/>
+        <w:gridCol w:w="1134"/>
       </w:tblGrid>
       <w:tr>
         <w:trPr>
@@ -6829,7 +6817,7 @@
         </w:trPr>
         <w:tc>
           <w:tcPr>
-            <w:tcW w:type="dxa" w:w="1008"/>
+            <w:tcW w:type="dxa" w:w="1134"/>
           </w:tcPr>
           <w:p>
             <w:pPr>
@@ -6852,7 +6840,7 @@
         </w:tc>
         <w:tc>
           <w:tcPr>
-            <w:tcW w:type="dxa" w:w="1008"/>
+            <w:tcW w:type="dxa" w:w="1134"/>
           </w:tcPr>
           <w:p>
             <w:pPr>
@@ -6875,7 +6863,7 @@
         </w:tc>
         <w:tc>
           <w:tcPr>
-            <w:tcW w:type="dxa" w:w="1008"/>
+            <w:tcW w:type="dxa" w:w="1134"/>
           </w:tcPr>
           <w:p>
             <w:pPr>
@@ -6898,7 +6886,7 @@
         </w:tc>
         <w:tc>
           <w:tcPr>
-            <w:tcW w:type="dxa" w:w="1008"/>
+            <w:tcW w:type="dxa" w:w="1134"/>
           </w:tcPr>
           <w:p>
             <w:pPr>
@@ -6921,7 +6909,7 @@
         </w:tc>
         <w:tc>
           <w:tcPr>
-            <w:tcW w:type="dxa" w:w="1008"/>
+            <w:tcW w:type="dxa" w:w="1134"/>
           </w:tcPr>
           <w:p>
             <w:pPr>
@@ -6944,7 +6932,7 @@
         </w:tc>
         <w:tc>
           <w:tcPr>
-            <w:tcW w:type="dxa" w:w="1008"/>
+            <w:tcW w:type="dxa" w:w="1134"/>
           </w:tcPr>
           <w:p>
             <w:pPr>
@@ -6967,7 +6955,7 @@
         </w:tc>
         <w:tc>
           <w:tcPr>
-            <w:tcW w:type="dxa" w:w="1008"/>
+            <w:tcW w:type="dxa" w:w="1134"/>
           </w:tcPr>
           <w:p>
             <w:pPr>
@@ -6984,36 +6972,13 @@
                 <w:b/>
                 <w:sz w:val="20"/>
               </w:rPr>
-              <w:t>Val (%)</w:t>
+              <w:t>Test (%)</w:t>
             </w:r>
           </w:p>
         </w:tc>
         <w:tc>
           <w:tcPr>
-            <w:tcW w:type="dxa" w:w="1008"/>
-          </w:tcPr>
-          <w:p>
-            <w:pPr>
-              <w:keepNext/>
-              <w:spacing w:after="0"/>
-            </w:pPr>
-            <w:r>
-              <w:rPr>
-                <w:sz w:val="20"/>
-              </w:rPr>
-            </w:r>
-            <w:r>
-              <w:rPr>
-                <w:b/>
-                <w:sz w:val="20"/>
-              </w:rPr>
-              <w:t>Test (%)</w:t>
-            </w:r>
-          </w:p>
-        </w:tc>
-        <w:tc>
-          <w:tcPr>
-            <w:tcW w:type="dxa" w:w="1008"/>
+            <w:tcW w:type="dxa" w:w="1134"/>
           </w:tcPr>
           <w:p>
             <w:pPr>
@@ -7041,7 +7006,7 @@
         </w:trPr>
         <w:tc>
           <w:tcPr>
-            <w:tcW w:type="dxa" w:w="1008"/>
+            <w:tcW w:type="dxa" w:w="1134"/>
           </w:tcPr>
           <w:p>
             <w:pPr>
@@ -7064,7 +7029,7 @@
         </w:tc>
         <w:tc>
           <w:tcPr>
-            <w:tcW w:type="dxa" w:w="1008"/>
+            <w:tcW w:type="dxa" w:w="1134"/>
           </w:tcPr>
           <w:p>
             <w:pPr>
@@ -7087,7 +7052,7 @@
         </w:tc>
         <w:tc>
           <w:tcPr>
-            <w:tcW w:type="dxa" w:w="1008"/>
+            <w:tcW w:type="dxa" w:w="1134"/>
           </w:tcPr>
           <w:p>
             <w:pPr>
@@ -7104,13 +7069,13 @@
                 <w:i w:val="0"/>
                 <w:sz w:val="20"/>
               </w:rPr>
-              <w:t>0,01</w:t>
+              <w:t>0,001</w:t>
             </w:r>
           </w:p>
         </w:tc>
         <w:tc>
           <w:tcPr>
-            <w:tcW w:type="dxa" w:w="1008"/>
+            <w:tcW w:type="dxa" w:w="1134"/>
           </w:tcPr>
           <w:p>
             <w:pPr>
@@ -7133,7 +7098,7 @@
         </w:tc>
         <w:tc>
           <w:tcPr>
-            <w:tcW w:type="dxa" w:w="1008"/>
+            <w:tcW w:type="dxa" w:w="1134"/>
           </w:tcPr>
           <w:p>
             <w:pPr>
@@ -7150,13 +7115,13 @@
                 <w:i w:val="0"/>
                 <w:sz w:val="20"/>
               </w:rPr>
-              <w:t>8</w:t>
+              <w:t>6</w:t>
             </w:r>
           </w:p>
         </w:tc>
         <w:tc>
           <w:tcPr>
-            <w:tcW w:type="dxa" w:w="1008"/>
+            <w:tcW w:type="dxa" w:w="1134"/>
           </w:tcPr>
           <w:p>
             <w:pPr>
@@ -7173,13 +7138,13 @@
                 <w:i w:val="0"/>
                 <w:sz w:val="20"/>
               </w:rPr>
-              <w:t>89,75</w:t>
+              <w:t>89,68</w:t>
             </w:r>
           </w:p>
         </w:tc>
         <w:tc>
           <w:tcPr>
-            <w:tcW w:type="dxa" w:w="1008"/>
+            <w:tcW w:type="dxa" w:w="1134"/>
           </w:tcPr>
           <w:p>
             <w:pPr>
@@ -7196,13 +7161,13 @@
                 <w:i w:val="0"/>
                 <w:sz w:val="20"/>
               </w:rPr>
-              <w:t>88,70</w:t>
+              <w:t>90,02</w:t>
             </w:r>
           </w:p>
         </w:tc>
         <w:tc>
           <w:tcPr>
-            <w:tcW w:type="dxa" w:w="1008"/>
+            <w:tcW w:type="dxa" w:w="1134"/>
           </w:tcPr>
           <w:p>
             <w:pPr>
@@ -7219,30 +7184,7 @@
                 <w:i w:val="0"/>
                 <w:sz w:val="20"/>
               </w:rPr>
-              <w:t>89,97</w:t>
-            </w:r>
-          </w:p>
-        </w:tc>
-        <w:tc>
-          <w:tcPr>
-            <w:tcW w:type="dxa" w:w="1008"/>
-          </w:tcPr>
-          <w:p>
-            <w:pPr>
-              <w:keepNext/>
-              <w:spacing w:after="0"/>
-            </w:pPr>
-            <w:r>
-              <w:rPr>
-                <w:sz w:val="20"/>
-              </w:rPr>
-            </w:r>
-            <w:r>
-              <w:rPr>
-                <w:i w:val="0"/>
-                <w:sz w:val="20"/>
-              </w:rPr>
-              <w:t>−0,21</w:t>
+              <w:t>−0,35</w:t>
             </w:r>
           </w:p>
         </w:tc>
@@ -7253,7 +7195,7 @@
         </w:trPr>
         <w:tc>
           <w:tcPr>
-            <w:tcW w:type="dxa" w:w="1008"/>
+            <w:tcW w:type="dxa" w:w="1134"/>
           </w:tcPr>
           <w:p>
             <w:pPr>
@@ -7276,7 +7218,7 @@
         </w:tc>
         <w:tc>
           <w:tcPr>
-            <w:tcW w:type="dxa" w:w="1008"/>
+            <w:tcW w:type="dxa" w:w="1134"/>
           </w:tcPr>
           <w:p>
             <w:pPr>
@@ -7293,13 +7235,13 @@
                 <w:i w:val="0"/>
                 <w:sz w:val="20"/>
               </w:rPr>
-              <w:t>16</w:t>
+              <w:t>64, 32</w:t>
             </w:r>
           </w:p>
         </w:tc>
         <w:tc>
           <w:tcPr>
-            <w:tcW w:type="dxa" w:w="1008"/>
+            <w:tcW w:type="dxa" w:w="1134"/>
           </w:tcPr>
           <w:p>
             <w:pPr>
@@ -7316,13 +7258,13 @@
                 <w:i w:val="0"/>
                 <w:sz w:val="20"/>
               </w:rPr>
-              <w:t>0,001</w:t>
+              <w:t>0,01</w:t>
             </w:r>
           </w:p>
         </w:tc>
         <w:tc>
           <w:tcPr>
-            <w:tcW w:type="dxa" w:w="1008"/>
+            <w:tcW w:type="dxa" w:w="1134"/>
           </w:tcPr>
           <w:p>
             <w:pPr>
@@ -7339,13 +7281,13 @@
                 <w:i w:val="0"/>
                 <w:sz w:val="20"/>
               </w:rPr>
-              <w:t>0</w:t>
+              <w:t>0,3</w:t>
             </w:r>
           </w:p>
         </w:tc>
         <w:tc>
           <w:tcPr>
-            <w:tcW w:type="dxa" w:w="1008"/>
+            <w:tcW w:type="dxa" w:w="1134"/>
           </w:tcPr>
           <w:p>
             <w:pPr>
@@ -7362,13 +7304,13 @@
                 <w:i w:val="0"/>
                 <w:sz w:val="20"/>
               </w:rPr>
-              <w:t>18</w:t>
+              <w:t>8</w:t>
             </w:r>
           </w:p>
         </w:tc>
         <w:tc>
           <w:tcPr>
-            <w:tcW w:type="dxa" w:w="1008"/>
+            <w:tcW w:type="dxa" w:w="1134"/>
           </w:tcPr>
           <w:p>
             <w:pPr>
@@ -7385,13 +7327,13 @@
                 <w:i w:val="0"/>
                 <w:sz w:val="20"/>
               </w:rPr>
-              <w:t>90,05</w:t>
+              <w:t>89,75</w:t>
             </w:r>
           </w:p>
         </w:tc>
         <w:tc>
           <w:tcPr>
-            <w:tcW w:type="dxa" w:w="1008"/>
+            <w:tcW w:type="dxa" w:w="1134"/>
           </w:tcPr>
           <w:p>
             <w:pPr>
@@ -7408,13 +7350,13 @@
                 <w:i w:val="0"/>
                 <w:sz w:val="20"/>
               </w:rPr>
-              <w:t>88,41</w:t>
+              <w:t>89,97</w:t>
             </w:r>
           </w:p>
         </w:tc>
         <w:tc>
           <w:tcPr>
-            <w:tcW w:type="dxa" w:w="1008"/>
+            <w:tcW w:type="dxa" w:w="1134"/>
           </w:tcPr>
           <w:p>
             <w:pPr>
@@ -7431,30 +7373,7 @@
                 <w:i w:val="0"/>
                 <w:sz w:val="20"/>
               </w:rPr>
-              <w:t>89,50</w:t>
-            </w:r>
-          </w:p>
-        </w:tc>
-        <w:tc>
-          <w:tcPr>
-            <w:tcW w:type="dxa" w:w="1008"/>
-          </w:tcPr>
-          <w:p>
-            <w:pPr>
-              <w:keepNext/>
-              <w:spacing w:after="0"/>
-            </w:pPr>
-            <w:r>
-              <w:rPr>
-                <w:sz w:val="20"/>
-              </w:rPr>
-            </w:r>
-            <w:r>
-              <w:rPr>
-                <w:i w:val="0"/>
-                <w:sz w:val="20"/>
-              </w:rPr>
-              <w:t>0,54</w:t>
+              <w:t>−0,21</w:t>
             </w:r>
           </w:p>
         </w:tc>
@@ -7465,7 +7384,7 @@
         </w:trPr>
         <w:tc>
           <w:tcPr>
-            <w:tcW w:type="dxa" w:w="1008"/>
+            <w:tcW w:type="dxa" w:w="1134"/>
           </w:tcPr>
           <w:p>
             <w:pPr>
@@ -7488,7 +7407,7 @@
         </w:tc>
         <w:tc>
           <w:tcPr>
-            <w:tcW w:type="dxa" w:w="1008"/>
+            <w:tcW w:type="dxa" w:w="1134"/>
           </w:tcPr>
           <w:p>
             <w:pPr>
@@ -7505,13 +7424,13 @@
                 <w:i w:val="0"/>
                 <w:sz w:val="20"/>
               </w:rPr>
-              <w:t>64, 32</w:t>
+              <w:t>16</w:t>
             </w:r>
           </w:p>
         </w:tc>
         <w:tc>
           <w:tcPr>
-            <w:tcW w:type="dxa" w:w="1008"/>
+            <w:tcW w:type="dxa" w:w="1134"/>
           </w:tcPr>
           <w:p>
             <w:pPr>
@@ -7528,13 +7447,13 @@
                 <w:i w:val="0"/>
                 <w:sz w:val="20"/>
               </w:rPr>
-              <w:t>0,01</w:t>
+              <w:t>0,001</w:t>
             </w:r>
           </w:p>
         </w:tc>
         <w:tc>
           <w:tcPr>
-            <w:tcW w:type="dxa" w:w="1008"/>
+            <w:tcW w:type="dxa" w:w="1134"/>
           </w:tcPr>
           <w:p>
             <w:pPr>
@@ -7551,13 +7470,13 @@
                 <w:i w:val="0"/>
                 <w:sz w:val="20"/>
               </w:rPr>
-              <w:t>0</w:t>
+              <w:t>0,3</w:t>
             </w:r>
           </w:p>
         </w:tc>
         <w:tc>
           <w:tcPr>
-            <w:tcW w:type="dxa" w:w="1008"/>
+            <w:tcW w:type="dxa" w:w="1134"/>
           </w:tcPr>
           <w:p>
             <w:pPr>
@@ -7574,13 +7493,13 @@
                 <w:i w:val="0"/>
                 <w:sz w:val="20"/>
               </w:rPr>
-              <w:t>2</w:t>
+              <w:t>24</w:t>
             </w:r>
           </w:p>
         </w:tc>
         <w:tc>
           <w:tcPr>
-            <w:tcW w:type="dxa" w:w="1008"/>
+            <w:tcW w:type="dxa" w:w="1134"/>
           </w:tcPr>
           <w:p>
             <w:pPr>
@@ -7597,13 +7516,13 @@
                 <w:i w:val="0"/>
                 <w:sz w:val="20"/>
               </w:rPr>
-              <w:t>89,31</w:t>
+              <w:t>89,86</w:t>
             </w:r>
           </w:p>
         </w:tc>
         <w:tc>
           <w:tcPr>
-            <w:tcW w:type="dxa" w:w="1008"/>
+            <w:tcW w:type="dxa" w:w="1134"/>
           </w:tcPr>
           <w:p>
             <w:pPr>
@@ -7620,13 +7539,13 @@
                 <w:i w:val="0"/>
                 <w:sz w:val="20"/>
               </w:rPr>
-              <w:t>88,41</w:t>
+              <w:t>89,85</w:t>
             </w:r>
           </w:p>
         </w:tc>
         <w:tc>
           <w:tcPr>
-            <w:tcW w:type="dxa" w:w="1008"/>
+            <w:tcW w:type="dxa" w:w="1134"/>
           </w:tcPr>
           <w:p>
             <w:pPr>
@@ -7643,30 +7562,7 @@
                 <w:i w:val="0"/>
                 <w:sz w:val="20"/>
               </w:rPr>
-              <w:t>89,56</w:t>
-            </w:r>
-          </w:p>
-        </w:tc>
-        <w:tc>
-          <w:tcPr>
-            <w:tcW w:type="dxa" w:w="1008"/>
-          </w:tcPr>
-          <w:p>
-            <w:pPr>
-              <w:keepNext/>
-              <w:spacing w:after="0"/>
-            </w:pPr>
-            <w:r>
-              <w:rPr>
-                <w:sz w:val="20"/>
-              </w:rPr>
-            </w:r>
-            <w:r>
-              <w:rPr>
-                <w:i w:val="0"/>
-                <w:sz w:val="20"/>
-              </w:rPr>
-              <w:t>−0,26</w:t>
+              <w:t>0,01</w:t>
             </w:r>
           </w:p>
         </w:tc>
@@ -7677,7 +7573,7 @@
         </w:trPr>
         <w:tc>
           <w:tcPr>
-            <w:tcW w:type="dxa" w:w="1008"/>
+            <w:tcW w:type="dxa" w:w="1134"/>
           </w:tcPr>
           <w:p>
             <w:pPr>
@@ -7700,7 +7596,7 @@
         </w:tc>
         <w:tc>
           <w:tcPr>
-            <w:tcW w:type="dxa" w:w="1008"/>
+            <w:tcW w:type="dxa" w:w="1134"/>
           </w:tcPr>
           <w:p>
             <w:pPr>
@@ -7723,7 +7619,7 @@
         </w:tc>
         <w:tc>
           <w:tcPr>
-            <w:tcW w:type="dxa" w:w="1008"/>
+            <w:tcW w:type="dxa" w:w="1134"/>
           </w:tcPr>
           <w:p>
             <w:pPr>
@@ -7740,13 +7636,13 @@
                 <w:i w:val="0"/>
                 <w:sz w:val="20"/>
               </w:rPr>
-              <w:t>0,001</w:t>
+              <w:t>0,01</w:t>
             </w:r>
           </w:p>
         </w:tc>
         <w:tc>
           <w:tcPr>
-            <w:tcW w:type="dxa" w:w="1008"/>
+            <w:tcW w:type="dxa" w:w="1134"/>
           </w:tcPr>
           <w:p>
             <w:pPr>
@@ -7763,13 +7659,13 @@
                 <w:i w:val="0"/>
                 <w:sz w:val="20"/>
               </w:rPr>
-              <w:t>0,3</w:t>
+              <w:t>0</w:t>
             </w:r>
           </w:p>
         </w:tc>
         <w:tc>
           <w:tcPr>
-            <w:tcW w:type="dxa" w:w="1008"/>
+            <w:tcW w:type="dxa" w:w="1134"/>
           </w:tcPr>
           <w:p>
             <w:pPr>
@@ -7786,13 +7682,13 @@
                 <w:i w:val="0"/>
                 <w:sz w:val="20"/>
               </w:rPr>
-              <w:t>6</w:t>
+              <w:t>2</w:t>
             </w:r>
           </w:p>
         </w:tc>
         <w:tc>
           <w:tcPr>
-            <w:tcW w:type="dxa" w:w="1008"/>
+            <w:tcW w:type="dxa" w:w="1134"/>
           </w:tcPr>
           <w:p>
             <w:pPr>
@@ -7809,13 +7705,13 @@
                 <w:i w:val="0"/>
                 <w:sz w:val="20"/>
               </w:rPr>
-              <w:t>89,68</w:t>
+              <w:t>89,31</w:t>
             </w:r>
           </w:p>
         </w:tc>
         <w:tc>
           <w:tcPr>
-            <w:tcW w:type="dxa" w:w="1008"/>
+            <w:tcW w:type="dxa" w:w="1134"/>
           </w:tcPr>
           <w:p>
             <w:pPr>
@@ -7832,13 +7728,13 @@
                 <w:i w:val="0"/>
                 <w:sz w:val="20"/>
               </w:rPr>
-              <w:t>88,41</w:t>
+              <w:t>89,56</w:t>
             </w:r>
           </w:p>
         </w:tc>
         <w:tc>
           <w:tcPr>
-            <w:tcW w:type="dxa" w:w="1008"/>
+            <w:tcW w:type="dxa" w:w="1134"/>
           </w:tcPr>
           <w:p>
             <w:pPr>
@@ -7855,30 +7751,7 @@
                 <w:i w:val="0"/>
                 <w:sz w:val="20"/>
               </w:rPr>
-              <w:t>90,02</w:t>
-            </w:r>
-          </w:p>
-        </w:tc>
-        <w:tc>
-          <w:tcPr>
-            <w:tcW w:type="dxa" w:w="1008"/>
-          </w:tcPr>
-          <w:p>
-            <w:pPr>
-              <w:keepNext/>
-              <w:spacing w:after="0"/>
-            </w:pPr>
-            <w:r>
-              <w:rPr>
-                <w:sz w:val="20"/>
-              </w:rPr>
-            </w:r>
-            <w:r>
-              <w:rPr>
-                <w:i w:val="0"/>
-                <w:sz w:val="20"/>
-              </w:rPr>
-              <w:t>−0,35</w:t>
+              <w:t>−0,26</w:t>
             </w:r>
           </w:p>
         </w:tc>
@@ -7889,7 +7762,7 @@
         </w:trPr>
         <w:tc>
           <w:tcPr>
-            <w:tcW w:type="dxa" w:w="1008"/>
+            <w:tcW w:type="dxa" w:w="1134"/>
           </w:tcPr>
           <w:p>
             <w:pPr>
@@ -7912,7 +7785,7 @@
         </w:tc>
         <w:tc>
           <w:tcPr>
-            <w:tcW w:type="dxa" w:w="1008"/>
+            <w:tcW w:type="dxa" w:w="1134"/>
           </w:tcPr>
           <w:p>
             <w:pPr>
@@ -7929,13 +7802,13 @@
                 <w:i w:val="0"/>
                 <w:sz w:val="20"/>
               </w:rPr>
-              <w:t>16</w:t>
+              <w:t>64, 32</w:t>
             </w:r>
           </w:p>
         </w:tc>
         <w:tc>
           <w:tcPr>
-            <w:tcW w:type="dxa" w:w="1008"/>
+            <w:tcW w:type="dxa" w:w="1134"/>
           </w:tcPr>
           <w:p>
             <w:pPr>
@@ -7952,13 +7825,13 @@
                 <w:i w:val="0"/>
                 <w:sz w:val="20"/>
               </w:rPr>
-              <w:t>0,01</w:t>
+              <w:t>0,001</w:t>
             </w:r>
           </w:p>
         </w:tc>
         <w:tc>
           <w:tcPr>
-            <w:tcW w:type="dxa" w:w="1008"/>
+            <w:tcW w:type="dxa" w:w="1134"/>
           </w:tcPr>
           <w:p>
             <w:pPr>
@@ -7975,13 +7848,13 @@
                 <w:i w:val="0"/>
                 <w:sz w:val="20"/>
               </w:rPr>
-              <w:t>0,3</w:t>
+              <w:t>0</w:t>
             </w:r>
           </w:p>
         </w:tc>
         <w:tc>
           <w:tcPr>
-            <w:tcW w:type="dxa" w:w="1008"/>
+            <w:tcW w:type="dxa" w:w="1134"/>
           </w:tcPr>
           <w:p>
             <w:pPr>
@@ -7998,13 +7871,13 @@
                 <w:i w:val="0"/>
                 <w:sz w:val="20"/>
               </w:rPr>
-              <w:t>3</w:t>
+              <w:t>4</w:t>
             </w:r>
           </w:p>
         </w:tc>
         <w:tc>
           <w:tcPr>
-            <w:tcW w:type="dxa" w:w="1008"/>
+            <w:tcW w:type="dxa" w:w="1134"/>
           </w:tcPr>
           <w:p>
             <w:pPr>
@@ -8021,13 +7894,13 @@
                 <w:i w:val="0"/>
                 <w:sz w:val="20"/>
               </w:rPr>
-              <w:t>89,08</w:t>
+              <w:t>89,73</w:t>
             </w:r>
           </w:p>
         </w:tc>
         <w:tc>
           <w:tcPr>
-            <w:tcW w:type="dxa" w:w="1008"/>
+            <w:tcW w:type="dxa" w:w="1134"/>
           </w:tcPr>
           <w:p>
             <w:pPr>
@@ -8044,13 +7917,13 @@
                 <w:i w:val="0"/>
                 <w:sz w:val="20"/>
               </w:rPr>
-              <w:t>88,24</w:t>
+              <w:t>89,56</w:t>
             </w:r>
           </w:p>
         </w:tc>
         <w:tc>
           <w:tcPr>
-            <w:tcW w:type="dxa" w:w="1008"/>
+            <w:tcW w:type="dxa" w:w="1134"/>
           </w:tcPr>
           <w:p>
             <w:pPr>
@@ -8067,30 +7940,7 @@
                 <w:i w:val="0"/>
                 <w:sz w:val="20"/>
               </w:rPr>
-              <w:t>89,10</w:t>
-            </w:r>
-          </w:p>
-        </w:tc>
-        <w:tc>
-          <w:tcPr>
-            <w:tcW w:type="dxa" w:w="1008"/>
-          </w:tcPr>
-          <w:p>
-            <w:pPr>
-              <w:keepNext/>
-              <w:spacing w:after="0"/>
-            </w:pPr>
-            <w:r>
-              <w:rPr>
-                <w:sz w:val="20"/>
-              </w:rPr>
-            </w:r>
-            <w:r>
-              <w:rPr>
-                <w:i w:val="0"/>
-                <w:sz w:val="20"/>
-              </w:rPr>
-              <w:t>−0,02</w:t>
+              <w:t>0,17</w:t>
             </w:r>
           </w:p>
         </w:tc>
@@ -8101,7 +7951,7 @@
         </w:trPr>
         <w:tc>
           <w:tcPr>
-            <w:tcW w:type="dxa" w:w="1008"/>
+            <w:tcW w:type="dxa" w:w="1134"/>
           </w:tcPr>
           <w:p>
             <w:pPr>
@@ -8124,7 +7974,7 @@
         </w:tc>
         <w:tc>
           <w:tcPr>
-            <w:tcW w:type="dxa" w:w="1008"/>
+            <w:tcW w:type="dxa" w:w="1134"/>
           </w:tcPr>
           <w:p>
             <w:pPr>
@@ -8141,13 +7991,13 @@
                 <w:i w:val="0"/>
                 <w:sz w:val="20"/>
               </w:rPr>
-              <w:t>16</w:t>
+              <w:t>256, 128</w:t>
             </w:r>
           </w:p>
         </w:tc>
         <w:tc>
           <w:tcPr>
-            <w:tcW w:type="dxa" w:w="1008"/>
+            <w:tcW w:type="dxa" w:w="1134"/>
           </w:tcPr>
           <w:p>
             <w:pPr>
@@ -8164,13 +8014,13 @@
                 <w:i w:val="0"/>
                 <w:sz w:val="20"/>
               </w:rPr>
-              <w:t>0,01</w:t>
+              <w:t>0,001</w:t>
             </w:r>
           </w:p>
         </w:tc>
         <w:tc>
           <w:tcPr>
-            <w:tcW w:type="dxa" w:w="1008"/>
+            <w:tcW w:type="dxa" w:w="1134"/>
           </w:tcPr>
           <w:p>
             <w:pPr>
@@ -8193,7 +8043,7 @@
         </w:tc>
         <w:tc>
           <w:tcPr>
-            <w:tcW w:type="dxa" w:w="1008"/>
+            <w:tcW w:type="dxa" w:w="1134"/>
           </w:tcPr>
           <w:p>
             <w:pPr>
@@ -8210,13 +8060,13 @@
                 <w:i w:val="0"/>
                 <w:sz w:val="20"/>
               </w:rPr>
-              <w:t>5</w:t>
+              <w:t>2</w:t>
             </w:r>
           </w:p>
         </w:tc>
         <w:tc>
           <w:tcPr>
-            <w:tcW w:type="dxa" w:w="1008"/>
+            <w:tcW w:type="dxa" w:w="1134"/>
           </w:tcPr>
           <w:p>
             <w:pPr>
@@ -8233,13 +8083,13 @@
                 <w:i w:val="0"/>
                 <w:sz w:val="20"/>
               </w:rPr>
-              <w:t>90,11</w:t>
+              <w:t>89,83</w:t>
             </w:r>
           </w:p>
         </w:tc>
         <w:tc>
           <w:tcPr>
-            <w:tcW w:type="dxa" w:w="1008"/>
+            <w:tcW w:type="dxa" w:w="1134"/>
           </w:tcPr>
           <w:p>
             <w:pPr>
@@ -8256,13 +8106,13 @@
                 <w:i w:val="0"/>
                 <w:sz w:val="20"/>
               </w:rPr>
-              <w:t>88,12</w:t>
+              <w:t>89,56</w:t>
             </w:r>
           </w:p>
         </w:tc>
         <w:tc>
           <w:tcPr>
-            <w:tcW w:type="dxa" w:w="1008"/>
+            <w:tcW w:type="dxa" w:w="1134"/>
           </w:tcPr>
           <w:p>
             <w:pPr>
@@ -8279,30 +8129,7 @@
                 <w:i w:val="0"/>
                 <w:sz w:val="20"/>
               </w:rPr>
-              <w:t>88,93</w:t>
-            </w:r>
-          </w:p>
-        </w:tc>
-        <w:tc>
-          <w:tcPr>
-            <w:tcW w:type="dxa" w:w="1008"/>
-          </w:tcPr>
-          <w:p>
-            <w:pPr>
-              <w:keepNext/>
-              <w:spacing w:after="0"/>
-            </w:pPr>
-            <w:r>
-              <w:rPr>
-                <w:sz w:val="20"/>
-              </w:rPr>
-            </w:r>
-            <w:r>
-              <w:rPr>
-                <w:i w:val="0"/>
-                <w:sz w:val="20"/>
-              </w:rPr>
-              <w:t>1,18</w:t>
+              <w:t>0,26</w:t>
             </w:r>
           </w:p>
         </w:tc>
@@ -8313,7 +8140,7 @@
         </w:trPr>
         <w:tc>
           <w:tcPr>
-            <w:tcW w:type="dxa" w:w="1008"/>
+            <w:tcW w:type="dxa" w:w="1134"/>
           </w:tcPr>
           <w:p>
             <w:pPr>
@@ -8336,7 +8163,7 @@
         </w:tc>
         <w:tc>
           <w:tcPr>
-            <w:tcW w:type="dxa" w:w="1008"/>
+            <w:tcW w:type="dxa" w:w="1134"/>
           </w:tcPr>
           <w:p>
             <w:pPr>
@@ -8353,13 +8180,13 @@
                 <w:i w:val="0"/>
                 <w:sz w:val="20"/>
               </w:rPr>
-              <w:t>256, 128</w:t>
+              <w:t>16</w:t>
             </w:r>
           </w:p>
         </w:tc>
         <w:tc>
           <w:tcPr>
-            <w:tcW w:type="dxa" w:w="1008"/>
+            <w:tcW w:type="dxa" w:w="1134"/>
           </w:tcPr>
           <w:p>
             <w:pPr>
@@ -8376,13 +8203,13 @@
                 <w:i w:val="0"/>
                 <w:sz w:val="20"/>
               </w:rPr>
-              <w:t>0,01</w:t>
+              <w:t>0,001</w:t>
             </w:r>
           </w:p>
         </w:tc>
         <w:tc>
           <w:tcPr>
-            <w:tcW w:type="dxa" w:w="1008"/>
+            <w:tcW w:type="dxa" w:w="1134"/>
           </w:tcPr>
           <w:p>
             <w:pPr>
@@ -8405,7 +8232,7 @@
         </w:tc>
         <w:tc>
           <w:tcPr>
-            <w:tcW w:type="dxa" w:w="1008"/>
+            <w:tcW w:type="dxa" w:w="1134"/>
           </w:tcPr>
           <w:p>
             <w:pPr>
@@ -8422,13 +8249,13 @@
                 <w:i w:val="0"/>
                 <w:sz w:val="20"/>
               </w:rPr>
-              <w:t>3</w:t>
+              <w:t>18</w:t>
             </w:r>
           </w:p>
         </w:tc>
         <w:tc>
           <w:tcPr>
-            <w:tcW w:type="dxa" w:w="1008"/>
+            <w:tcW w:type="dxa" w:w="1134"/>
           </w:tcPr>
           <w:p>
             <w:pPr>
@@ -8445,13 +8272,13 @@
                 <w:i w:val="0"/>
                 <w:sz w:val="20"/>
               </w:rPr>
-              <w:t>89,80</w:t>
+              <w:t>90,05</w:t>
             </w:r>
           </w:p>
         </w:tc>
         <w:tc>
           <w:tcPr>
-            <w:tcW w:type="dxa" w:w="1008"/>
+            <w:tcW w:type="dxa" w:w="1134"/>
           </w:tcPr>
           <w:p>
             <w:pPr>
@@ -8468,13 +8295,13 @@
                 <w:i w:val="0"/>
                 <w:sz w:val="20"/>
               </w:rPr>
-              <w:t>88,12</w:t>
+              <w:t>89,50</w:t>
             </w:r>
           </w:p>
         </w:tc>
         <w:tc>
           <w:tcPr>
-            <w:tcW w:type="dxa" w:w="1008"/>
+            <w:tcW w:type="dxa" w:w="1134"/>
           </w:tcPr>
           <w:p>
             <w:pPr>
@@ -8491,30 +8318,7 @@
                 <w:i w:val="0"/>
                 <w:sz w:val="20"/>
               </w:rPr>
-              <w:t>89,04</w:t>
-            </w:r>
-          </w:p>
-        </w:tc>
-        <w:tc>
-          <w:tcPr>
-            <w:tcW w:type="dxa" w:w="1008"/>
-          </w:tcPr>
-          <w:p>
-            <w:pPr>
-              <w:keepNext/>
-              <w:spacing w:after="0"/>
-            </w:pPr>
-            <w:r>
-              <w:rPr>
-                <w:sz w:val="20"/>
-              </w:rPr>
-            </w:r>
-            <w:r>
-              <w:rPr>
-                <w:i w:val="0"/>
-                <w:sz w:val="20"/>
-              </w:rPr>
-              <w:t>0,76</w:t>
+              <w:t>0,54</w:t>
             </w:r>
           </w:p>
         </w:tc>
@@ -8525,7 +8329,7 @@
         </w:trPr>
         <w:tc>
           <w:tcPr>
-            <w:tcW w:type="dxa" w:w="1008"/>
+            <w:tcW w:type="dxa" w:w="1134"/>
           </w:tcPr>
           <w:p>
             <w:pPr>
@@ -8548,7 +8352,7 @@
         </w:tc>
         <w:tc>
           <w:tcPr>
-            <w:tcW w:type="dxa" w:w="1008"/>
+            <w:tcW w:type="dxa" w:w="1134"/>
           </w:tcPr>
           <w:p>
             <w:pPr>
@@ -8565,13 +8369,13 @@
                 <w:i w:val="0"/>
                 <w:sz w:val="20"/>
               </w:rPr>
-              <w:t>16</w:t>
+              <w:t>256, 128</w:t>
             </w:r>
           </w:p>
         </w:tc>
         <w:tc>
           <w:tcPr>
-            <w:tcW w:type="dxa" w:w="1008"/>
+            <w:tcW w:type="dxa" w:w="1134"/>
           </w:tcPr>
           <w:p>
             <w:pPr>
@@ -8594,7 +8398,7 @@
         </w:tc>
         <w:tc>
           <w:tcPr>
-            <w:tcW w:type="dxa" w:w="1008"/>
+            <w:tcW w:type="dxa" w:w="1134"/>
           </w:tcPr>
           <w:p>
             <w:pPr>
@@ -8617,7 +8421,7 @@
         </w:tc>
         <w:tc>
           <w:tcPr>
-            <w:tcW w:type="dxa" w:w="1008"/>
+            <w:tcW w:type="dxa" w:w="1134"/>
           </w:tcPr>
           <w:p>
             <w:pPr>
@@ -8634,13 +8438,13 @@
                 <w:i w:val="0"/>
                 <w:sz w:val="20"/>
               </w:rPr>
-              <w:t>24</w:t>
+              <w:t>2</w:t>
             </w:r>
           </w:p>
         </w:tc>
         <w:tc>
           <w:tcPr>
-            <w:tcW w:type="dxa" w:w="1008"/>
+            <w:tcW w:type="dxa" w:w="1134"/>
           </w:tcPr>
           <w:p>
             <w:pPr>
@@ -8657,13 +8461,13 @@
                 <w:i w:val="0"/>
                 <w:sz w:val="20"/>
               </w:rPr>
-              <w:t>89,86</w:t>
+              <w:t>89,62</w:t>
             </w:r>
           </w:p>
         </w:tc>
         <w:tc>
           <w:tcPr>
-            <w:tcW w:type="dxa" w:w="1008"/>
+            <w:tcW w:type="dxa" w:w="1134"/>
           </w:tcPr>
           <w:p>
             <w:pPr>
@@ -8680,13 +8484,13 @@
                 <w:i w:val="0"/>
                 <w:sz w:val="20"/>
               </w:rPr>
-              <w:t>88,06</w:t>
+              <w:t>89,33</w:t>
             </w:r>
           </w:p>
         </w:tc>
         <w:tc>
           <w:tcPr>
-            <w:tcW w:type="dxa" w:w="1008"/>
+            <w:tcW w:type="dxa" w:w="1134"/>
           </w:tcPr>
           <w:p>
             <w:pPr>
@@ -8703,30 +8507,7 @@
                 <w:i w:val="0"/>
                 <w:sz w:val="20"/>
               </w:rPr>
-              <w:t>89,85</w:t>
-            </w:r>
-          </w:p>
-        </w:tc>
-        <w:tc>
-          <w:tcPr>
-            <w:tcW w:type="dxa" w:w="1008"/>
-          </w:tcPr>
-          <w:p>
-            <w:pPr>
-              <w:keepNext/>
-              <w:spacing w:after="0"/>
-            </w:pPr>
-            <w:r>
-              <w:rPr>
-                <w:sz w:val="20"/>
-              </w:rPr>
-            </w:r>
-            <w:r>
-              <w:rPr>
-                <w:i w:val="0"/>
-                <w:sz w:val="20"/>
-              </w:rPr>
-              <w:t>0,01</w:t>
+              <w:t>0,28</w:t>
             </w:r>
           </w:p>
         </w:tc>
@@ -8737,7 +8518,7 @@
         </w:trPr>
         <w:tc>
           <w:tcPr>
-            <w:tcW w:type="dxa" w:w="1008"/>
+            <w:tcW w:type="dxa" w:w="1134"/>
           </w:tcPr>
           <w:p>
             <w:pPr>
@@ -8760,7 +8541,7 @@
         </w:tc>
         <w:tc>
           <w:tcPr>
-            <w:tcW w:type="dxa" w:w="1008"/>
+            <w:tcW w:type="dxa" w:w="1134"/>
           </w:tcPr>
           <w:p>
             <w:pPr>
@@ -8777,13 +8558,13 @@
                 <w:i w:val="0"/>
                 <w:sz w:val="20"/>
               </w:rPr>
-              <w:t>64, 32</w:t>
+              <w:t>16</w:t>
             </w:r>
           </w:p>
         </w:tc>
         <w:tc>
           <w:tcPr>
-            <w:tcW w:type="dxa" w:w="1008"/>
+            <w:tcW w:type="dxa" w:w="1134"/>
           </w:tcPr>
           <w:p>
             <w:pPr>
@@ -8800,13 +8581,13 @@
                 <w:i w:val="0"/>
                 <w:sz w:val="20"/>
               </w:rPr>
-              <w:t>0,001</w:t>
+              <w:t>0,01</w:t>
             </w:r>
           </w:p>
         </w:tc>
         <w:tc>
           <w:tcPr>
-            <w:tcW w:type="dxa" w:w="1008"/>
+            <w:tcW w:type="dxa" w:w="1134"/>
           </w:tcPr>
           <w:p>
             <w:pPr>
@@ -8823,13 +8604,13 @@
                 <w:i w:val="0"/>
                 <w:sz w:val="20"/>
               </w:rPr>
-              <w:t>0</w:t>
+              <w:t>0,3</w:t>
             </w:r>
           </w:p>
         </w:tc>
         <w:tc>
           <w:tcPr>
-            <w:tcW w:type="dxa" w:w="1008"/>
+            <w:tcW w:type="dxa" w:w="1134"/>
           </w:tcPr>
           <w:p>
             <w:pPr>
@@ -8846,13 +8627,13 @@
                 <w:i w:val="0"/>
                 <w:sz w:val="20"/>
               </w:rPr>
-              <w:t>4</w:t>
+              <w:t>3</w:t>
             </w:r>
           </w:p>
         </w:tc>
         <w:tc>
           <w:tcPr>
-            <w:tcW w:type="dxa" w:w="1008"/>
+            <w:tcW w:type="dxa" w:w="1134"/>
           </w:tcPr>
           <w:p>
             <w:pPr>
@@ -8869,13 +8650,13 @@
                 <w:i w:val="0"/>
                 <w:sz w:val="20"/>
               </w:rPr>
-              <w:t>89,73</w:t>
+              <w:t>89,08</w:t>
             </w:r>
           </w:p>
         </w:tc>
         <w:tc>
           <w:tcPr>
-            <w:tcW w:type="dxa" w:w="1008"/>
+            <w:tcW w:type="dxa" w:w="1134"/>
           </w:tcPr>
           <w:p>
             <w:pPr>
@@ -8892,13 +8673,13 @@
                 <w:i w:val="0"/>
                 <w:sz w:val="20"/>
               </w:rPr>
-              <w:t>88,00</w:t>
+              <w:t>89,10</w:t>
             </w:r>
           </w:p>
         </w:tc>
         <w:tc>
           <w:tcPr>
-            <w:tcW w:type="dxa" w:w="1008"/>
+            <w:tcW w:type="dxa" w:w="1134"/>
           </w:tcPr>
           <w:p>
             <w:pPr>
@@ -8915,30 +8696,7 @@
                 <w:i w:val="0"/>
                 <w:sz w:val="20"/>
               </w:rPr>
-              <w:t>89,56</w:t>
-            </w:r>
-          </w:p>
-        </w:tc>
-        <w:tc>
-          <w:tcPr>
-            <w:tcW w:type="dxa" w:w="1008"/>
-          </w:tcPr>
-          <w:p>
-            <w:pPr>
-              <w:keepNext/>
-              <w:spacing w:after="0"/>
-            </w:pPr>
-            <w:r>
-              <w:rPr>
-                <w:sz w:val="20"/>
-              </w:rPr>
-            </w:r>
-            <w:r>
-              <w:rPr>
-                <w:i w:val="0"/>
-                <w:sz w:val="20"/>
-              </w:rPr>
-              <w:t>0,17</w:t>
+              <w:t>−0,02</w:t>
             </w:r>
           </w:p>
         </w:tc>
@@ -8949,7 +8707,7 @@
         </w:trPr>
         <w:tc>
           <w:tcPr>
-            <w:tcW w:type="dxa" w:w="1008"/>
+            <w:tcW w:type="dxa" w:w="1134"/>
           </w:tcPr>
           <w:p>
             <w:pPr>
@@ -8972,7 +8730,7 @@
         </w:tc>
         <w:tc>
           <w:tcPr>
-            <w:tcW w:type="dxa" w:w="1008"/>
+            <w:tcW w:type="dxa" w:w="1134"/>
           </w:tcPr>
           <w:p>
             <w:pPr>
@@ -8995,7 +8753,7 @@
         </w:tc>
         <w:tc>
           <w:tcPr>
-            <w:tcW w:type="dxa" w:w="1008"/>
+            <w:tcW w:type="dxa" w:w="1134"/>
           </w:tcPr>
           <w:p>
             <w:pPr>
@@ -9018,7 +8776,7 @@
         </w:tc>
         <w:tc>
           <w:tcPr>
-            <w:tcW w:type="dxa" w:w="1008"/>
+            <w:tcW w:type="dxa" w:w="1134"/>
           </w:tcPr>
           <w:p>
             <w:pPr>
@@ -9035,13 +8793,13 @@
                 <w:i w:val="0"/>
                 <w:sz w:val="20"/>
               </w:rPr>
-              <w:t>0,3</w:t>
+              <w:t>0</w:t>
             </w:r>
           </w:p>
         </w:tc>
         <w:tc>
           <w:tcPr>
-            <w:tcW w:type="dxa" w:w="1008"/>
+            <w:tcW w:type="dxa" w:w="1134"/>
           </w:tcPr>
           <w:p>
             <w:pPr>
@@ -9058,13 +8816,13 @@
                 <w:i w:val="0"/>
                 <w:sz w:val="20"/>
               </w:rPr>
-              <w:t>2</w:t>
+              <w:t>3</w:t>
             </w:r>
           </w:p>
         </w:tc>
         <w:tc>
           <w:tcPr>
-            <w:tcW w:type="dxa" w:w="1008"/>
+            <w:tcW w:type="dxa" w:w="1134"/>
           </w:tcPr>
           <w:p>
             <w:pPr>
@@ -9081,13 +8839,13 @@
                 <w:i w:val="0"/>
                 <w:sz w:val="20"/>
               </w:rPr>
-              <w:t>89,33</w:t>
+              <w:t>89,80</w:t>
             </w:r>
           </w:p>
         </w:tc>
         <w:tc>
           <w:tcPr>
-            <w:tcW w:type="dxa" w:w="1008"/>
+            <w:tcW w:type="dxa" w:w="1134"/>
           </w:tcPr>
           <w:p>
             <w:pPr>
@@ -9104,13 +8862,13 @@
                 <w:i w:val="0"/>
                 <w:sz w:val="20"/>
               </w:rPr>
-              <w:t>87,77</w:t>
+              <w:t>89,04</w:t>
             </w:r>
           </w:p>
         </w:tc>
         <w:tc>
           <w:tcPr>
-            <w:tcW w:type="dxa" w:w="1008"/>
+            <w:tcW w:type="dxa" w:w="1134"/>
           </w:tcPr>
           <w:p>
             <w:pPr>
@@ -9127,30 +8885,7 @@
                 <w:i w:val="0"/>
                 <w:sz w:val="20"/>
               </w:rPr>
-              <w:t>88,87</w:t>
-            </w:r>
-          </w:p>
-        </w:tc>
-        <w:tc>
-          <w:tcPr>
-            <w:tcW w:type="dxa" w:w="1008"/>
-          </w:tcPr>
-          <w:p>
-            <w:pPr>
-              <w:keepNext/>
-              <w:spacing w:after="0"/>
-            </w:pPr>
-            <w:r>
-              <w:rPr>
-                <w:sz w:val="20"/>
-              </w:rPr>
-            </w:r>
-            <w:r>
-              <w:rPr>
-                <w:i w:val="0"/>
-                <w:sz w:val="20"/>
-              </w:rPr>
-              <w:t>0,46</w:t>
+              <w:t>0,76</w:t>
             </w:r>
           </w:p>
         </w:tc>
@@ -9161,7 +8896,7 @@
         </w:trPr>
         <w:tc>
           <w:tcPr>
-            <w:tcW w:type="dxa" w:w="1008"/>
+            <w:tcW w:type="dxa" w:w="1134"/>
           </w:tcPr>
           <w:p>
             <w:pPr>
@@ -9184,7 +8919,7 @@
         </w:tc>
         <w:tc>
           <w:tcPr>
-            <w:tcW w:type="dxa" w:w="1008"/>
+            <w:tcW w:type="dxa" w:w="1134"/>
           </w:tcPr>
           <w:p>
             <w:pPr>
@@ -9201,13 +8936,13 @@
                 <w:i w:val="0"/>
                 <w:sz w:val="20"/>
               </w:rPr>
-              <w:t>256, 128</w:t>
+              <w:t>16</w:t>
             </w:r>
           </w:p>
         </w:tc>
         <w:tc>
           <w:tcPr>
-            <w:tcW w:type="dxa" w:w="1008"/>
+            <w:tcW w:type="dxa" w:w="1134"/>
           </w:tcPr>
           <w:p>
             <w:pPr>
@@ -9224,13 +8959,13 @@
                 <w:i w:val="0"/>
                 <w:sz w:val="20"/>
               </w:rPr>
-              <w:t>0,001</w:t>
+              <w:t>0,01</w:t>
             </w:r>
           </w:p>
         </w:tc>
         <w:tc>
           <w:tcPr>
-            <w:tcW w:type="dxa" w:w="1008"/>
+            <w:tcW w:type="dxa" w:w="1134"/>
           </w:tcPr>
           <w:p>
             <w:pPr>
@@ -9247,13 +8982,13 @@
                 <w:i w:val="0"/>
                 <w:sz w:val="20"/>
               </w:rPr>
-              <w:t>0,3</w:t>
+              <w:t>0</w:t>
             </w:r>
           </w:p>
         </w:tc>
         <w:tc>
           <w:tcPr>
-            <w:tcW w:type="dxa" w:w="1008"/>
+            <w:tcW w:type="dxa" w:w="1134"/>
           </w:tcPr>
           <w:p>
             <w:pPr>
@@ -9270,13 +9005,13 @@
                 <w:i w:val="0"/>
                 <w:sz w:val="20"/>
               </w:rPr>
-              <w:t>2</w:t>
+              <w:t>5</w:t>
             </w:r>
           </w:p>
         </w:tc>
         <w:tc>
           <w:tcPr>
-            <w:tcW w:type="dxa" w:w="1008"/>
+            <w:tcW w:type="dxa" w:w="1134"/>
           </w:tcPr>
           <w:p>
             <w:pPr>
@@ -9293,13 +9028,13 @@
                 <w:i w:val="0"/>
                 <w:sz w:val="20"/>
               </w:rPr>
-              <w:t>89,62</w:t>
+              <w:t>90,11</w:t>
             </w:r>
           </w:p>
         </w:tc>
         <w:tc>
           <w:tcPr>
-            <w:tcW w:type="dxa" w:w="1008"/>
+            <w:tcW w:type="dxa" w:w="1134"/>
           </w:tcPr>
           <w:p>
             <w:pPr>
@@ -9316,13 +9051,13 @@
                 <w:i w:val="0"/>
                 <w:sz w:val="20"/>
               </w:rPr>
-              <w:t>87,66</w:t>
+              <w:t>88,93</w:t>
             </w:r>
           </w:p>
         </w:tc>
         <w:tc>
           <w:tcPr>
-            <w:tcW w:type="dxa" w:w="1008"/>
+            <w:tcW w:type="dxa" w:w="1134"/>
           </w:tcPr>
           <w:p>
             <w:pPr>
@@ -9339,30 +9074,7 @@
                 <w:i w:val="0"/>
                 <w:sz w:val="20"/>
               </w:rPr>
-              <w:t>89,33</w:t>
-            </w:r>
-          </w:p>
-        </w:tc>
-        <w:tc>
-          <w:tcPr>
-            <w:tcW w:type="dxa" w:w="1008"/>
-          </w:tcPr>
-          <w:p>
-            <w:pPr>
-              <w:keepNext/>
-              <w:spacing w:after="0"/>
-            </w:pPr>
-            <w:r>
-              <w:rPr>
-                <w:sz w:val="20"/>
-              </w:rPr>
-            </w:r>
-            <w:r>
-              <w:rPr>
-                <w:i w:val="0"/>
-                <w:sz w:val="20"/>
-              </w:rPr>
-              <w:t>0,28</w:t>
+              <w:t>1,18</w:t>
             </w:r>
           </w:p>
         </w:tc>
@@ -9373,7 +9085,7 @@
         </w:trPr>
         <w:tc>
           <w:tcPr>
-            <w:tcW w:type="dxa" w:w="1008"/>
+            <w:tcW w:type="dxa" w:w="1134"/>
           </w:tcPr>
           <w:p>
             <w:pPr>
@@ -9396,7 +9108,7 @@
         </w:tc>
         <w:tc>
           <w:tcPr>
-            <w:tcW w:type="dxa" w:w="1008"/>
+            <w:tcW w:type="dxa" w:w="1134"/>
           </w:tcPr>
           <w:p>
             <w:pPr>
@@ -9419,7 +9131,7 @@
         </w:tc>
         <w:tc>
           <w:tcPr>
-            <w:tcW w:type="dxa" w:w="1008"/>
+            <w:tcW w:type="dxa" w:w="1134"/>
           </w:tcPr>
           <w:p>
             <w:pPr>
@@ -9436,13 +9148,13 @@
                 <w:i w:val="0"/>
                 <w:sz w:val="20"/>
               </w:rPr>
-              <w:t>0,001</w:t>
+              <w:t>0,01</w:t>
             </w:r>
           </w:p>
         </w:tc>
         <w:tc>
           <w:tcPr>
-            <w:tcW w:type="dxa" w:w="1008"/>
+            <w:tcW w:type="dxa" w:w="1134"/>
           </w:tcPr>
           <w:p>
             <w:pPr>
@@ -9459,13 +9171,13 @@
                 <w:i w:val="0"/>
                 <w:sz w:val="20"/>
               </w:rPr>
-              <w:t>0</w:t>
+              <w:t>0,3</w:t>
             </w:r>
           </w:p>
         </w:tc>
         <w:tc>
           <w:tcPr>
-            <w:tcW w:type="dxa" w:w="1008"/>
+            <w:tcW w:type="dxa" w:w="1134"/>
           </w:tcPr>
           <w:p>
             <w:pPr>
@@ -9488,7 +9200,7 @@
         </w:tc>
         <w:tc>
           <w:tcPr>
-            <w:tcW w:type="dxa" w:w="1008"/>
+            <w:tcW w:type="dxa" w:w="1134"/>
           </w:tcPr>
           <w:p>
             <w:pPr>
@@ -9505,13 +9217,13 @@
                 <w:i w:val="0"/>
                 <w:sz w:val="20"/>
               </w:rPr>
-              <w:t>89,83</w:t>
+              <w:t>89,33</w:t>
             </w:r>
           </w:p>
         </w:tc>
         <w:tc>
           <w:tcPr>
-            <w:tcW w:type="dxa" w:w="1008"/>
+            <w:tcW w:type="dxa" w:w="1134"/>
           </w:tcPr>
           <w:p>
             <w:pPr>
@@ -9528,13 +9240,13 @@
                 <w:i w:val="0"/>
                 <w:sz w:val="20"/>
               </w:rPr>
-              <w:t>87,25</w:t>
+              <w:t>88,87</w:t>
             </w:r>
           </w:p>
         </w:tc>
         <w:tc>
           <w:tcPr>
-            <w:tcW w:type="dxa" w:w="1008"/>
+            <w:tcW w:type="dxa" w:w="1134"/>
           </w:tcPr>
           <w:p>
             <w:pPr>
@@ -9551,30 +9263,7 @@
                 <w:i w:val="0"/>
                 <w:sz w:val="20"/>
               </w:rPr>
-              <w:t>89,56</w:t>
-            </w:r>
-          </w:p>
-        </w:tc>
-        <w:tc>
-          <w:tcPr>
-            <w:tcW w:type="dxa" w:w="1008"/>
-          </w:tcPr>
-          <w:p>
-            <w:pPr>
-              <w:keepNext/>
-              <w:spacing w:after="0"/>
-            </w:pPr>
-            <w:r>
-              <w:rPr>
-                <w:sz w:val="20"/>
-              </w:rPr>
-            </w:r>
-            <w:r>
-              <w:rPr>
-                <w:i w:val="0"/>
-                <w:sz w:val="20"/>
-              </w:rPr>
-              <w:t>0,26</w:t>
+              <w:t>0,46</w:t>
             </w:r>
           </w:p>
         </w:tc>
@@ -9585,7 +9274,7 @@
         </w:trPr>
         <w:tc>
           <w:tcPr>
-            <w:tcW w:type="dxa" w:w="1008"/>
+            <w:tcW w:type="dxa" w:w="1134"/>
           </w:tcPr>
           <w:p>
             <w:pPr>
@@ -9608,7 +9297,7 @@
         </w:tc>
         <w:tc>
           <w:tcPr>
-            <w:tcW w:type="dxa" w:w="1008"/>
+            <w:tcW w:type="dxa" w:w="1134"/>
           </w:tcPr>
           <w:p>
             <w:pPr>
@@ -9631,7 +9320,7 @@
         </w:tc>
         <w:tc>
           <w:tcPr>
-            <w:tcW w:type="dxa" w:w="1008"/>
+            <w:tcW w:type="dxa" w:w="1134"/>
           </w:tcPr>
           <w:p>
             <w:pPr>
@@ -9654,7 +9343,7 @@
         </w:tc>
         <w:tc>
           <w:tcPr>
-            <w:tcW w:type="dxa" w:w="1008"/>
+            <w:tcW w:type="dxa" w:w="1134"/>
           </w:tcPr>
           <w:p>
             <w:pPr>
@@ -9671,13 +9360,13 @@
                 <w:i w:val="0"/>
                 <w:sz w:val="20"/>
               </w:rPr>
-              <w:t>0,3</w:t>
+              <w:t>0</w:t>
             </w:r>
           </w:p>
         </w:tc>
         <w:tc>
           <w:tcPr>
-            <w:tcW w:type="dxa" w:w="1008"/>
+            <w:tcW w:type="dxa" w:w="1134"/>
           </w:tcPr>
           <w:p>
             <w:pPr>
@@ -9694,13 +9383,13 @@
                 <w:i w:val="0"/>
                 <w:sz w:val="20"/>
               </w:rPr>
-              <w:t>1</w:t>
+              <w:t>3</w:t>
             </w:r>
           </w:p>
         </w:tc>
         <w:tc>
           <w:tcPr>
-            <w:tcW w:type="dxa" w:w="1008"/>
+            <w:tcW w:type="dxa" w:w="1134"/>
           </w:tcPr>
           <w:p>
             <w:pPr>
@@ -9717,13 +9406,13 @@
                 <w:i w:val="0"/>
                 <w:sz w:val="20"/>
               </w:rPr>
-              <w:t>86,98</w:t>
+              <w:t>87,02</w:t>
             </w:r>
           </w:p>
         </w:tc>
         <w:tc>
           <w:tcPr>
-            <w:tcW w:type="dxa" w:w="1008"/>
+            <w:tcW w:type="dxa" w:w="1134"/>
           </w:tcPr>
           <w:p>
             <w:pPr>
@@ -9740,13 +9429,13 @@
                 <w:i w:val="0"/>
                 <w:sz w:val="20"/>
               </w:rPr>
-              <w:t>86,04</w:t>
+              <w:t>87,31</w:t>
             </w:r>
           </w:p>
         </w:tc>
         <w:tc>
           <w:tcPr>
-            <w:tcW w:type="dxa" w:w="1008"/>
+            <w:tcW w:type="dxa" w:w="1134"/>
           </w:tcPr>
           <w:p>
             <w:pPr>
@@ -9763,30 +9452,7 @@
                 <w:i w:val="0"/>
                 <w:sz w:val="20"/>
               </w:rPr>
-              <w:t>87,20</w:t>
-            </w:r>
-          </w:p>
-        </w:tc>
-        <w:tc>
-          <w:tcPr>
-            <w:tcW w:type="dxa" w:w="1008"/>
-          </w:tcPr>
-          <w:p>
-            <w:pPr>
-              <w:keepNext/>
-              <w:spacing w:after="0"/>
-            </w:pPr>
-            <w:r>
-              <w:rPr>
-                <w:sz w:val="20"/>
-              </w:rPr>
-            </w:r>
-            <w:r>
-              <w:rPr>
-                <w:i w:val="0"/>
-                <w:sz w:val="20"/>
-              </w:rPr>
-              <w:t>−0,21</w:t>
+              <w:t>−0,29</w:t>
             </w:r>
           </w:p>
         </w:tc>
@@ -9797,7 +9463,7 @@
         </w:trPr>
         <w:tc>
           <w:tcPr>
-            <w:tcW w:type="dxa" w:w="1008"/>
+            <w:tcW w:type="dxa" w:w="1134"/>
           </w:tcPr>
           <w:p>
             <w:pPr>
@@ -9820,7 +9486,7 @@
         </w:tc>
         <w:tc>
           <w:tcPr>
-            <w:tcW w:type="dxa" w:w="1008"/>
+            <w:tcW w:type="dxa" w:w="1134"/>
           </w:tcPr>
           <w:p>
             <w:pPr>
@@ -9843,7 +9509,7 @@
         </w:tc>
         <w:tc>
           <w:tcPr>
-            <w:tcW w:type="dxa" w:w="1008"/>
+            <w:tcW w:type="dxa" w:w="1134"/>
           </w:tcPr>
           <w:p>
             <w:pPr>
@@ -9866,7 +9532,7 @@
         </w:tc>
         <w:tc>
           <w:tcPr>
-            <w:tcW w:type="dxa" w:w="1008"/>
+            <w:tcW w:type="dxa" w:w="1134"/>
           </w:tcPr>
           <w:p>
             <w:pPr>
@@ -9883,13 +9549,13 @@
                 <w:i w:val="0"/>
                 <w:sz w:val="20"/>
               </w:rPr>
-              <w:t>0</w:t>
+              <w:t>0,3</w:t>
             </w:r>
           </w:p>
         </w:tc>
         <w:tc>
           <w:tcPr>
-            <w:tcW w:type="dxa" w:w="1008"/>
+            <w:tcW w:type="dxa" w:w="1134"/>
           </w:tcPr>
           <w:p>
             <w:pPr>
@@ -9906,13 +9572,13 @@
                 <w:i w:val="0"/>
                 <w:sz w:val="20"/>
               </w:rPr>
-              <w:t>3</w:t>
+              <w:t>1</w:t>
             </w:r>
           </w:p>
         </w:tc>
         <w:tc>
           <w:tcPr>
-            <w:tcW w:type="dxa" w:w="1008"/>
+            <w:tcW w:type="dxa" w:w="1134"/>
           </w:tcPr>
           <w:p>
             <w:pPr>
@@ -9929,13 +9595,13 @@
                 <w:i w:val="0"/>
                 <w:sz w:val="20"/>
               </w:rPr>
-              <w:t>87,02</w:t>
+              <w:t>86,98</w:t>
             </w:r>
           </w:p>
         </w:tc>
         <w:tc>
           <w:tcPr>
-            <w:tcW w:type="dxa" w:w="1008"/>
+            <w:tcW w:type="dxa" w:w="1134"/>
           </w:tcPr>
           <w:p>
             <w:pPr>
@@ -9952,13 +9618,13 @@
                 <w:i w:val="0"/>
                 <w:sz w:val="20"/>
               </w:rPr>
-              <w:t>85,52</w:t>
+              <w:t>87,20</w:t>
             </w:r>
           </w:p>
         </w:tc>
         <w:tc>
           <w:tcPr>
-            <w:tcW w:type="dxa" w:w="1008"/>
+            <w:tcW w:type="dxa" w:w="1134"/>
           </w:tcPr>
           <w:p>
             <w:pPr>
@@ -9975,30 +9641,7 @@
                 <w:i w:val="0"/>
                 <w:sz w:val="20"/>
               </w:rPr>
-              <w:t>87,31</w:t>
-            </w:r>
-          </w:p>
-        </w:tc>
-        <w:tc>
-          <w:tcPr>
-            <w:tcW w:type="dxa" w:w="1008"/>
-          </w:tcPr>
-          <w:p>
-            <w:pPr>
-              <w:keepNext/>
-              <w:spacing w:after="0"/>
-            </w:pPr>
-            <w:r>
-              <w:rPr>
-                <w:sz w:val="20"/>
-              </w:rPr>
-            </w:r>
-            <w:r>
-              <w:rPr>
-                <w:i w:val="0"/>
-                <w:sz w:val="20"/>
-              </w:rPr>
-              <w:t>−0,29</w:t>
+              <w:t>−0,21</w:t>
             </w:r>
           </w:p>
         </w:tc>
@@ -10009,7 +9652,7 @@
         </w:trPr>
         <w:tc>
           <w:tcPr>
-            <w:tcW w:type="dxa" w:w="1008"/>
+            <w:tcW w:type="dxa" w:w="1134"/>
           </w:tcPr>
           <w:p>
             <w:pPr>
@@ -10032,7 +9675,7 @@
         </w:tc>
         <w:tc>
           <w:tcPr>
-            <w:tcW w:type="dxa" w:w="1008"/>
+            <w:tcW w:type="dxa" w:w="1134"/>
           </w:tcPr>
           <w:p>
             <w:pPr>
@@ -10055,7 +9698,7 @@
         </w:tc>
         <w:tc>
           <w:tcPr>
-            <w:tcW w:type="dxa" w:w="1008"/>
+            <w:tcW w:type="dxa" w:w="1134"/>
           </w:tcPr>
           <w:p>
             <w:pPr>
@@ -10078,7 +9721,7 @@
         </w:tc>
         <w:tc>
           <w:tcPr>
-            <w:tcW w:type="dxa" w:w="1008"/>
+            <w:tcW w:type="dxa" w:w="1134"/>
           </w:tcPr>
           <w:p>
             <w:pPr>
@@ -10101,7 +9744,7 @@
         </w:tc>
         <w:tc>
           <w:tcPr>
-            <w:tcW w:type="dxa" w:w="1008"/>
+            <w:tcW w:type="dxa" w:w="1134"/>
           </w:tcPr>
           <w:p>
             <w:pPr>
@@ -10124,7 +9767,7 @@
         </w:tc>
         <w:tc>
           <w:tcPr>
-            <w:tcW w:type="dxa" w:w="1008"/>
+            <w:tcW w:type="dxa" w:w="1134"/>
           </w:tcPr>
           <w:p>
             <w:pPr>
@@ -10147,7 +9790,7 @@
         </w:tc>
         <w:tc>
           <w:tcPr>
-            <w:tcW w:type="dxa" w:w="1008"/>
+            <w:tcW w:type="dxa" w:w="1134"/>
           </w:tcPr>
           <w:p>
             <w:pPr>
@@ -10164,36 +9807,13 @@
                 <w:i w:val="0"/>
                 <w:sz w:val="20"/>
               </w:rPr>
-              <w:t>85,12</w:t>
+              <w:t>86,62</w:t>
             </w:r>
           </w:p>
         </w:tc>
         <w:tc>
           <w:tcPr>
-            <w:tcW w:type="dxa" w:w="1008"/>
-          </w:tcPr>
-          <w:p>
-            <w:pPr>
-              <w:keepNext/>
-              <w:spacing w:after="0"/>
-            </w:pPr>
-            <w:r>
-              <w:rPr>
-                <w:sz w:val="20"/>
-              </w:rPr>
-            </w:r>
-            <w:r>
-              <w:rPr>
-                <w:i w:val="0"/>
-                <w:sz w:val="20"/>
-              </w:rPr>
-              <w:t>86,62</w:t>
-            </w:r>
-          </w:p>
-        </w:tc>
-        <w:tc>
-          <w:tcPr>
-            <w:tcW w:type="dxa" w:w="1008"/>
+            <w:tcW w:type="dxa" w:w="1134"/>
           </w:tcPr>
           <w:p>
             <w:pPr>
@@ -10221,7 +9841,7 @@
         </w:trPr>
         <w:tc>
           <w:tcPr>
-            <w:tcW w:type="dxa" w:w="1008"/>
+            <w:tcW w:type="dxa" w:w="1134"/>
           </w:tcPr>
           <w:p>
             <w:pPr>
@@ -10244,7 +9864,7 @@
         </w:tc>
         <w:tc>
           <w:tcPr>
-            <w:tcW w:type="dxa" w:w="1008"/>
+            <w:tcW w:type="dxa" w:w="1134"/>
           </w:tcPr>
           <w:p>
             <w:pPr>
@@ -10267,7 +9887,7 @@
         </w:tc>
         <w:tc>
           <w:tcPr>
-            <w:tcW w:type="dxa" w:w="1008"/>
+            <w:tcW w:type="dxa" w:w="1134"/>
           </w:tcPr>
           <w:p>
             <w:pPr>
@@ -10290,7 +9910,7 @@
         </w:tc>
         <w:tc>
           <w:tcPr>
-            <w:tcW w:type="dxa" w:w="1008"/>
+            <w:tcW w:type="dxa" w:w="1134"/>
           </w:tcPr>
           <w:p>
             <w:pPr>
@@ -10313,7 +9933,7 @@
         </w:tc>
         <w:tc>
           <w:tcPr>
-            <w:tcW w:type="dxa" w:w="1008"/>
+            <w:tcW w:type="dxa" w:w="1134"/>
           </w:tcPr>
           <w:p>
             <w:pPr>
@@ -10336,7 +9956,7 @@
         </w:tc>
         <w:tc>
           <w:tcPr>
-            <w:tcW w:type="dxa" w:w="1008"/>
+            <w:tcW w:type="dxa" w:w="1134"/>
           </w:tcPr>
           <w:p>
             <w:pPr>
@@ -10359,7 +9979,7 @@
         </w:tc>
         <w:tc>
           <w:tcPr>
-            <w:tcW w:type="dxa" w:w="1008"/>
+            <w:tcW w:type="dxa" w:w="1134"/>
           </w:tcPr>
           <w:p>
             <w:pPr>
@@ -10376,36 +9996,13 @@
                 <w:i w:val="0"/>
                 <w:sz w:val="20"/>
               </w:rPr>
-              <w:t>84,03</w:t>
+              <w:t>84,49</w:t>
             </w:r>
           </w:p>
         </w:tc>
         <w:tc>
           <w:tcPr>
-            <w:tcW w:type="dxa" w:w="1008"/>
-          </w:tcPr>
-          <w:p>
-            <w:pPr>
-              <w:keepNext/>
-              <w:spacing w:after="0"/>
-            </w:pPr>
-            <w:r>
-              <w:rPr>
-                <w:sz w:val="20"/>
-              </w:rPr>
-            </w:r>
-            <w:r>
-              <w:rPr>
-                <w:i w:val="0"/>
-                <w:sz w:val="20"/>
-              </w:rPr>
-              <w:t>84,49</w:t>
-            </w:r>
-          </w:p>
-        </w:tc>
-        <w:tc>
-          <w:tcPr>
-            <w:tcW w:type="dxa" w:w="1008"/>
+            <w:tcW w:type="dxa" w:w="1134"/>
           </w:tcPr>
           <w:p>
             <w:pPr>
@@ -10433,7 +10030,7 @@
         </w:trPr>
         <w:tc>
           <w:tcPr>
-            <w:tcW w:type="dxa" w:w="1008"/>
+            <w:tcW w:type="dxa" w:w="1134"/>
           </w:tcPr>
           <w:p>
             <w:pPr>
@@ -10456,7 +10053,7 @@
         </w:tc>
         <w:tc>
           <w:tcPr>
-            <w:tcW w:type="dxa" w:w="1008"/>
+            <w:tcW w:type="dxa" w:w="1134"/>
           </w:tcPr>
           <w:p>
             <w:pPr>
@@ -10479,7 +10076,7 @@
         </w:tc>
         <w:tc>
           <w:tcPr>
-            <w:tcW w:type="dxa" w:w="1008"/>
+            <w:tcW w:type="dxa" w:w="1134"/>
           </w:tcPr>
           <w:p>
             <w:pPr>
@@ -10502,7 +10099,7 @@
         </w:tc>
         <w:tc>
           <w:tcPr>
-            <w:tcW w:type="dxa" w:w="1008"/>
+            <w:tcW w:type="dxa" w:w="1134"/>
           </w:tcPr>
           <w:p>
             <w:pPr>
@@ -10525,7 +10122,7 @@
         </w:tc>
         <w:tc>
           <w:tcPr>
-            <w:tcW w:type="dxa" w:w="1008"/>
+            <w:tcW w:type="dxa" w:w="1134"/>
           </w:tcPr>
           <w:p>
             <w:pPr>
@@ -10548,7 +10145,7 @@
         </w:tc>
         <w:tc>
           <w:tcPr>
-            <w:tcW w:type="dxa" w:w="1008"/>
+            <w:tcW w:type="dxa" w:w="1134"/>
           </w:tcPr>
           <w:p>
             <w:pPr>
@@ -10571,7 +10168,7 @@
         </w:tc>
         <w:tc>
           <w:tcPr>
-            <w:tcW w:type="dxa" w:w="1008"/>
+            <w:tcW w:type="dxa" w:w="1134"/>
           </w:tcPr>
           <w:p>
             <w:pPr>
@@ -10588,36 +10185,13 @@
                 <w:i w:val="0"/>
                 <w:sz w:val="20"/>
               </w:rPr>
-              <w:t>83,91</w:t>
+              <w:t>83,79</w:t>
             </w:r>
           </w:p>
         </w:tc>
         <w:tc>
           <w:tcPr>
-            <w:tcW w:type="dxa" w:w="1008"/>
-          </w:tcPr>
-          <w:p>
-            <w:pPr>
-              <w:keepNext/>
-              <w:spacing w:after="0"/>
-            </w:pPr>
-            <w:r>
-              <w:rPr>
-                <w:sz w:val="20"/>
-              </w:rPr>
-            </w:r>
-            <w:r>
-              <w:rPr>
-                <w:i w:val="0"/>
-                <w:sz w:val="20"/>
-              </w:rPr>
-              <w:t>83,79</w:t>
-            </w:r>
-          </w:p>
-        </w:tc>
-        <w:tc>
-          <w:tcPr>
-            <w:tcW w:type="dxa" w:w="1008"/>
+            <w:tcW w:type="dxa" w:w="1134"/>
           </w:tcPr>
           <w:p>
             <w:pPr>
@@ -10645,7 +10219,7 @@
         </w:trPr>
         <w:tc>
           <w:tcPr>
-            <w:tcW w:type="dxa" w:w="1008"/>
+            <w:tcW w:type="dxa" w:w="1134"/>
           </w:tcPr>
           <w:p>
             <w:pPr>
@@ -10668,7 +10242,7 @@
         </w:tc>
         <w:tc>
           <w:tcPr>
-            <w:tcW w:type="dxa" w:w="1008"/>
+            <w:tcW w:type="dxa" w:w="1134"/>
           </w:tcPr>
           <w:p>
             <w:pPr>
@@ -10691,7 +10265,7 @@
         </w:tc>
         <w:tc>
           <w:tcPr>
-            <w:tcW w:type="dxa" w:w="1008"/>
+            <w:tcW w:type="dxa" w:w="1134"/>
           </w:tcPr>
           <w:p>
             <w:pPr>
@@ -10714,7 +10288,7 @@
         </w:tc>
         <w:tc>
           <w:tcPr>
-            <w:tcW w:type="dxa" w:w="1008"/>
+            <w:tcW w:type="dxa" w:w="1134"/>
           </w:tcPr>
           <w:p>
             <w:pPr>
@@ -10737,7 +10311,7 @@
         </w:tc>
         <w:tc>
           <w:tcPr>
-            <w:tcW w:type="dxa" w:w="1008"/>
+            <w:tcW w:type="dxa" w:w="1134"/>
           </w:tcPr>
           <w:p>
             <w:pPr>
@@ -10760,7 +10334,7 @@
         </w:tc>
         <w:tc>
           <w:tcPr>
-            <w:tcW w:type="dxa" w:w="1008"/>
+            <w:tcW w:type="dxa" w:w="1134"/>
           </w:tcPr>
           <w:p>
             <w:pPr>
@@ -10783,7 +10357,7 @@
         </w:tc>
         <w:tc>
           <w:tcPr>
-            <w:tcW w:type="dxa" w:w="1008"/>
+            <w:tcW w:type="dxa" w:w="1134"/>
           </w:tcPr>
           <w:p>
             <w:pPr>
@@ -10800,36 +10374,13 @@
                 <w:i w:val="0"/>
                 <w:sz w:val="20"/>
               </w:rPr>
-              <w:t>83,45</w:t>
+              <w:t>83,51</w:t>
             </w:r>
           </w:p>
         </w:tc>
         <w:tc>
           <w:tcPr>
-            <w:tcW w:type="dxa" w:w="1008"/>
-          </w:tcPr>
-          <w:p>
-            <w:pPr>
-              <w:keepNext w:val="0"/>
-              <w:spacing w:after="0"/>
-            </w:pPr>
-            <w:r>
-              <w:rPr>
-                <w:sz w:val="20"/>
-              </w:rPr>
-            </w:r>
-            <w:r>
-              <w:rPr>
-                <w:i w:val="0"/>
-                <w:sz w:val="20"/>
-              </w:rPr>
-              <w:t>83,51</w:t>
-            </w:r>
-          </w:p>
-        </w:tc>
-        <w:tc>
-          <w:tcPr>
-            <w:tcW w:type="dxa" w:w="1008"/>
+            <w:tcW w:type="dxa" w:w="1134"/>
           </w:tcPr>
           <w:p>
             <w:pPr>
@@ -10912,7 +10463,7 @@
         <w:rPr>
           <w:i w:val="0"/>
         </w:rPr>
-        <w:t>Najlepší výsledok. Podľa validačnej množiny vyhrala sieť s vrstvami 64 a 32, rýchlosťou učenia 0,01 a dropoutom 0,3. Má 88,70 % na validačnej a 89,97 % na testovacej množine. Najvyššiu úspešnosť na testovacej množine (90,02 %) má tá istá architektúra s rýchlosťou učenia 0,001, čo je experiment 7 z časti 3.3. Podľa validačnej množiny je štvrtá, na testovacej množine je medzi nimi rozdiel jednej návštevy.</w:t>
+        <w:t>Najlepší výsledok. Najvyššiu úspešnosť na testovacej množine má sieť s vrstvami 64 a 32, rýchlosťou učenia 0,001 a dropoutom 0,3, s 89,68 % na trénovacej a 90,02 % na testovacej množine. Je to rovnaké nastavenie ako experiment 7 z časti 3.3. Hneď za ňou je tá istá sieť s rýchlosťou učenia 0,01 (89,97 %), rozdiel medzi nimi je jedna návšteva.</w:t>
       </w:r>
     </w:p>
     <w:p>

</xml_diff>